<commit_message>
add generacion de contrato completo
</commit_message>
<xml_diff>
--- a/Features/CostsModule/Features/AdjudicacionesFeature/Templates/plantilla_pagare_con_placeholders.docx
+++ b/Features/CostsModule/Features/AdjudicacionesFeature/Templates/plantilla_pagare_con_placeholders.docx
@@ -5,7 +5,7 @@
     <w:p>
       <w:pPr>
         <w:pStyle w:val="Ttulo1"/>
-        <w:jc w:val="center"/>
+        <w:ind w:left="2832"/>
         <w:rPr>
           <w:sz w:val="28"/>
           <w:szCs w:val="28"/>
@@ -17,7 +17,14 @@
           <w:sz w:val="28"/>
           <w:szCs w:val="28"/>
         </w:rPr>
-        <w:t xml:space="preserve">PAGARÉ </w:t>
+        <w:t>PAGARÉ</w:t>
+      </w:r>
+      <w:r>
+        <w:rPr>
+          <w:sz w:val="28"/>
+          <w:szCs w:val="28"/>
+        </w:rPr>
+        <w:t xml:space="preserve"> </w:t>
       </w:r>
       <w:proofErr w:type="spellStart"/>
       <w:r>
@@ -74,25 +81,113 @@
         </w:rPr>
         <w:t>{PROYECTO_ABREVIATURA}}</w:t>
       </w:r>
+      <w:r>
+        <w:rPr>
+          <w:sz w:val="28"/>
+          <w:szCs w:val="28"/>
+        </w:rPr>
+        <w:t>-{{AÑO_ACTUAL}}</w:t>
+      </w:r>
     </w:p>
     <w:p>
       <w:pPr>
         <w:pStyle w:val="Ttulo1"/>
         <w:ind w:left="0" w:firstLine="0"/>
-        <w:jc w:val="center"/>
-        <w:rPr>
-          <w:sz w:val="28"/>
-          <w:szCs w:val="28"/>
-        </w:rPr>
-      </w:pPr>
-      <w:r>
-        <w:rPr>
-          <w:sz w:val="28"/>
-          <w:szCs w:val="28"/>
-        </w:rPr>
-        <w:t>-{{AÑO_ACTUAL}}</w:t>
-      </w:r>
-    </w:p>
+        <w:rPr>
+          <w:sz w:val="18"/>
+          <w:szCs w:val="18"/>
+        </w:rPr>
+      </w:pPr>
+      <w:r>
+        <w:rPr>
+          <w:sz w:val="18"/>
+          <w:szCs w:val="18"/>
+        </w:rPr>
+        <w:t xml:space="preserve">Contrato </w:t>
+      </w:r>
+      <w:proofErr w:type="spellStart"/>
+      <w:r>
+        <w:rPr>
+          <w:sz w:val="18"/>
+          <w:szCs w:val="18"/>
+        </w:rPr>
+        <w:t>Nº</w:t>
+      </w:r>
+      <w:proofErr w:type="spellEnd"/>
+      <w:r>
+        <w:rPr>
+          <w:sz w:val="18"/>
+          <w:szCs w:val="18"/>
+        </w:rPr>
+        <w:t xml:space="preserve"> </w:t>
+      </w:r>
+      <w:r>
+        <w:rPr>
+          <w:sz w:val="18"/>
+          <w:szCs w:val="18"/>
+        </w:rPr>
+        <w:t>{{NUM_CONTRATO</w:t>
+      </w:r>
+      <w:proofErr w:type="gramStart"/>
+      <w:r>
+        <w:rPr>
+          <w:sz w:val="18"/>
+          <w:szCs w:val="18"/>
+        </w:rPr>
+        <w:t>}}</w:t>
+      </w:r>
+      <w:r>
+        <w:rPr>
+          <w:sz w:val="18"/>
+          <w:szCs w:val="18"/>
+        </w:rPr>
+        <w:t>{</w:t>
+      </w:r>
+      <w:proofErr w:type="gramEnd"/>
+      <w:r>
+        <w:rPr>
+          <w:sz w:val="18"/>
+          <w:szCs w:val="18"/>
+        </w:rPr>
+        <w:t>{</w:t>
+      </w:r>
+      <w:r>
+        <w:rPr>
+          <w:sz w:val="18"/>
+          <w:szCs w:val="18"/>
+        </w:rPr>
+        <w:t>PROYECTO_</w:t>
+      </w:r>
+      <w:r>
+        <w:rPr>
+          <w:sz w:val="18"/>
+          <w:szCs w:val="18"/>
+        </w:rPr>
+        <w:t>ABREVIATURA}} – {{AÑO</w:t>
+      </w:r>
+      <w:r>
+        <w:rPr>
+          <w:sz w:val="18"/>
+          <w:szCs w:val="18"/>
+        </w:rPr>
+        <w:t>_ACTUAL</w:t>
+      </w:r>
+      <w:r>
+        <w:rPr>
+          <w:sz w:val="18"/>
+          <w:szCs w:val="18"/>
+        </w:rPr>
+        <w:t>}}</w:t>
+      </w:r>
+      <w:r>
+        <w:rPr>
+          <w:sz w:val="18"/>
+          <w:szCs w:val="18"/>
+        </w:rPr>
+        <w:t xml:space="preserve"> </w:t>
+      </w:r>
+    </w:p>
+    <w:p/>
     <w:p>
       <w:pPr>
         <w:pStyle w:val="Ttulo1"/>
@@ -107,22 +202,10 @@
           <w:sz w:val="18"/>
           <w:szCs w:val="18"/>
         </w:rPr>
-        <w:t xml:space="preserve">Contrato </w:t>
-      </w:r>
-      <w:proofErr w:type="spellStart"/>
-      <w:r>
-        <w:rPr>
-          <w:sz w:val="18"/>
-          <w:szCs w:val="18"/>
-        </w:rPr>
-        <w:t>Nº</w:t>
-      </w:r>
-      <w:proofErr w:type="spellEnd"/>
-      <w:r>
-        <w:rPr>
-          <w:sz w:val="18"/>
-          <w:szCs w:val="18"/>
-        </w:rPr>
+        <w:t>IMPORTE: …</w:t>
+      </w:r>
+      <w:bookmarkStart w:id="0" w:name="_Hlk46151480"/>
+      <w:r>
         <w:t xml:space="preserve"> </w:t>
       </w:r>
       <w:r>
@@ -130,65 +213,29 @@
           <w:sz w:val="18"/>
           <w:szCs w:val="18"/>
         </w:rPr>
-        <w:t>{{NUM_CONTRATO</w:t>
-      </w:r>
-      <w:proofErr w:type="gramStart"/>
-      <w:r>
-        <w:rPr>
-          <w:sz w:val="18"/>
-          <w:szCs w:val="18"/>
-        </w:rPr>
-        <w:t>}}</w:t>
-      </w:r>
-      <w:r>
-        <w:rPr>
-          <w:sz w:val="18"/>
-          <w:szCs w:val="18"/>
-        </w:rPr>
-        <w:t>{</w:t>
-      </w:r>
-      <w:proofErr w:type="gramEnd"/>
-      <w:r>
-        <w:rPr>
-          <w:sz w:val="18"/>
-          <w:szCs w:val="18"/>
-        </w:rPr>
-        <w:t>{</w:t>
-      </w:r>
-      <w:r>
-        <w:rPr>
-          <w:sz w:val="18"/>
-          <w:szCs w:val="18"/>
-        </w:rPr>
-        <w:t>PROYECTO_</w:t>
-      </w:r>
-      <w:r>
-        <w:rPr>
-          <w:sz w:val="18"/>
-          <w:szCs w:val="18"/>
-        </w:rPr>
-        <w:t>ABREVIATURA}} – {{AÑO</w:t>
-      </w:r>
-      <w:r>
-        <w:rPr>
-          <w:sz w:val="18"/>
-          <w:szCs w:val="18"/>
-        </w:rPr>
-        <w:t>_ACTUAL</w:t>
-      </w:r>
-      <w:r>
-        <w:rPr>
-          <w:sz w:val="18"/>
-          <w:szCs w:val="18"/>
-        </w:rPr>
-        <w:t>}}</w:t>
-      </w:r>
-      <w:r>
-        <w:rPr>
-          <w:sz w:val="18"/>
-          <w:szCs w:val="18"/>
-        </w:rPr>
-        <w:t xml:space="preserve"> </w:t>
+        <w:t>{{ADVANCE_AMOUNT}}</w:t>
+      </w:r>
+      <w:bookmarkEnd w:id="0"/>
+      <w:r>
+        <w:rPr>
+          <w:sz w:val="18"/>
+          <w:szCs w:val="18"/>
+        </w:rPr>
+        <w:t xml:space="preserve"> (</w:t>
+      </w:r>
+      <w:r>
+        <w:rPr>
+          <w:sz w:val="18"/>
+          <w:szCs w:val="18"/>
+        </w:rPr>
+        <w:t>{{ADVANCE_AMOUNT_EN_PALABRAS}}</w:t>
+      </w:r>
+      <w:r>
+        <w:rPr>
+          <w:sz w:val="18"/>
+          <w:szCs w:val="18"/>
+        </w:rPr>
+        <w:t>)</w:t>
       </w:r>
     </w:p>
     <w:p/>
@@ -206,71 +253,6 @@
           <w:sz w:val="18"/>
           <w:szCs w:val="18"/>
         </w:rPr>
-        <w:t>IMPORTE: …</w:t>
-      </w:r>
-      <w:bookmarkStart w:id="0" w:name="_Hlk46151480"/>
-      <w:r>
-        <w:t xml:space="preserve"> </w:t>
-      </w:r>
-      <w:r>
-        <w:rPr>
-          <w:sz w:val="18"/>
-          <w:szCs w:val="18"/>
-        </w:rPr>
-        <w:t>{{ADVANCE_AMOUNT}}</w:t>
-      </w:r>
-      <w:bookmarkEnd w:id="0"/>
-      <w:r>
-        <w:rPr>
-          <w:sz w:val="18"/>
-          <w:szCs w:val="18"/>
-        </w:rPr>
-        <w:t xml:space="preserve"> (</w:t>
-      </w:r>
-      <w:r>
-        <w:rPr>
-          <w:sz w:val="18"/>
-          <w:szCs w:val="18"/>
-        </w:rPr>
-        <w:t>{{</w:t>
-      </w:r>
-      <w:r>
-        <w:rPr>
-          <w:sz w:val="18"/>
-          <w:szCs w:val="18"/>
-        </w:rPr>
-        <w:t>ADVANCE_AMOUNT_EN_PALABRAS</w:t>
-      </w:r>
-      <w:r>
-        <w:rPr>
-          <w:sz w:val="18"/>
-          <w:szCs w:val="18"/>
-        </w:rPr>
-        <w:t>}}</w:t>
-      </w:r>
-      <w:r>
-        <w:rPr>
-          <w:sz w:val="18"/>
-          <w:szCs w:val="18"/>
-        </w:rPr>
-        <w:t>)</w:t>
-      </w:r>
-    </w:p>
-    <w:p/>
-    <w:p>
-      <w:pPr>
-        <w:pStyle w:val="Ttulo1"/>
-        <w:ind w:left="0" w:firstLine="0"/>
-        <w:rPr>
-          <w:sz w:val="18"/>
-          <w:szCs w:val="18"/>
-        </w:rPr>
-      </w:pPr>
-      <w:r>
-        <w:rPr>
-          <w:sz w:val="18"/>
-          <w:szCs w:val="18"/>
-        </w:rPr>
         <w:t xml:space="preserve">FECHA DE VENCIMIENTO: </w:t>
       </w:r>
       <w:r>
@@ -481,20 +463,288 @@
           <w:sz w:val="18"/>
           <w:szCs w:val="18"/>
         </w:rPr>
+        <w:t>{{PROYECTO_RUC</w:t>
+      </w:r>
+      <w:r>
+        <w:rPr>
+          <w:rFonts w:ascii="Arial" w:hAnsi="Arial" w:cs="Arial"/>
+          <w:bCs/>
+          <w:sz w:val="18"/>
+          <w:szCs w:val="18"/>
+        </w:rPr>
+        <w:t>}}</w:t>
+      </w:r>
+      <w:r>
+        <w:rPr>
+          <w:rFonts w:ascii="Arial" w:hAnsi="Arial" w:cs="Arial"/>
+          <w:sz w:val="18"/>
+          <w:szCs w:val="18"/>
+        </w:rPr>
+        <w:t>,</w:t>
+      </w:r>
+      <w:r>
+        <w:rPr>
+          <w:rFonts w:ascii="Arial" w:hAnsi="Arial" w:cs="Arial"/>
+          <w:sz w:val="18"/>
+          <w:szCs w:val="18"/>
+        </w:rPr>
+        <w:t xml:space="preserve"> </w:t>
+      </w:r>
+      <w:r>
+        <w:rPr>
+          <w:rFonts w:ascii="Arial" w:hAnsi="Arial" w:cs="Arial"/>
+          <w:sz w:val="18"/>
+          <w:szCs w:val="18"/>
+        </w:rPr>
+        <w:t>r</w:t>
+      </w:r>
+      <w:r>
+        <w:rPr>
+          <w:rFonts w:ascii="Arial" w:hAnsi="Arial" w:cs="Arial"/>
+          <w:sz w:val="18"/>
+          <w:szCs w:val="18"/>
+        </w:rPr>
+        <w:t>epresentada legalmente por el Sr.</w:t>
+      </w:r>
+      <w:r>
+        <w:rPr>
+          <w:rFonts w:ascii="Arial" w:hAnsi="Arial" w:cs="Arial"/>
+          <w:sz w:val="18"/>
+          <w:szCs w:val="18"/>
+        </w:rPr>
+        <w:t xml:space="preserve"> </w:t>
+      </w:r>
+      <w:r>
+        <w:rPr>
+          <w:rFonts w:ascii="Arial" w:hAnsi="Arial" w:cs="Arial"/>
+          <w:sz w:val="18"/>
+          <w:szCs w:val="18"/>
+        </w:rPr>
+        <w:t xml:space="preserve"> </w:t>
+      </w:r>
+      <w:r>
+        <w:rPr>
+          <w:rFonts w:ascii="Arial" w:hAnsi="Arial" w:cs="Arial"/>
+          <w:sz w:val="18"/>
+          <w:szCs w:val="18"/>
+          <w:shd w:val="clear" w:color="auto" w:fill="FFFFFF"/>
+        </w:rPr>
+        <w:t>Fernando Félix Toratto Fernández</w:t>
+      </w:r>
+      <w:r>
+        <w:rPr>
+          <w:rFonts w:ascii="Arial" w:hAnsi="Arial" w:cs="Arial"/>
+          <w:sz w:val="18"/>
+          <w:szCs w:val="18"/>
+        </w:rPr>
+        <w:t xml:space="preserve">, identificado con </w:t>
+      </w:r>
+      <w:r>
+        <w:rPr>
+          <w:rFonts w:ascii="Arial" w:hAnsi="Arial" w:cs="Arial"/>
+          <w:sz w:val="18"/>
+          <w:szCs w:val="18"/>
+        </w:rPr>
+        <w:t xml:space="preserve">DNI N.º </w:t>
+      </w:r>
+      <w:r>
+        <w:rPr>
+          <w:rFonts w:ascii="Arial" w:hAnsi="Arial" w:cs="Arial"/>
+          <w:b/>
+          <w:sz w:val="18"/>
+          <w:szCs w:val="18"/>
+        </w:rPr>
+        <w:t>07214887</w:t>
+      </w:r>
+      <w:r>
+        <w:rPr>
+          <w:rFonts w:ascii="Arial" w:hAnsi="Arial" w:cs="Arial"/>
+          <w:sz w:val="18"/>
+          <w:szCs w:val="18"/>
+        </w:rPr>
+        <w:t xml:space="preserve">, </w:t>
+      </w:r>
+      <w:r>
+        <w:rPr>
+          <w:rFonts w:ascii="Arial" w:hAnsi="Arial" w:cs="Arial"/>
+          <w:sz w:val="18"/>
+          <w:szCs w:val="18"/>
+        </w:rPr>
+        <w:t>en</w:t>
+      </w:r>
+      <w:r>
+        <w:rPr>
+          <w:rFonts w:ascii="Arial" w:hAnsi="Arial" w:cs="Arial"/>
+          <w:sz w:val="18"/>
+          <w:szCs w:val="18"/>
+        </w:rPr>
+        <w:t xml:space="preserve"> adelante “</w:t>
+      </w:r>
+      <w:r>
+        <w:rPr>
+          <w:rFonts w:ascii="Arial" w:hAnsi="Arial" w:cs="Arial"/>
+          <w:b/>
+          <w:sz w:val="18"/>
+          <w:szCs w:val="18"/>
+        </w:rPr>
+        <w:t>EL CONTRATANTE</w:t>
+      </w:r>
+      <w:r>
+        <w:rPr>
+          <w:rFonts w:ascii="Arial" w:hAnsi="Arial" w:cs="Arial"/>
+          <w:b/>
+          <w:sz w:val="18"/>
+          <w:szCs w:val="18"/>
+        </w:rPr>
+        <w:t>”</w:t>
+      </w:r>
+      <w:r>
+        <w:rPr>
+          <w:rFonts w:ascii="Arial" w:hAnsi="Arial" w:cs="Arial"/>
+          <w:b/>
+          <w:sz w:val="18"/>
+          <w:szCs w:val="18"/>
+        </w:rPr>
+        <w:t>,</w:t>
+      </w:r>
+      <w:r>
+        <w:rPr>
+          <w:rFonts w:ascii="Arial" w:hAnsi="Arial" w:cs="Arial"/>
+          <w:sz w:val="18"/>
+          <w:szCs w:val="18"/>
+        </w:rPr>
+        <w:t xml:space="preserve"> en la </w:t>
+      </w:r>
+      <w:r>
+        <w:rPr>
+          <w:rFonts w:ascii="Arial" w:hAnsi="Arial" w:cs="Arial"/>
+          <w:sz w:val="18"/>
+          <w:szCs w:val="18"/>
+        </w:rPr>
+        <w:t xml:space="preserve">fecha de vencimiento indicada, la suma </w:t>
+      </w:r>
+      <w:r>
+        <w:rPr>
+          <w:rFonts w:ascii="Arial" w:hAnsi="Arial" w:cs="Arial"/>
+          <w:sz w:val="18"/>
+          <w:szCs w:val="18"/>
+        </w:rPr>
+        <w:t>de</w:t>
+      </w:r>
+      <w:r>
+        <w:rPr>
+          <w:rFonts w:ascii="Arial" w:hAnsi="Arial" w:cs="Arial"/>
+          <w:sz w:val="18"/>
+          <w:szCs w:val="18"/>
+        </w:rPr>
+        <w:t xml:space="preserve"> </w:t>
+      </w:r>
+      <w:r>
+        <w:rPr>
+          <w:rFonts w:ascii="Arial" w:hAnsi="Arial" w:cs="Arial"/>
+          <w:b/>
+          <w:bCs/>
+          <w:sz w:val="18"/>
+          <w:szCs w:val="18"/>
+        </w:rPr>
+        <w:t>{{ADVANCE_AMOUNT}}</w:t>
+      </w:r>
+      <w:r>
+        <w:rPr>
+          <w:rFonts w:ascii="Arial" w:hAnsi="Arial" w:cs="Arial"/>
+          <w:b/>
+          <w:bCs/>
+          <w:sz w:val="18"/>
+          <w:szCs w:val="18"/>
+        </w:rPr>
+        <w:t xml:space="preserve"> (</w:t>
+      </w:r>
+      <w:r>
+        <w:rPr>
+          <w:rFonts w:ascii="Arial" w:hAnsi="Arial" w:cs="Arial"/>
+          <w:b/>
+          <w:bCs/>
+          <w:sz w:val="18"/>
+          <w:szCs w:val="18"/>
+        </w:rPr>
+        <w:t>{{ADVANCE_AMOUNT_EN_PALABRAS}}</w:t>
+      </w:r>
+      <w:r>
+        <w:rPr>
+          <w:rFonts w:ascii="Arial" w:hAnsi="Arial" w:cs="Arial"/>
+          <w:b/>
+          <w:bCs/>
+          <w:sz w:val="18"/>
+          <w:szCs w:val="18"/>
+        </w:rPr>
+        <w:t>)</w:t>
+      </w:r>
+      <w:r>
+        <w:rPr>
+          <w:rFonts w:ascii="Arial" w:hAnsi="Arial" w:cs="Arial"/>
+          <w:b/>
+          <w:bCs/>
+          <w:sz w:val="18"/>
+          <w:szCs w:val="18"/>
+        </w:rPr>
+        <w:t xml:space="preserve"> </w:t>
+      </w:r>
+      <w:r>
+        <w:rPr>
+          <w:rFonts w:ascii="Arial" w:hAnsi="Arial" w:cs="Arial"/>
+          <w:sz w:val="18"/>
+          <w:szCs w:val="18"/>
+        </w:rPr>
+        <w:t>importe</w:t>
+      </w:r>
+      <w:r>
+        <w:rPr>
+          <w:rFonts w:ascii="Arial" w:hAnsi="Arial" w:cs="Arial"/>
+          <w:sz w:val="18"/>
+          <w:szCs w:val="18"/>
+        </w:rPr>
+        <w:t xml:space="preserve"> que corresponde a la </w:t>
+      </w:r>
+      <w:r>
+        <w:rPr>
+          <w:rFonts w:ascii="Arial" w:hAnsi="Arial" w:cs="Arial"/>
+          <w:sz w:val="18"/>
+          <w:szCs w:val="18"/>
+        </w:rPr>
+        <w:t xml:space="preserve">línea de crédito </w:t>
+      </w:r>
+      <w:r>
+        <w:rPr>
+          <w:rFonts w:ascii="Arial" w:hAnsi="Arial" w:cs="Arial"/>
+          <w:sz w:val="18"/>
+          <w:szCs w:val="18"/>
+        </w:rPr>
+        <w:t>por operaciones comerciales otorgada por “</w:t>
+      </w:r>
+      <w:r>
+        <w:rPr>
+          <w:rFonts w:ascii="Arial" w:hAnsi="Arial" w:cs="Arial"/>
+          <w:b/>
+          <w:bCs/>
+          <w:sz w:val="18"/>
+          <w:szCs w:val="18"/>
+        </w:rPr>
         <w:t>{{</w:t>
       </w:r>
       <w:r>
         <w:rPr>
           <w:rFonts w:ascii="Arial" w:hAnsi="Arial" w:cs="Arial"/>
+          <w:b/>
           <w:bCs/>
           <w:sz w:val="18"/>
           <w:szCs w:val="18"/>
         </w:rPr>
-        <w:t>PROYECTO_RUC</w:t>
-      </w:r>
-      <w:r>
-        <w:rPr>
-          <w:rFonts w:ascii="Arial" w:hAnsi="Arial" w:cs="Arial"/>
+        <w:t>PROYECTO_RAZON_SOCIAL</w:t>
+      </w:r>
+      <w:r>
+        <w:rPr>
+          <w:rFonts w:ascii="Arial" w:hAnsi="Arial" w:cs="Arial"/>
+          <w:b/>
           <w:bCs/>
           <w:sz w:val="18"/>
           <w:szCs w:val="18"/>
@@ -504,16 +754,203 @@
       <w:r>
         <w:rPr>
           <w:rFonts w:ascii="Arial" w:hAnsi="Arial" w:cs="Arial"/>
-          <w:sz w:val="18"/>
-          <w:szCs w:val="18"/>
+          <w:b/>
+          <w:sz w:val="18"/>
+          <w:szCs w:val="18"/>
+        </w:rPr>
+        <w:t>”</w:t>
+      </w:r>
+      <w:r>
+        <w:rPr>
+          <w:rFonts w:ascii="Arial" w:hAnsi="Arial" w:cs="Arial"/>
+          <w:sz w:val="18"/>
+          <w:szCs w:val="18"/>
+        </w:rPr>
+        <w:t>, en virtud del Contrato</w:t>
+      </w:r>
+      <w:r>
+        <w:rPr>
+          <w:rFonts w:ascii="Arial" w:hAnsi="Arial" w:cs="Arial"/>
+          <w:sz w:val="18"/>
+          <w:szCs w:val="18"/>
+        </w:rPr>
+        <w:t xml:space="preserve"> N</w:t>
+      </w:r>
+      <w:r>
+        <w:rPr>
+          <w:rFonts w:ascii="Arial" w:hAnsi="Arial" w:cs="Arial"/>
+          <w:sz w:val="18"/>
+          <w:szCs w:val="18"/>
+        </w:rPr>
+        <w:t>ro.</w:t>
+      </w:r>
+      <w:r>
+        <w:rPr>
+          <w:rFonts w:ascii="Arial" w:hAnsi="Arial" w:cs="Arial"/>
+          <w:sz w:val="18"/>
+          <w:szCs w:val="18"/>
+        </w:rPr>
+        <w:t xml:space="preserve"> </w:t>
+      </w:r>
+      <w:r>
+        <w:rPr>
+          <w:rFonts w:ascii="Arial" w:hAnsi="Arial" w:cs="Arial"/>
+          <w:sz w:val="18"/>
+          <w:szCs w:val="18"/>
+        </w:rPr>
+        <w:t>{{</w:t>
+      </w:r>
+      <w:r>
+        <w:rPr>
+          <w:rFonts w:ascii="Arial" w:hAnsi="Arial" w:cs="Arial"/>
+          <w:sz w:val="18"/>
+          <w:szCs w:val="18"/>
+        </w:rPr>
+        <w:t>NUM_CONTRATO</w:t>
+      </w:r>
+      <w:proofErr w:type="gramStart"/>
+      <w:r>
+        <w:rPr>
+          <w:rFonts w:ascii="Arial" w:hAnsi="Arial" w:cs="Arial"/>
+          <w:sz w:val="18"/>
+          <w:szCs w:val="18"/>
+        </w:rPr>
+        <w:t>}}{</w:t>
+      </w:r>
+      <w:proofErr w:type="gramEnd"/>
+      <w:r>
+        <w:rPr>
+          <w:rFonts w:ascii="Arial" w:hAnsi="Arial" w:cs="Arial"/>
+          <w:sz w:val="18"/>
+          <w:szCs w:val="18"/>
+        </w:rPr>
+        <w:t>{</w:t>
+      </w:r>
+      <w:r>
+        <w:rPr>
+          <w:rFonts w:ascii="Arial" w:hAnsi="Arial" w:cs="Arial"/>
+          <w:sz w:val="18"/>
+          <w:szCs w:val="18"/>
+        </w:rPr>
+        <w:t>PROYECTO_ABREVIATURA</w:t>
+      </w:r>
+      <w:r>
+        <w:rPr>
+          <w:rFonts w:ascii="Arial" w:hAnsi="Arial" w:cs="Arial"/>
+          <w:sz w:val="18"/>
+          <w:szCs w:val="18"/>
+        </w:rPr>
+        <w:t>}</w:t>
+      </w:r>
+      <w:r>
+        <w:rPr>
+          <w:rFonts w:ascii="Arial" w:hAnsi="Arial" w:cs="Arial"/>
+          <w:sz w:val="18"/>
+          <w:szCs w:val="18"/>
+        </w:rPr>
+        <w:t>}</w:t>
+      </w:r>
+      <w:r>
+        <w:rPr>
+          <w:rFonts w:ascii="Arial" w:hAnsi="Arial" w:cs="Arial"/>
+          <w:sz w:val="18"/>
+          <w:szCs w:val="18"/>
+        </w:rPr>
+        <w:t xml:space="preserve"> </w:t>
+      </w:r>
+      <w:r>
+        <w:rPr>
+          <w:rFonts w:ascii="Arial" w:hAnsi="Arial" w:cs="Arial"/>
+          <w:sz w:val="18"/>
+          <w:szCs w:val="18"/>
+        </w:rPr>
+        <w:t>–</w:t>
+      </w:r>
+      <w:r>
+        <w:rPr>
+          <w:rFonts w:ascii="Arial" w:hAnsi="Arial" w:cs="Arial"/>
+          <w:sz w:val="18"/>
+          <w:szCs w:val="18"/>
+        </w:rPr>
+        <w:t xml:space="preserve"> </w:t>
+      </w:r>
+      <w:r>
+        <w:rPr>
+          <w:rFonts w:ascii="Arial" w:hAnsi="Arial" w:cs="Arial"/>
+          <w:sz w:val="18"/>
+          <w:szCs w:val="18"/>
+        </w:rPr>
+        <w:t>{{AÑO_ACTUAL</w:t>
+      </w:r>
+      <w:r>
+        <w:rPr>
+          <w:rFonts w:ascii="Arial" w:hAnsi="Arial" w:cs="Arial"/>
+          <w:sz w:val="18"/>
+          <w:szCs w:val="18"/>
+        </w:rPr>
+        <w:t>}}</w:t>
+      </w:r>
+      <w:r>
+        <w:rPr>
+          <w:rFonts w:ascii="Arial" w:hAnsi="Arial" w:cs="Arial"/>
+          <w:sz w:val="18"/>
+          <w:szCs w:val="18"/>
+        </w:rPr>
+        <w:t xml:space="preserve"> </w:t>
+      </w:r>
+      <w:r>
+        <w:rPr>
+          <w:rFonts w:ascii="Arial" w:hAnsi="Arial" w:cs="Arial"/>
+          <w:sz w:val="18"/>
+          <w:szCs w:val="18"/>
+        </w:rPr>
+        <w:t>por</w:t>
+      </w:r>
+      <w:r>
+        <w:rPr>
+          <w:rFonts w:ascii="Arial" w:hAnsi="Arial" w:cs="Arial"/>
+          <w:sz w:val="18"/>
+          <w:szCs w:val="18"/>
+        </w:rPr>
+        <w:t xml:space="preserve"> el</w:t>
+      </w:r>
+      <w:r>
+        <w:rPr>
+          <w:rFonts w:ascii="Arial" w:hAnsi="Arial" w:cs="Arial"/>
+          <w:sz w:val="18"/>
+          <w:szCs w:val="18"/>
+        </w:rPr>
+        <w:t xml:space="preserve"> </w:t>
+      </w:r>
+      <w:r>
+        <w:rPr>
+          <w:rFonts w:ascii="Arial" w:hAnsi="Arial" w:cs="Arial"/>
+          <w:b/>
+          <w:bCs/>
+          <w:sz w:val="18"/>
+          <w:szCs w:val="18"/>
+        </w:rPr>
+        <w:t>{{PARTIDA}}</w:t>
+      </w:r>
+      <w:r>
+        <w:rPr>
+          <w:rFonts w:ascii="Arial" w:hAnsi="Arial" w:cs="Arial"/>
+          <w:b/>
+          <w:bCs/>
+          <w:sz w:val="18"/>
+          <w:szCs w:val="18"/>
+          <w:lang w:val="es-ES_tradnl"/>
         </w:rPr>
         <w:t>,</w:t>
       </w:r>
       <w:r>
         <w:rPr>
           <w:rFonts w:ascii="Arial" w:hAnsi="Arial" w:cs="Arial"/>
-          <w:sz w:val="18"/>
-          <w:szCs w:val="18"/>
+          <w:b/>
+          <w:bCs/>
+          <w:sz w:val="18"/>
+          <w:szCs w:val="18"/>
+          <w:lang w:val="es-ES_tradnl"/>
         </w:rPr>
         <w:t xml:space="preserve"> </w:t>
       </w:r>
@@ -523,15 +960,47 @@
           <w:sz w:val="18"/>
           <w:szCs w:val="18"/>
         </w:rPr>
-        <w:t>r</w:t>
-      </w:r>
-      <w:r>
-        <w:rPr>
-          <w:rFonts w:ascii="Arial" w:hAnsi="Arial" w:cs="Arial"/>
-          <w:sz w:val="18"/>
-          <w:szCs w:val="18"/>
-        </w:rPr>
-        <w:t>epresentada legalmente por el Sr.</w:t>
+        <w:t xml:space="preserve">de la obra “Edificio Multifamiliar </w:t>
+      </w:r>
+      <w:r>
+        <w:rPr>
+          <w:rFonts w:ascii="Arial" w:hAnsi="Arial" w:cs="Arial"/>
+          <w:sz w:val="18"/>
+          <w:szCs w:val="18"/>
+        </w:rPr>
+        <w:t>{{</w:t>
+      </w:r>
+      <w:r>
+        <w:rPr>
+          <w:rFonts w:ascii="Arial" w:hAnsi="Arial" w:cs="Arial"/>
+          <w:sz w:val="18"/>
+          <w:szCs w:val="18"/>
+        </w:rPr>
+        <w:t>PROYECTO_NOMBRE</w:t>
+      </w:r>
+      <w:r>
+        <w:rPr>
+          <w:rFonts w:ascii="Arial" w:hAnsi="Arial" w:cs="Arial"/>
+          <w:sz w:val="18"/>
+          <w:szCs w:val="18"/>
+        </w:rPr>
+        <w:t>}}</w:t>
+      </w:r>
+      <w:r>
+        <w:rPr>
+          <w:rFonts w:ascii="Arial" w:hAnsi="Arial" w:cs="Arial"/>
+          <w:sz w:val="18"/>
+          <w:szCs w:val="18"/>
+        </w:rPr>
+        <w:t>”</w:t>
+      </w:r>
+      <w:r>
+        <w:rPr>
+          <w:rFonts w:ascii="Arial" w:hAnsi="Arial" w:cs="Arial"/>
+          <w:sz w:val="18"/>
+          <w:szCs w:val="18"/>
+        </w:rPr>
+        <w:t>.</w:t>
       </w:r>
       <w:r>
         <w:rPr>
@@ -541,9 +1010,175 @@
         </w:rPr>
         <w:t xml:space="preserve"> </w:t>
       </w:r>
-      <w:r>
-        <w:rPr>
-          <w:rFonts w:ascii="Arial" w:hAnsi="Arial" w:cs="Arial"/>
+    </w:p>
+    <w:p>
+      <w:pPr>
+        <w:jc w:val="both"/>
+        <w:rPr>
+          <w:rFonts w:ascii="Arial" w:hAnsi="Arial"/>
+          <w:sz w:val="18"/>
+          <w:szCs w:val="18"/>
+        </w:rPr>
+      </w:pPr>
+    </w:p>
+    <w:p>
+      <w:pPr>
+        <w:jc w:val="both"/>
+        <w:rPr>
+          <w:rFonts w:ascii="Arial" w:hAnsi="Arial"/>
+          <w:sz w:val="18"/>
+          <w:szCs w:val="18"/>
+        </w:rPr>
+      </w:pPr>
+      <w:r>
+        <w:rPr>
+          <w:rFonts w:ascii="Arial" w:hAnsi="Arial"/>
+          <w:sz w:val="18"/>
+          <w:szCs w:val="18"/>
+        </w:rPr>
+        <w:t xml:space="preserve">Desde su fecha de vencimiento y hasta su total cancelación, el importe de este pagaré devengará una tasa de interés compensatorio mensual de </w:t>
+      </w:r>
+      <w:r>
+        <w:rPr>
+          <w:rFonts w:ascii="Arial" w:hAnsi="Arial"/>
+          <w:sz w:val="18"/>
+          <w:szCs w:val="18"/>
+        </w:rPr>
+        <w:t>2</w:t>
+      </w:r>
+      <w:r>
+        <w:rPr>
+          <w:rFonts w:ascii="Arial" w:hAnsi="Arial"/>
+          <w:sz w:val="18"/>
+          <w:szCs w:val="18"/>
+        </w:rPr>
+        <w:t xml:space="preserve">% y en caso de incumplimiento en el pago generará un interés moratorio mensual de </w:t>
+      </w:r>
+      <w:r>
+        <w:rPr>
+          <w:rFonts w:ascii="Arial" w:hAnsi="Arial"/>
+          <w:sz w:val="18"/>
+          <w:szCs w:val="18"/>
+        </w:rPr>
+        <w:t>1.5</w:t>
+      </w:r>
+      <w:r>
+        <w:rPr>
+          <w:rFonts w:ascii="Arial" w:hAnsi="Arial"/>
+          <w:sz w:val="18"/>
+          <w:szCs w:val="18"/>
+        </w:rPr>
+        <w:t>%.</w:t>
+      </w:r>
+    </w:p>
+    <w:p>
+      <w:pPr>
+        <w:jc w:val="both"/>
+        <w:rPr>
+          <w:rFonts w:ascii="Arial" w:hAnsi="Arial"/>
+          <w:sz w:val="18"/>
+          <w:szCs w:val="18"/>
+        </w:rPr>
+      </w:pPr>
+    </w:p>
+    <w:p>
+      <w:pPr>
+        <w:jc w:val="both"/>
+        <w:rPr>
+          <w:rFonts w:ascii="Arial" w:hAnsi="Arial"/>
+          <w:sz w:val="18"/>
+          <w:szCs w:val="18"/>
+        </w:rPr>
+      </w:pPr>
+      <w:r>
+        <w:rPr>
+          <w:rFonts w:ascii="Arial" w:hAnsi="Arial"/>
+          <w:sz w:val="18"/>
+          <w:szCs w:val="18"/>
+        </w:rPr>
+        <w:t xml:space="preserve">La constitución en mora será automática. </w:t>
+      </w:r>
+      <w:r>
+        <w:rPr>
+          <w:rFonts w:ascii="Arial" w:hAnsi="Arial"/>
+          <w:sz w:val="18"/>
+          <w:szCs w:val="18"/>
+        </w:rPr>
+        <w:t>Asimismo,</w:t>
+      </w:r>
+      <w:r>
+        <w:rPr>
+          <w:rFonts w:ascii="Arial" w:hAnsi="Arial"/>
+          <w:sz w:val="18"/>
+          <w:szCs w:val="18"/>
+        </w:rPr>
+        <w:t xml:space="preserve"> hasta la fecha de su total cancelación abonaré(</w:t>
+      </w:r>
+      <w:proofErr w:type="spellStart"/>
+      <w:r>
+        <w:rPr>
+          <w:rFonts w:ascii="Arial" w:hAnsi="Arial"/>
+          <w:sz w:val="18"/>
+          <w:szCs w:val="18"/>
+        </w:rPr>
+        <w:t>mos</w:t>
+      </w:r>
+      <w:proofErr w:type="spellEnd"/>
+      <w:r>
+        <w:rPr>
+          <w:rFonts w:ascii="Arial" w:hAnsi="Arial"/>
+          <w:sz w:val="18"/>
+          <w:szCs w:val="18"/>
+        </w:rPr>
+        <w:t>) además los gastos extrajudiciales y/o judiciales que se originen</w:t>
+      </w:r>
+      <w:r>
+        <w:rPr>
+          <w:rFonts w:ascii="Arial" w:hAnsi="Arial"/>
+          <w:sz w:val="18"/>
+          <w:szCs w:val="18"/>
+        </w:rPr>
+        <w:t>, inclusive tributos, gastos de cobranza y demás</w:t>
+      </w:r>
+      <w:r>
+        <w:rPr>
+          <w:rFonts w:ascii="Arial" w:hAnsi="Arial"/>
+          <w:sz w:val="18"/>
+          <w:szCs w:val="18"/>
+        </w:rPr>
+        <w:t>.</w:t>
+      </w:r>
+    </w:p>
+    <w:p>
+      <w:pPr>
+        <w:jc w:val="both"/>
+        <w:rPr>
+          <w:rFonts w:ascii="Arial" w:hAnsi="Arial"/>
+          <w:sz w:val="18"/>
+          <w:szCs w:val="18"/>
+        </w:rPr>
+      </w:pPr>
+    </w:p>
+    <w:p>
+      <w:pPr>
+        <w:jc w:val="both"/>
+        <w:rPr>
+          <w:rFonts w:ascii="Arial" w:hAnsi="Arial"/>
+          <w:sz w:val="18"/>
+          <w:szCs w:val="18"/>
+        </w:rPr>
+      </w:pPr>
+      <w:r>
+        <w:rPr>
+          <w:rFonts w:ascii="Arial" w:hAnsi="Arial"/>
+          <w:sz w:val="18"/>
+          <w:szCs w:val="18"/>
+        </w:rPr>
+        <w:t>Esté pagaré será pagado en la misma moneda que expresa este Título Valor.</w:t>
+      </w:r>
+      <w:r>
+        <w:rPr>
+          <w:rFonts w:ascii="Arial" w:hAnsi="Arial"/>
           <w:sz w:val="18"/>
           <w:szCs w:val="18"/>
         </w:rPr>
@@ -551,74 +1186,66 @@
       </w:r>
       <w:r>
         <w:rPr>
-          <w:rFonts w:ascii="Arial" w:hAnsi="Arial" w:cs="Arial"/>
-          <w:sz w:val="18"/>
-          <w:szCs w:val="18"/>
-          <w:shd w:val="clear" w:color="auto" w:fill="FFFFFF"/>
-        </w:rPr>
-        <w:t>Fernando Félix Toratto Fernández</w:t>
-      </w:r>
-      <w:r>
-        <w:rPr>
-          <w:rFonts w:ascii="Arial" w:hAnsi="Arial" w:cs="Arial"/>
-          <w:sz w:val="18"/>
-          <w:szCs w:val="18"/>
-        </w:rPr>
-        <w:t xml:space="preserve">, identificado con </w:t>
-      </w:r>
-      <w:r>
-        <w:rPr>
-          <w:rFonts w:ascii="Arial" w:hAnsi="Arial" w:cs="Arial"/>
-          <w:sz w:val="18"/>
-          <w:szCs w:val="18"/>
-        </w:rPr>
-        <w:t xml:space="preserve">DNI N.º </w:t>
-      </w:r>
-      <w:r>
-        <w:rPr>
-          <w:rFonts w:ascii="Arial" w:hAnsi="Arial" w:cs="Arial"/>
-          <w:b/>
-          <w:sz w:val="18"/>
-          <w:szCs w:val="18"/>
-        </w:rPr>
-        <w:t>07214887</w:t>
-      </w:r>
-      <w:r>
-        <w:rPr>
-          <w:rFonts w:ascii="Arial" w:hAnsi="Arial" w:cs="Arial"/>
-          <w:sz w:val="18"/>
-          <w:szCs w:val="18"/>
-        </w:rPr>
-        <w:t xml:space="preserve">, </w:t>
-      </w:r>
-      <w:r>
-        <w:rPr>
-          <w:rFonts w:ascii="Arial" w:hAnsi="Arial" w:cs="Arial"/>
-          <w:sz w:val="18"/>
-          <w:szCs w:val="18"/>
-        </w:rPr>
-        <w:t>en</w:t>
-      </w:r>
-      <w:r>
-        <w:rPr>
-          <w:rFonts w:ascii="Arial" w:hAnsi="Arial" w:cs="Arial"/>
-          <w:sz w:val="18"/>
-          <w:szCs w:val="18"/>
-        </w:rPr>
-        <w:t xml:space="preserve"> adelante “</w:t>
-      </w:r>
-      <w:r>
-        <w:rPr>
-          <w:rFonts w:ascii="Arial" w:hAnsi="Arial" w:cs="Arial"/>
-          <w:b/>
-          <w:sz w:val="18"/>
-          <w:szCs w:val="18"/>
-        </w:rPr>
-        <w:t>EL CONTRATANTE</w:t>
-      </w:r>
-      <w:r>
-        <w:rPr>
-          <w:rFonts w:ascii="Arial" w:hAnsi="Arial" w:cs="Arial"/>
+          <w:rFonts w:ascii="Arial" w:hAnsi="Arial"/>
+          <w:sz w:val="18"/>
+          <w:szCs w:val="18"/>
+        </w:rPr>
+        <w:t>Las tasas de interés moratorio y demás gastos, podrán ser reajustados</w:t>
+      </w:r>
+      <w:r>
+        <w:rPr>
+          <w:rFonts w:ascii="Arial" w:hAnsi="Arial"/>
+          <w:sz w:val="18"/>
+          <w:szCs w:val="18"/>
+        </w:rPr>
+        <w:t xml:space="preserve"> y/o variados</w:t>
+      </w:r>
+      <w:r>
+        <w:rPr>
+          <w:rFonts w:ascii="Arial" w:hAnsi="Arial"/>
+          <w:sz w:val="18"/>
+          <w:szCs w:val="18"/>
+        </w:rPr>
+        <w:t xml:space="preserve"> por </w:t>
+      </w:r>
+      <w:r>
+        <w:rPr>
+          <w:rFonts w:ascii="Arial" w:hAnsi="Arial"/>
+          <w:sz w:val="18"/>
+          <w:szCs w:val="18"/>
+        </w:rPr>
+        <w:t>“</w:t>
+      </w:r>
+      <w:r>
+        <w:rPr>
+          <w:rFonts w:ascii="Arial" w:hAnsi="Arial"/>
+          <w:b/>
+          <w:sz w:val="18"/>
+          <w:szCs w:val="18"/>
+        </w:rPr>
+        <w:t>{{</w:t>
+      </w:r>
+      <w:r>
+        <w:rPr>
+          <w:rFonts w:ascii="Arial" w:hAnsi="Arial"/>
+          <w:b/>
+          <w:sz w:val="18"/>
+          <w:szCs w:val="18"/>
+        </w:rPr>
+        <w:t>PROYECTO_RAZON_SOCIAL</w:t>
+      </w:r>
+      <w:r>
+        <w:rPr>
+          <w:rFonts w:ascii="Arial" w:hAnsi="Arial"/>
+          <w:b/>
+          <w:sz w:val="18"/>
+          <w:szCs w:val="18"/>
+        </w:rPr>
+        <w:t>}}</w:t>
+      </w:r>
+      <w:r>
+        <w:rPr>
+          <w:rFonts w:ascii="Arial" w:hAnsi="Arial"/>
           <w:b/>
           <w:sz w:val="18"/>
           <w:szCs w:val="18"/>
@@ -627,40 +1254,70 @@
       </w:r>
       <w:r>
         <w:rPr>
-          <w:rFonts w:ascii="Arial" w:hAnsi="Arial" w:cs="Arial"/>
-          <w:b/>
-          <w:sz w:val="18"/>
-          <w:szCs w:val="18"/>
-        </w:rPr>
-        <w:t>,</w:t>
-      </w:r>
-      <w:r>
-        <w:rPr>
-          <w:rFonts w:ascii="Arial" w:hAnsi="Arial" w:cs="Arial"/>
-          <w:sz w:val="18"/>
-          <w:szCs w:val="18"/>
-        </w:rPr>
-        <w:t xml:space="preserve"> en la </w:t>
-      </w:r>
-      <w:r>
-        <w:rPr>
-          <w:rFonts w:ascii="Arial" w:hAnsi="Arial" w:cs="Arial"/>
-          <w:sz w:val="18"/>
-          <w:szCs w:val="18"/>
-        </w:rPr>
-        <w:t xml:space="preserve">fecha de vencimiento indicada, la suma </w:t>
-      </w:r>
-      <w:r>
-        <w:rPr>
-          <w:rFonts w:ascii="Arial" w:hAnsi="Arial" w:cs="Arial"/>
-          <w:sz w:val="18"/>
-          <w:szCs w:val="18"/>
-        </w:rPr>
-        <w:t>de</w:t>
-      </w:r>
-      <w:r>
-        <w:rPr>
-          <w:rFonts w:ascii="Arial" w:hAnsi="Arial" w:cs="Arial"/>
+          <w:rFonts w:ascii="Arial" w:hAnsi="Arial"/>
+          <w:sz w:val="18"/>
+          <w:szCs w:val="18"/>
+        </w:rPr>
+        <w:t xml:space="preserve"> dentro de los límites establecidos por el Banco Central de Reserva del Perú con la debida y oportuna comunicación prevista legalmente, aceptando de manera expresa estas modificaciones.</w:t>
+      </w:r>
+    </w:p>
+    <w:p>
+      <w:pPr>
+        <w:jc w:val="both"/>
+        <w:rPr>
+          <w:rFonts w:ascii="Arial" w:hAnsi="Arial"/>
+          <w:sz w:val="18"/>
+          <w:szCs w:val="18"/>
+        </w:rPr>
+      </w:pPr>
+    </w:p>
+    <w:p>
+      <w:pPr>
+        <w:jc w:val="both"/>
+        <w:rPr>
+          <w:rFonts w:ascii="Arial" w:hAnsi="Arial"/>
+          <w:sz w:val="18"/>
+          <w:szCs w:val="18"/>
+        </w:rPr>
+      </w:pPr>
+      <w:r>
+        <w:rPr>
+          <w:rFonts w:ascii="Arial" w:hAnsi="Arial"/>
+          <w:sz w:val="18"/>
+          <w:szCs w:val="18"/>
+        </w:rPr>
+        <w:t xml:space="preserve">Este pagaré no requerirá protesto para su ejecución. Sin embargo, </w:t>
+      </w:r>
+      <w:r>
+        <w:rPr>
+          <w:rFonts w:ascii="Arial" w:hAnsi="Arial"/>
+          <w:sz w:val="18"/>
+          <w:szCs w:val="18"/>
+        </w:rPr>
+        <w:t>“</w:t>
+      </w:r>
+      <w:r>
+        <w:rPr>
+          <w:rFonts w:ascii="Arial" w:hAnsi="Arial"/>
+          <w:b/>
+          <w:sz w:val="18"/>
+          <w:szCs w:val="18"/>
+        </w:rPr>
+        <w:t>{{PROYECTO_RAZON_SOCIAL}}</w:t>
+      </w:r>
+      <w:r>
+        <w:rPr>
+          <w:rFonts w:ascii="Arial" w:hAnsi="Arial"/>
+          <w:b/>
+          <w:sz w:val="18"/>
+          <w:szCs w:val="18"/>
+        </w:rPr>
+        <w:t>”</w:t>
+      </w:r>
+      <w:r>
+        <w:rPr>
+          <w:rFonts w:ascii="Arial" w:hAnsi="Arial"/>
+          <w:b/>
           <w:sz w:val="18"/>
           <w:szCs w:val="18"/>
         </w:rPr>
@@ -668,89 +1325,41 @@
       </w:r>
       <w:r>
         <w:rPr>
-          <w:rFonts w:ascii="Arial" w:hAnsi="Arial" w:cs="Arial"/>
-          <w:b/>
-          <w:bCs/>
-          <w:sz w:val="18"/>
-          <w:szCs w:val="18"/>
-        </w:rPr>
-        <w:t>{{</w:t>
-      </w:r>
-      <w:r>
-        <w:rPr>
-          <w:rFonts w:ascii="Arial" w:hAnsi="Arial" w:cs="Arial"/>
-          <w:b/>
-          <w:bCs/>
-          <w:sz w:val="18"/>
-          <w:szCs w:val="18"/>
-        </w:rPr>
-        <w:t>ADVANCE_AMOUNT</w:t>
-      </w:r>
-      <w:r>
-        <w:rPr>
-          <w:rFonts w:ascii="Arial" w:hAnsi="Arial" w:cs="Arial"/>
-          <w:b/>
-          <w:bCs/>
-          <w:sz w:val="18"/>
-          <w:szCs w:val="18"/>
-        </w:rPr>
-        <w:t>}}</w:t>
-      </w:r>
-      <w:r>
-        <w:rPr>
-          <w:rFonts w:ascii="Arial" w:hAnsi="Arial" w:cs="Arial"/>
-          <w:b/>
-          <w:bCs/>
-          <w:sz w:val="18"/>
-          <w:szCs w:val="18"/>
-        </w:rPr>
-        <w:t xml:space="preserve"> (</w:t>
-      </w:r>
-      <w:r>
-        <w:rPr>
-          <w:rFonts w:ascii="Arial" w:hAnsi="Arial" w:cs="Arial"/>
-          <w:b/>
-          <w:bCs/>
-          <w:sz w:val="18"/>
-          <w:szCs w:val="18"/>
-        </w:rPr>
-        <w:t>{{</w:t>
-      </w:r>
-      <w:r>
-        <w:rPr>
-          <w:rFonts w:ascii="Arial" w:hAnsi="Arial" w:cs="Arial"/>
-          <w:b/>
-          <w:bCs/>
-          <w:sz w:val="18"/>
-          <w:szCs w:val="18"/>
-        </w:rPr>
-        <w:t>ADVANCE_AMOUNT_EN_PALABRAS</w:t>
-      </w:r>
-      <w:r>
-        <w:rPr>
-          <w:rFonts w:ascii="Arial" w:hAnsi="Arial" w:cs="Arial"/>
-          <w:b/>
-          <w:bCs/>
-          <w:sz w:val="18"/>
-          <w:szCs w:val="18"/>
-        </w:rPr>
-        <w:t>}}</w:t>
-      </w:r>
-      <w:r>
-        <w:rPr>
-          <w:rFonts w:ascii="Arial" w:hAnsi="Arial" w:cs="Arial"/>
-          <w:b/>
-          <w:bCs/>
-          <w:sz w:val="18"/>
-          <w:szCs w:val="18"/>
-        </w:rPr>
-        <w:t>)</w:t>
-      </w:r>
-      <w:r>
-        <w:rPr>
-          <w:rFonts w:ascii="Arial" w:hAnsi="Arial" w:cs="Arial"/>
-          <w:b/>
-          <w:bCs/>
+          <w:rFonts w:ascii="Arial" w:hAnsi="Arial"/>
+          <w:sz w:val="18"/>
+          <w:szCs w:val="18"/>
+        </w:rPr>
+        <w:t>podrá</w:t>
+      </w:r>
+      <w:r>
+        <w:rPr>
+          <w:rFonts w:ascii="Arial" w:hAnsi="Arial"/>
+          <w:sz w:val="18"/>
+          <w:szCs w:val="18"/>
+        </w:rPr>
+        <w:t xml:space="preserve"> protestarlo, en cuyo caso asumiré(</w:t>
+      </w:r>
+      <w:proofErr w:type="spellStart"/>
+      <w:r>
+        <w:rPr>
+          <w:rFonts w:ascii="Arial" w:hAnsi="Arial"/>
+          <w:sz w:val="18"/>
+          <w:szCs w:val="18"/>
+        </w:rPr>
+        <w:t>mos</w:t>
+      </w:r>
+      <w:proofErr w:type="spellEnd"/>
+      <w:r>
+        <w:rPr>
+          <w:rFonts w:ascii="Arial" w:hAnsi="Arial"/>
+          <w:sz w:val="18"/>
+          <w:szCs w:val="18"/>
+        </w:rPr>
+        <w:t>) los gastos de dicha diligencia.</w:t>
+      </w:r>
+      <w:r>
+        <w:rPr>
+          <w:rFonts w:ascii="Arial" w:hAnsi="Arial"/>
           <w:sz w:val="18"/>
           <w:szCs w:val="18"/>
         </w:rPr>
@@ -758,102 +1367,39 @@
       </w:r>
       <w:r>
         <w:rPr>
-          <w:rFonts w:ascii="Arial" w:hAnsi="Arial" w:cs="Arial"/>
-          <w:sz w:val="18"/>
-          <w:szCs w:val="18"/>
-        </w:rPr>
-        <w:t>importe</w:t>
-      </w:r>
-      <w:r>
-        <w:rPr>
-          <w:rFonts w:ascii="Arial" w:hAnsi="Arial" w:cs="Arial"/>
-          <w:sz w:val="18"/>
-          <w:szCs w:val="18"/>
-        </w:rPr>
-        <w:t xml:space="preserve"> que corresponde a la </w:t>
-      </w:r>
-      <w:r>
-        <w:rPr>
-          <w:rFonts w:ascii="Arial" w:hAnsi="Arial" w:cs="Arial"/>
-          <w:sz w:val="18"/>
-          <w:szCs w:val="18"/>
-        </w:rPr>
-        <w:t xml:space="preserve">línea de crédito </w:t>
-      </w:r>
-      <w:r>
-        <w:rPr>
-          <w:rFonts w:ascii="Arial" w:hAnsi="Arial" w:cs="Arial"/>
-          <w:sz w:val="18"/>
-          <w:szCs w:val="18"/>
-        </w:rPr>
-        <w:t>por operaciones comerciales otorgada por “</w:t>
-      </w:r>
-      <w:r>
-        <w:rPr>
-          <w:rFonts w:ascii="Arial" w:hAnsi="Arial" w:cs="Arial"/>
-          <w:b/>
-          <w:bCs/>
-          <w:sz w:val="18"/>
-          <w:szCs w:val="18"/>
-        </w:rPr>
-        <w:t>{{</w:t>
-      </w:r>
-      <w:r>
-        <w:rPr>
-          <w:rFonts w:ascii="Arial" w:hAnsi="Arial" w:cs="Arial"/>
-          <w:b/>
-          <w:bCs/>
-          <w:sz w:val="18"/>
-          <w:szCs w:val="18"/>
-        </w:rPr>
-        <w:t>PROYECTO_RAZON_SOCIAL</w:t>
-      </w:r>
-      <w:r>
-        <w:rPr>
-          <w:rFonts w:ascii="Arial" w:hAnsi="Arial" w:cs="Arial"/>
-          <w:b/>
-          <w:bCs/>
-          <w:sz w:val="18"/>
-          <w:szCs w:val="18"/>
-        </w:rPr>
-        <w:t>}}</w:t>
-      </w:r>
-      <w:r>
-        <w:rPr>
-          <w:rFonts w:ascii="Arial" w:hAnsi="Arial" w:cs="Arial"/>
-          <w:b/>
-          <w:sz w:val="18"/>
-          <w:szCs w:val="18"/>
-        </w:rPr>
-        <w:t>”</w:t>
-      </w:r>
-      <w:r>
-        <w:rPr>
-          <w:rFonts w:ascii="Arial" w:hAnsi="Arial" w:cs="Arial"/>
-          <w:sz w:val="18"/>
-          <w:szCs w:val="18"/>
-        </w:rPr>
-        <w:t>, en virtud del Contrato</w:t>
-      </w:r>
-      <w:r>
-        <w:rPr>
-          <w:rFonts w:ascii="Arial" w:hAnsi="Arial" w:cs="Arial"/>
-          <w:sz w:val="18"/>
-          <w:szCs w:val="18"/>
-        </w:rPr>
-        <w:t xml:space="preserve"> N</w:t>
-      </w:r>
-      <w:r>
-        <w:rPr>
-          <w:rFonts w:ascii="Arial" w:hAnsi="Arial" w:cs="Arial"/>
-          <w:sz w:val="18"/>
-          <w:szCs w:val="18"/>
-        </w:rPr>
-        <w:t>ro.</w:t>
-      </w:r>
-      <w:r>
-        <w:rPr>
-          <w:rFonts w:ascii="Arial" w:hAnsi="Arial" w:cs="Arial"/>
+          <w:rFonts w:ascii="Arial" w:hAnsi="Arial"/>
+          <w:sz w:val="18"/>
+          <w:szCs w:val="18"/>
+        </w:rPr>
+        <w:t xml:space="preserve">Acepto(amos) la(s) prórroga(s) total(es) o parcial(es) que se anoten en este documento </w:t>
+      </w:r>
+      <w:r>
+        <w:rPr>
+          <w:rFonts w:ascii="Arial" w:hAnsi="Arial"/>
+          <w:sz w:val="18"/>
+          <w:szCs w:val="18"/>
+        </w:rPr>
+        <w:t>aun</w:t>
+      </w:r>
+      <w:r>
+        <w:rPr>
+          <w:rFonts w:ascii="Arial" w:hAnsi="Arial"/>
+          <w:sz w:val="18"/>
+          <w:szCs w:val="18"/>
+        </w:rPr>
+        <w:t xml:space="preserve"> cuando no estén suscritas por mi (nosotros)</w:t>
+      </w:r>
+      <w:r>
+        <w:rPr>
+          <w:rFonts w:ascii="Arial" w:hAnsi="Arial"/>
+          <w:sz w:val="18"/>
+          <w:szCs w:val="18"/>
+        </w:rPr>
+        <w:t>. Este pagaré podrá ser libremente transferido y negociado</w:t>
+      </w:r>
+      <w:r>
+        <w:rPr>
+          <w:rFonts w:ascii="Arial" w:hAnsi="Arial"/>
           <w:sz w:val="18"/>
           <w:szCs w:val="18"/>
         </w:rPr>
@@ -861,65 +1407,43 @@
       </w:r>
       <w:r>
         <w:rPr>
-          <w:rFonts w:ascii="Arial" w:hAnsi="Arial" w:cs="Arial"/>
-          <w:sz w:val="18"/>
-          <w:szCs w:val="18"/>
-        </w:rPr>
-        <w:t>{{</w:t>
-      </w:r>
-      <w:r>
-        <w:rPr>
-          <w:rFonts w:ascii="Arial" w:hAnsi="Arial" w:cs="Arial"/>
-          <w:sz w:val="18"/>
-          <w:szCs w:val="18"/>
-        </w:rPr>
-        <w:t>NUM_CONTRATO</w:t>
-      </w:r>
-      <w:proofErr w:type="gramStart"/>
-      <w:r>
-        <w:rPr>
-          <w:rFonts w:ascii="Arial" w:hAnsi="Arial" w:cs="Arial"/>
-          <w:sz w:val="18"/>
-          <w:szCs w:val="18"/>
-        </w:rPr>
-        <w:t>}}{</w:t>
-      </w:r>
-      <w:proofErr w:type="gramEnd"/>
-      <w:r>
-        <w:rPr>
-          <w:rFonts w:ascii="Arial" w:hAnsi="Arial" w:cs="Arial"/>
-          <w:sz w:val="18"/>
-          <w:szCs w:val="18"/>
-        </w:rPr>
-        <w:t>{</w:t>
-      </w:r>
-      <w:r>
-        <w:rPr>
-          <w:rFonts w:ascii="Arial" w:hAnsi="Arial" w:cs="Arial"/>
-          <w:sz w:val="18"/>
-          <w:szCs w:val="18"/>
-        </w:rPr>
-        <w:t>PROYECTO_ABREVIATURA</w:t>
-      </w:r>
-      <w:r>
-        <w:rPr>
-          <w:rFonts w:ascii="Arial" w:hAnsi="Arial" w:cs="Arial"/>
-          <w:sz w:val="18"/>
-          <w:szCs w:val="18"/>
-        </w:rPr>
-        <w:t>}</w:t>
-      </w:r>
-      <w:r>
-        <w:rPr>
-          <w:rFonts w:ascii="Arial" w:hAnsi="Arial" w:cs="Arial"/>
-          <w:sz w:val="18"/>
-          <w:szCs w:val="18"/>
-        </w:rPr>
-        <w:t>}</w:t>
-      </w:r>
-      <w:r>
-        <w:rPr>
-          <w:rFonts w:ascii="Arial" w:hAnsi="Arial" w:cs="Arial"/>
+          <w:rFonts w:ascii="Arial" w:hAnsi="Arial"/>
+          <w:sz w:val="18"/>
+          <w:szCs w:val="18"/>
+        </w:rPr>
+        <w:t>por el tenedor.</w:t>
+      </w:r>
+    </w:p>
+    <w:p>
+      <w:pPr>
+        <w:jc w:val="both"/>
+        <w:rPr>
+          <w:rFonts w:ascii="Arial" w:hAnsi="Arial"/>
+          <w:sz w:val="18"/>
+          <w:szCs w:val="18"/>
+        </w:rPr>
+      </w:pPr>
+    </w:p>
+    <w:p>
+      <w:pPr>
+        <w:jc w:val="both"/>
+        <w:rPr>
+          <w:rFonts w:ascii="Arial" w:hAnsi="Arial"/>
+          <w:sz w:val="18"/>
+          <w:szCs w:val="18"/>
+        </w:rPr>
+      </w:pPr>
+      <w:r>
+        <w:rPr>
+          <w:rFonts w:ascii="Arial" w:hAnsi="Arial"/>
+          <w:sz w:val="18"/>
+          <w:szCs w:val="18"/>
+        </w:rPr>
+        <w:t>Este pagaré, así como sus prórrogas, no constituirán renovación de la obligación contenida en el contrato de la referencia;</w:t>
+      </w:r>
+      <w:r>
+        <w:rPr>
+          <w:rFonts w:ascii="Arial" w:hAnsi="Arial"/>
           <w:sz w:val="18"/>
           <w:szCs w:val="18"/>
         </w:rPr>
@@ -927,15 +1451,185 @@
       </w:r>
       <w:r>
         <w:rPr>
-          <w:rFonts w:ascii="Arial" w:hAnsi="Arial" w:cs="Arial"/>
-          <w:sz w:val="18"/>
-          <w:szCs w:val="18"/>
-        </w:rPr>
-        <w:t>–</w:t>
-      </w:r>
-      <w:r>
-        <w:rPr>
-          <w:rFonts w:ascii="Arial" w:hAnsi="Arial" w:cs="Arial"/>
+          <w:rFonts w:ascii="Arial" w:hAnsi="Arial"/>
+          <w:sz w:val="18"/>
+          <w:szCs w:val="18"/>
+        </w:rPr>
+        <w:t xml:space="preserve">su emisión, prórroga o renovación no extinguirá en ningún caso la obligación principal o primitiva, aun cuando se perjudique por cualquier causa. </w:t>
+      </w:r>
+    </w:p>
+    <w:p>
+      <w:pPr>
+        <w:jc w:val="both"/>
+        <w:rPr>
+          <w:rFonts w:ascii="Arial" w:hAnsi="Arial"/>
+          <w:sz w:val="18"/>
+          <w:szCs w:val="18"/>
+        </w:rPr>
+      </w:pPr>
+    </w:p>
+    <w:p>
+      <w:pPr>
+        <w:jc w:val="both"/>
+        <w:rPr>
+          <w:rFonts w:ascii="Arial" w:hAnsi="Arial"/>
+          <w:sz w:val="18"/>
+          <w:szCs w:val="18"/>
+        </w:rPr>
+      </w:pPr>
+      <w:r>
+        <w:rPr>
+          <w:rFonts w:ascii="Arial" w:hAnsi="Arial"/>
+          <w:sz w:val="18"/>
+          <w:szCs w:val="18"/>
+        </w:rPr>
+        <w:t xml:space="preserve">Me (nos) someto (emos) expresamente al proceso judicial que </w:t>
+      </w:r>
+      <w:r>
+        <w:rPr>
+          <w:rFonts w:ascii="Arial" w:hAnsi="Arial"/>
+          <w:sz w:val="18"/>
+          <w:szCs w:val="18"/>
+        </w:rPr>
+        <w:t>“</w:t>
+      </w:r>
+      <w:r>
+        <w:rPr>
+          <w:rFonts w:ascii="Arial" w:hAnsi="Arial"/>
+          <w:b/>
+          <w:sz w:val="18"/>
+          <w:szCs w:val="18"/>
+        </w:rPr>
+        <w:t>{{PROYECTO_RAZON_SOCIAL}}”</w:t>
+      </w:r>
+      <w:r>
+        <w:rPr>
+          <w:rFonts w:ascii="Arial" w:hAnsi="Arial"/>
+          <w:sz w:val="18"/>
+          <w:szCs w:val="18"/>
+        </w:rPr>
+        <w:t xml:space="preserve"> u otro tenedor pueda ejercitar conforme a la Ley de Títulos Valores y/o Código Procesal Civil, así como a la competencia de los jueces y tribunales del Distrito Judicial de Lima Cercado, señalando como domicilio, para este efecto, el que aparece al final de este documento donde se efectuarán válidamente las diligencias notariales, judiciales y demás que fuesen necesarias.</w:t>
+      </w:r>
+    </w:p>
+    <w:p>
+      <w:pPr>
+        <w:jc w:val="both"/>
+        <w:rPr>
+          <w:rFonts w:ascii="Arial" w:hAnsi="Arial"/>
+          <w:sz w:val="18"/>
+          <w:szCs w:val="18"/>
+        </w:rPr>
+      </w:pPr>
+    </w:p>
+    <w:p>
+      <w:pPr>
+        <w:jc w:val="both"/>
+        <w:rPr>
+          <w:rFonts w:ascii="Arial" w:hAnsi="Arial"/>
+          <w:sz w:val="18"/>
+          <w:szCs w:val="18"/>
+        </w:rPr>
+      </w:pPr>
+      <w:r>
+        <w:rPr>
+          <w:rFonts w:ascii="Arial" w:hAnsi="Arial"/>
+          <w:sz w:val="18"/>
+          <w:szCs w:val="18"/>
+        </w:rPr>
+        <w:t>Convengo(</w:t>
+      </w:r>
+      <w:proofErr w:type="spellStart"/>
+      <w:r>
+        <w:rPr>
+          <w:rFonts w:ascii="Arial" w:hAnsi="Arial"/>
+          <w:sz w:val="18"/>
+          <w:szCs w:val="18"/>
+        </w:rPr>
+        <w:t>imos</w:t>
+      </w:r>
+      <w:proofErr w:type="spellEnd"/>
+      <w:r>
+        <w:rPr>
+          <w:rFonts w:ascii="Arial" w:hAnsi="Arial"/>
+          <w:sz w:val="18"/>
+          <w:szCs w:val="18"/>
+        </w:rPr>
+        <w:t xml:space="preserve">) por este acto, en subrogarme (nos) de inmediato y obligatoriamente en los derechos crediticios de </w:t>
+      </w:r>
+      <w:r>
+        <w:rPr>
+          <w:rFonts w:ascii="Arial" w:hAnsi="Arial"/>
+          <w:sz w:val="18"/>
+          <w:szCs w:val="18"/>
+        </w:rPr>
+        <w:t>“</w:t>
+      </w:r>
+      <w:r>
+        <w:rPr>
+          <w:rFonts w:ascii="Arial" w:hAnsi="Arial"/>
+          <w:b/>
+          <w:sz w:val="18"/>
+          <w:szCs w:val="18"/>
+        </w:rPr>
+        <w:t>{{PROYECTO_RAZON_SOCIAL}}”</w:t>
+      </w:r>
+      <w:r>
+        <w:rPr>
+          <w:rFonts w:ascii="Arial" w:hAnsi="Arial"/>
+          <w:sz w:val="18"/>
+          <w:szCs w:val="18"/>
+        </w:rPr>
+        <w:t>, aun antes del vencimiento del presente Pagaré, si solicitase o fuese(</w:t>
+      </w:r>
+      <w:proofErr w:type="spellStart"/>
+      <w:r>
+        <w:rPr>
+          <w:rFonts w:ascii="Arial" w:hAnsi="Arial"/>
+          <w:sz w:val="18"/>
+          <w:szCs w:val="18"/>
+        </w:rPr>
+        <w:t>mos</w:t>
+      </w:r>
+      <w:proofErr w:type="spellEnd"/>
+      <w:r>
+        <w:rPr>
+          <w:rFonts w:ascii="Arial" w:hAnsi="Arial"/>
+          <w:sz w:val="18"/>
+          <w:szCs w:val="18"/>
+        </w:rPr>
+        <w:t>) declarado(s) insolvente(s) por la respectiva Comisión de Procedimientos Concursales, o se sometiese por acto propio o de terceros a cualquier proceso de saneamiento, concursal, reestructuración patrimonial, o programas de refinanciación similares o análogos.</w:t>
+      </w:r>
+    </w:p>
+    <w:p>
+      <w:pPr>
+        <w:jc w:val="both"/>
+        <w:rPr>
+          <w:rFonts w:ascii="Arial" w:hAnsi="Arial"/>
+          <w:sz w:val="18"/>
+          <w:szCs w:val="18"/>
+        </w:rPr>
+      </w:pPr>
+    </w:p>
+    <w:p>
+      <w:pPr>
+        <w:jc w:val="both"/>
+        <w:rPr>
+          <w:rFonts w:ascii="Arial" w:hAnsi="Arial"/>
+          <w:sz w:val="18"/>
+          <w:szCs w:val="18"/>
+        </w:rPr>
+      </w:pPr>
+      <w:r>
+        <w:rPr>
+          <w:rFonts w:ascii="Arial" w:hAnsi="Arial"/>
+          <w:sz w:val="18"/>
+          <w:szCs w:val="18"/>
+        </w:rPr>
+        <w:t>Asimismo, obligo</w:t>
+      </w:r>
+      <w:r>
+        <w:rPr>
+          <w:rFonts w:ascii="Arial" w:hAnsi="Arial"/>
           <w:sz w:val="18"/>
           <w:szCs w:val="18"/>
         </w:rPr>
@@ -943,31 +1637,40 @@
       </w:r>
       <w:r>
         <w:rPr>
-          <w:rFonts w:ascii="Arial" w:hAnsi="Arial" w:cs="Arial"/>
-          <w:sz w:val="18"/>
-          <w:szCs w:val="18"/>
-        </w:rPr>
-        <w:t>{{</w:t>
-      </w:r>
-      <w:r>
-        <w:rPr>
-          <w:rFonts w:ascii="Arial" w:hAnsi="Arial" w:cs="Arial"/>
-          <w:sz w:val="18"/>
-          <w:szCs w:val="18"/>
-        </w:rPr>
-        <w:t>AÑO_ACTUAL</w:t>
-      </w:r>
-      <w:r>
-        <w:rPr>
-          <w:rFonts w:ascii="Arial" w:hAnsi="Arial" w:cs="Arial"/>
-          <w:sz w:val="18"/>
-          <w:szCs w:val="18"/>
-        </w:rPr>
-        <w:t>}}</w:t>
-      </w:r>
-      <w:r>
-        <w:rPr>
-          <w:rFonts w:ascii="Arial" w:hAnsi="Arial" w:cs="Arial"/>
+          <w:rFonts w:ascii="Arial" w:hAnsi="Arial"/>
+          <w:sz w:val="18"/>
+          <w:szCs w:val="18"/>
+        </w:rPr>
+        <w:t xml:space="preserve">(amos) todos mis (nuestros) bienes (adquiridos y por adquirir), en la mejor forma de derecho y cualquier garantía prendaria; hipotecaria, valores y/o haberes que puedan existir a favor de </w:t>
+      </w:r>
+      <w:r>
+        <w:rPr>
+          <w:rFonts w:ascii="Arial" w:hAnsi="Arial"/>
+          <w:sz w:val="18"/>
+          <w:szCs w:val="18"/>
+        </w:rPr>
+        <w:t>“</w:t>
+      </w:r>
+      <w:r>
+        <w:rPr>
+          <w:rFonts w:ascii="Arial" w:hAnsi="Arial"/>
+          <w:b/>
+          <w:sz w:val="18"/>
+          <w:szCs w:val="18"/>
+        </w:rPr>
+        <w:t>{{PROYECTO_RAZON_SOCIAL}}”</w:t>
+      </w:r>
+      <w:r>
+        <w:rPr>
+          <w:rFonts w:ascii="Arial" w:hAnsi="Arial"/>
+          <w:sz w:val="18"/>
+          <w:szCs w:val="18"/>
+        </w:rPr>
+        <w:t>.</w:t>
+      </w:r>
+      <w:r>
+        <w:rPr>
+          <w:rFonts w:ascii="Arial" w:hAnsi="Arial"/>
           <w:sz w:val="18"/>
           <w:szCs w:val="18"/>
         </w:rPr>
@@ -975,23 +1678,31 @@
       </w:r>
       <w:r>
         <w:rPr>
-          <w:rFonts w:ascii="Arial" w:hAnsi="Arial" w:cs="Arial"/>
-          <w:sz w:val="18"/>
-          <w:szCs w:val="18"/>
-        </w:rPr>
-        <w:t>por</w:t>
-      </w:r>
-      <w:r>
-        <w:rPr>
-          <w:rFonts w:ascii="Arial" w:hAnsi="Arial" w:cs="Arial"/>
-          <w:sz w:val="18"/>
-          <w:szCs w:val="18"/>
-        </w:rPr>
-        <w:t xml:space="preserve"> el</w:t>
-      </w:r>
-      <w:r>
-        <w:rPr>
-          <w:rFonts w:ascii="Arial" w:hAnsi="Arial" w:cs="Arial"/>
+          <w:rFonts w:ascii="Arial" w:hAnsi="Arial"/>
+          <w:sz w:val="18"/>
+          <w:szCs w:val="18"/>
+        </w:rPr>
+        <w:t>Esté pagaré tiene naturaleza mercantil y se sujeta a las disposiciones de la Ley de Títulos Valores, Ley de Bancos</w:t>
+      </w:r>
+      <w:r>
+        <w:rPr>
+          <w:rFonts w:ascii="Arial" w:hAnsi="Arial"/>
+          <w:sz w:val="18"/>
+          <w:szCs w:val="18"/>
+        </w:rPr>
+        <w:t xml:space="preserve"> y</w:t>
+      </w:r>
+      <w:r>
+        <w:rPr>
+          <w:rFonts w:ascii="Arial" w:hAnsi="Arial"/>
+          <w:sz w:val="18"/>
+          <w:szCs w:val="18"/>
+        </w:rPr>
+        <w:t xml:space="preserve"> al proceso señalado en el Código Procesal Civil.</w:t>
+      </w:r>
+      <w:r>
+        <w:rPr>
+          <w:rFonts w:ascii="Arial" w:hAnsi="Arial"/>
           <w:sz w:val="18"/>
           <w:szCs w:val="18"/>
         </w:rPr>
@@ -999,111 +1710,27 @@
       </w:r>
       <w:r>
         <w:rPr>
-          <w:rFonts w:ascii="Arial" w:hAnsi="Arial" w:cs="Arial"/>
-          <w:b/>
-          <w:bCs/>
-          <w:sz w:val="18"/>
-          <w:szCs w:val="18"/>
-        </w:rPr>
-        <w:t>{{</w:t>
-      </w:r>
-      <w:r>
-        <w:rPr>
-          <w:rFonts w:ascii="Arial" w:hAnsi="Arial" w:cs="Arial"/>
-          <w:b/>
-          <w:bCs/>
-          <w:sz w:val="18"/>
-          <w:szCs w:val="18"/>
-        </w:rPr>
-        <w:t>PARTIDA</w:t>
-      </w:r>
-      <w:r>
-        <w:rPr>
-          <w:rFonts w:ascii="Arial" w:hAnsi="Arial" w:cs="Arial"/>
-          <w:b/>
-          <w:bCs/>
-          <w:sz w:val="18"/>
-          <w:szCs w:val="18"/>
-        </w:rPr>
-        <w:t>}}</w:t>
-      </w:r>
-      <w:r>
-        <w:rPr>
-          <w:rFonts w:ascii="Arial" w:hAnsi="Arial" w:cs="Arial"/>
-          <w:b/>
-          <w:bCs/>
-          <w:sz w:val="18"/>
-          <w:szCs w:val="18"/>
-          <w:lang w:val="es-ES_tradnl"/>
-        </w:rPr>
-        <w:t>,</w:t>
-      </w:r>
-      <w:r>
-        <w:rPr>
-          <w:rFonts w:ascii="Arial" w:hAnsi="Arial" w:cs="Arial"/>
-          <w:b/>
-          <w:bCs/>
-          <w:sz w:val="18"/>
-          <w:szCs w:val="18"/>
-          <w:lang w:val="es-ES_tradnl"/>
-        </w:rPr>
-        <w:t xml:space="preserve"> </w:t>
-      </w:r>
-      <w:r>
-        <w:rPr>
-          <w:rFonts w:ascii="Arial" w:hAnsi="Arial" w:cs="Arial"/>
-          <w:sz w:val="18"/>
-          <w:szCs w:val="18"/>
-        </w:rPr>
-        <w:t xml:space="preserve">de la obra “Edificio Multifamiliar </w:t>
-      </w:r>
-      <w:r>
-        <w:rPr>
-          <w:rFonts w:ascii="Arial" w:hAnsi="Arial" w:cs="Arial"/>
-          <w:sz w:val="18"/>
-          <w:szCs w:val="18"/>
-        </w:rPr>
-        <w:t>{{</w:t>
-      </w:r>
-      <w:r>
-        <w:rPr>
-          <w:rFonts w:ascii="Arial" w:hAnsi="Arial" w:cs="Arial"/>
-          <w:sz w:val="18"/>
-          <w:szCs w:val="18"/>
-        </w:rPr>
-        <w:t>PROYECTO_NOMBRE</w:t>
-      </w:r>
-      <w:r>
-        <w:rPr>
-          <w:rFonts w:ascii="Arial" w:hAnsi="Arial" w:cs="Arial"/>
-          <w:sz w:val="18"/>
-          <w:szCs w:val="18"/>
-        </w:rPr>
-        <w:t>}}</w:t>
-      </w:r>
-      <w:r>
-        <w:rPr>
-          <w:rFonts w:ascii="Arial" w:hAnsi="Arial" w:cs="Arial"/>
-          <w:sz w:val="18"/>
-          <w:szCs w:val="18"/>
-        </w:rPr>
-        <w:t>”</w:t>
-      </w:r>
-      <w:r>
-        <w:rPr>
-          <w:rFonts w:ascii="Arial" w:hAnsi="Arial" w:cs="Arial"/>
-          <w:sz w:val="18"/>
-          <w:szCs w:val="18"/>
-        </w:rPr>
-        <w:t>.</w:t>
-      </w:r>
-      <w:r>
-        <w:rPr>
-          <w:rFonts w:ascii="Arial" w:hAnsi="Arial" w:cs="Arial"/>
-          <w:sz w:val="18"/>
-          <w:szCs w:val="18"/>
-        </w:rPr>
-        <w:t xml:space="preserve"> </w:t>
+          <w:rFonts w:ascii="Arial" w:hAnsi="Arial"/>
+          <w:sz w:val="18"/>
+          <w:szCs w:val="18"/>
+        </w:rPr>
+        <w:t xml:space="preserve">Declaro(amos) tener capacidad y estar plenamente facultado (s) para suscribir y emitir el presente Pagaré, asumiendo en caso contrario la responsabilidad </w:t>
+      </w:r>
+      <w:r>
+        <w:rPr>
+          <w:rFonts w:ascii="Arial" w:hAnsi="Arial"/>
+          <w:sz w:val="18"/>
+          <w:szCs w:val="18"/>
+        </w:rPr>
+        <w:t xml:space="preserve">civil y/o </w:t>
+      </w:r>
+      <w:r>
+        <w:rPr>
+          <w:rFonts w:ascii="Arial" w:hAnsi="Arial"/>
+          <w:sz w:val="18"/>
+          <w:szCs w:val="18"/>
+        </w:rPr>
+        <w:t>penal a que hubiera lugar.</w:t>
       </w:r>
     </w:p>
     <w:p>
@@ -1111,8 +1738,10 @@
         <w:jc w:val="both"/>
         <w:rPr>
           <w:rFonts w:ascii="Arial" w:hAnsi="Arial"/>
-          <w:sz w:val="18"/>
-          <w:szCs w:val="18"/>
+          <w:b/>
+          <w:i/>
+          <w:sz w:val="20"/>
+          <w:szCs w:val="20"/>
         </w:rPr>
       </w:pPr>
     </w:p>
@@ -1121,766 +1750,22 @@
         <w:jc w:val="both"/>
         <w:rPr>
           <w:rFonts w:ascii="Arial" w:hAnsi="Arial"/>
-          <w:sz w:val="18"/>
-          <w:szCs w:val="18"/>
-        </w:rPr>
-      </w:pPr>
-      <w:r>
-        <w:rPr>
-          <w:rFonts w:ascii="Arial" w:hAnsi="Arial"/>
-          <w:sz w:val="18"/>
-          <w:szCs w:val="18"/>
-        </w:rPr>
-        <w:t xml:space="preserve">Desde su fecha de vencimiento y hasta su total cancelación, el importe de este pagaré devengará una tasa de interés compensatorio mensual de </w:t>
-      </w:r>
-      <w:r>
-        <w:rPr>
-          <w:rFonts w:ascii="Arial" w:hAnsi="Arial"/>
-          <w:sz w:val="18"/>
-          <w:szCs w:val="18"/>
-        </w:rPr>
-        <w:t>2</w:t>
-      </w:r>
-      <w:r>
-        <w:rPr>
-          <w:rFonts w:ascii="Arial" w:hAnsi="Arial"/>
-          <w:sz w:val="18"/>
-          <w:szCs w:val="18"/>
-        </w:rPr>
-        <w:t xml:space="preserve">% y en caso de incumplimiento en el pago generará un interés moratorio mensual de </w:t>
-      </w:r>
-      <w:r>
-        <w:rPr>
-          <w:rFonts w:ascii="Arial" w:hAnsi="Arial"/>
-          <w:sz w:val="18"/>
-          <w:szCs w:val="18"/>
-        </w:rPr>
-        <w:t>1.5</w:t>
-      </w:r>
-      <w:r>
-        <w:rPr>
-          <w:rFonts w:ascii="Arial" w:hAnsi="Arial"/>
-          <w:sz w:val="18"/>
-          <w:szCs w:val="18"/>
-        </w:rPr>
-        <w:t>%.</w:t>
-      </w:r>
-    </w:p>
-    <w:p>
-      <w:pPr>
-        <w:jc w:val="both"/>
-        <w:rPr>
-          <w:rFonts w:ascii="Arial" w:hAnsi="Arial"/>
-          <w:sz w:val="18"/>
-          <w:szCs w:val="18"/>
-        </w:rPr>
-      </w:pPr>
-    </w:p>
-    <w:p>
-      <w:pPr>
-        <w:jc w:val="both"/>
-        <w:rPr>
-          <w:rFonts w:ascii="Arial" w:hAnsi="Arial"/>
-          <w:sz w:val="18"/>
-          <w:szCs w:val="18"/>
-        </w:rPr>
-      </w:pPr>
-      <w:r>
-        <w:rPr>
-          <w:rFonts w:ascii="Arial" w:hAnsi="Arial"/>
-          <w:sz w:val="18"/>
-          <w:szCs w:val="18"/>
-        </w:rPr>
-        <w:t xml:space="preserve">La constitución en mora será automática. </w:t>
-      </w:r>
-      <w:r>
-        <w:rPr>
-          <w:rFonts w:ascii="Arial" w:hAnsi="Arial"/>
-          <w:sz w:val="18"/>
-          <w:szCs w:val="18"/>
-        </w:rPr>
-        <w:t>Asimismo,</w:t>
-      </w:r>
-      <w:r>
-        <w:rPr>
-          <w:rFonts w:ascii="Arial" w:hAnsi="Arial"/>
-          <w:sz w:val="18"/>
-          <w:szCs w:val="18"/>
-        </w:rPr>
-        <w:t xml:space="preserve"> hasta la fecha de su total cancelación abonaré(</w:t>
-      </w:r>
-      <w:proofErr w:type="spellStart"/>
-      <w:r>
-        <w:rPr>
-          <w:rFonts w:ascii="Arial" w:hAnsi="Arial"/>
-          <w:sz w:val="18"/>
-          <w:szCs w:val="18"/>
-        </w:rPr>
-        <w:t>mos</w:t>
-      </w:r>
-      <w:proofErr w:type="spellEnd"/>
-      <w:r>
-        <w:rPr>
-          <w:rFonts w:ascii="Arial" w:hAnsi="Arial"/>
-          <w:sz w:val="18"/>
-          <w:szCs w:val="18"/>
-        </w:rPr>
-        <w:t>) además los gastos extrajudiciales y/o judiciales que se originen</w:t>
-      </w:r>
-      <w:r>
-        <w:rPr>
-          <w:rFonts w:ascii="Arial" w:hAnsi="Arial"/>
-          <w:sz w:val="18"/>
-          <w:szCs w:val="18"/>
-        </w:rPr>
-        <w:t>, inclusive tributos, gastos de cobranza y demás</w:t>
-      </w:r>
-      <w:r>
-        <w:rPr>
-          <w:rFonts w:ascii="Arial" w:hAnsi="Arial"/>
-          <w:sz w:val="18"/>
-          <w:szCs w:val="18"/>
-        </w:rPr>
-        <w:t>.</w:t>
-      </w:r>
-    </w:p>
-    <w:p>
-      <w:pPr>
-        <w:jc w:val="both"/>
-        <w:rPr>
-          <w:rFonts w:ascii="Arial" w:hAnsi="Arial"/>
-          <w:sz w:val="18"/>
-          <w:szCs w:val="18"/>
-        </w:rPr>
-      </w:pPr>
-    </w:p>
-    <w:p>
-      <w:pPr>
-        <w:jc w:val="both"/>
-        <w:rPr>
-          <w:rFonts w:ascii="Arial" w:hAnsi="Arial"/>
-          <w:sz w:val="18"/>
-          <w:szCs w:val="18"/>
-        </w:rPr>
-      </w:pPr>
-      <w:r>
-        <w:rPr>
-          <w:rFonts w:ascii="Arial" w:hAnsi="Arial"/>
-          <w:sz w:val="18"/>
-          <w:szCs w:val="18"/>
-        </w:rPr>
-        <w:t>Esté pagaré será pagado en la misma moneda que expresa este Título Valor.</w:t>
-      </w:r>
-      <w:r>
-        <w:rPr>
-          <w:rFonts w:ascii="Arial" w:hAnsi="Arial"/>
-          <w:sz w:val="18"/>
-          <w:szCs w:val="18"/>
-        </w:rPr>
-        <w:t xml:space="preserve"> </w:t>
-      </w:r>
-      <w:r>
-        <w:rPr>
-          <w:rFonts w:ascii="Arial" w:hAnsi="Arial"/>
-          <w:sz w:val="18"/>
-          <w:szCs w:val="18"/>
-        </w:rPr>
-        <w:t>Las tasas de interés moratorio y demás gastos, podrán ser reajustados</w:t>
-      </w:r>
-      <w:r>
-        <w:rPr>
-          <w:rFonts w:ascii="Arial" w:hAnsi="Arial"/>
-          <w:sz w:val="18"/>
-          <w:szCs w:val="18"/>
-        </w:rPr>
-        <w:t xml:space="preserve"> y/o variados</w:t>
-      </w:r>
-      <w:r>
-        <w:rPr>
-          <w:rFonts w:ascii="Arial" w:hAnsi="Arial"/>
-          <w:sz w:val="18"/>
-          <w:szCs w:val="18"/>
-        </w:rPr>
-        <w:t xml:space="preserve"> por </w:t>
-      </w:r>
-      <w:r>
-        <w:rPr>
-          <w:rFonts w:ascii="Arial" w:hAnsi="Arial"/>
-          <w:sz w:val="18"/>
-          <w:szCs w:val="18"/>
-        </w:rPr>
-        <w:t>“</w:t>
-      </w:r>
-      <w:r>
-        <w:rPr>
-          <w:rFonts w:ascii="Arial" w:hAnsi="Arial"/>
-          <w:b/>
-          <w:sz w:val="18"/>
-          <w:szCs w:val="18"/>
-        </w:rPr>
-        <w:t>{{</w:t>
-      </w:r>
-      <w:r>
-        <w:rPr>
-          <w:rFonts w:ascii="Arial" w:hAnsi="Arial"/>
-          <w:b/>
-          <w:sz w:val="18"/>
-          <w:szCs w:val="18"/>
-        </w:rPr>
-        <w:t>PROYECTO_RAZON_SOCIAL</w:t>
-      </w:r>
-      <w:r>
-        <w:rPr>
-          <w:rFonts w:ascii="Arial" w:hAnsi="Arial"/>
-          <w:b/>
-          <w:sz w:val="18"/>
-          <w:szCs w:val="18"/>
-        </w:rPr>
-        <w:t>}}</w:t>
-      </w:r>
-      <w:r>
-        <w:rPr>
-          <w:rFonts w:ascii="Arial" w:hAnsi="Arial"/>
-          <w:b/>
-          <w:sz w:val="18"/>
-          <w:szCs w:val="18"/>
-        </w:rPr>
-        <w:t>”</w:t>
-      </w:r>
-      <w:r>
-        <w:rPr>
-          <w:rFonts w:ascii="Arial" w:hAnsi="Arial"/>
-          <w:sz w:val="18"/>
-          <w:szCs w:val="18"/>
-        </w:rPr>
-        <w:t xml:space="preserve"> dentro de los límites establecidos por el Banco Central de Reserva del Perú con la debida y oportuna comunicación prevista legalmente, aceptando de manera expresa estas modificaciones.</w:t>
-      </w:r>
-    </w:p>
-    <w:p>
-      <w:pPr>
-        <w:jc w:val="both"/>
-        <w:rPr>
-          <w:rFonts w:ascii="Arial" w:hAnsi="Arial"/>
-          <w:sz w:val="18"/>
-          <w:szCs w:val="18"/>
-        </w:rPr>
-      </w:pPr>
-    </w:p>
-    <w:p>
-      <w:pPr>
-        <w:jc w:val="both"/>
-        <w:rPr>
-          <w:rFonts w:ascii="Arial" w:hAnsi="Arial"/>
-          <w:sz w:val="18"/>
-          <w:szCs w:val="18"/>
-        </w:rPr>
-      </w:pPr>
-      <w:r>
-        <w:rPr>
-          <w:rFonts w:ascii="Arial" w:hAnsi="Arial"/>
-          <w:sz w:val="18"/>
-          <w:szCs w:val="18"/>
-        </w:rPr>
-        <w:t xml:space="preserve">Este pagaré no requerirá protesto para su ejecución. Sin embargo, </w:t>
-      </w:r>
-      <w:r>
-        <w:rPr>
-          <w:rFonts w:ascii="Arial" w:hAnsi="Arial"/>
-          <w:sz w:val="18"/>
-          <w:szCs w:val="18"/>
-        </w:rPr>
-        <w:t>“</w:t>
-      </w:r>
-      <w:r>
-        <w:rPr>
-          <w:rFonts w:ascii="Arial" w:hAnsi="Arial"/>
-          <w:b/>
-          <w:sz w:val="18"/>
-          <w:szCs w:val="18"/>
-        </w:rPr>
-        <w:t>{{PROYECTO_RAZON_SOCIAL}}</w:t>
-      </w:r>
-      <w:r>
-        <w:rPr>
-          <w:rFonts w:ascii="Arial" w:hAnsi="Arial"/>
-          <w:b/>
-          <w:sz w:val="18"/>
-          <w:szCs w:val="18"/>
-        </w:rPr>
-        <w:t>”</w:t>
-      </w:r>
-      <w:r>
-        <w:rPr>
-          <w:rFonts w:ascii="Arial" w:hAnsi="Arial"/>
-          <w:b/>
-          <w:sz w:val="18"/>
-          <w:szCs w:val="18"/>
-        </w:rPr>
-        <w:t xml:space="preserve"> </w:t>
-      </w:r>
-      <w:r>
-        <w:rPr>
-          <w:rFonts w:ascii="Arial" w:hAnsi="Arial"/>
-          <w:sz w:val="18"/>
-          <w:szCs w:val="18"/>
-        </w:rPr>
-        <w:t>podrá</w:t>
-      </w:r>
-      <w:r>
-        <w:rPr>
-          <w:rFonts w:ascii="Arial" w:hAnsi="Arial"/>
-          <w:sz w:val="18"/>
-          <w:szCs w:val="18"/>
-        </w:rPr>
-        <w:t xml:space="preserve"> protestarlo, en cuyo caso asumiré(</w:t>
-      </w:r>
-      <w:proofErr w:type="spellStart"/>
-      <w:r>
-        <w:rPr>
-          <w:rFonts w:ascii="Arial" w:hAnsi="Arial"/>
-          <w:sz w:val="18"/>
-          <w:szCs w:val="18"/>
-        </w:rPr>
-        <w:t>mos</w:t>
-      </w:r>
-      <w:proofErr w:type="spellEnd"/>
-      <w:r>
-        <w:rPr>
-          <w:rFonts w:ascii="Arial" w:hAnsi="Arial"/>
-          <w:sz w:val="18"/>
-          <w:szCs w:val="18"/>
-        </w:rPr>
-        <w:t>) los gastos de dicha diligencia.</w:t>
-      </w:r>
-      <w:r>
-        <w:rPr>
-          <w:rFonts w:ascii="Arial" w:hAnsi="Arial"/>
-          <w:sz w:val="18"/>
-          <w:szCs w:val="18"/>
-        </w:rPr>
-        <w:t xml:space="preserve"> </w:t>
-      </w:r>
-      <w:r>
-        <w:rPr>
-          <w:rFonts w:ascii="Arial" w:hAnsi="Arial"/>
-          <w:sz w:val="18"/>
-          <w:szCs w:val="18"/>
-        </w:rPr>
-        <w:t xml:space="preserve">Acepto(amos) la(s) prórroga(s) total(es) o parcial(es) que se anoten en este documento </w:t>
-      </w:r>
-      <w:r>
-        <w:rPr>
-          <w:rFonts w:ascii="Arial" w:hAnsi="Arial"/>
-          <w:sz w:val="18"/>
-          <w:szCs w:val="18"/>
-        </w:rPr>
-        <w:t>aun</w:t>
-      </w:r>
-      <w:r>
-        <w:rPr>
-          <w:rFonts w:ascii="Arial" w:hAnsi="Arial"/>
-          <w:sz w:val="18"/>
-          <w:szCs w:val="18"/>
-        </w:rPr>
-        <w:t xml:space="preserve"> cuando no estén suscritas por mi (nosotros)</w:t>
-      </w:r>
-      <w:r>
-        <w:rPr>
-          <w:rFonts w:ascii="Arial" w:hAnsi="Arial"/>
-          <w:sz w:val="18"/>
-          <w:szCs w:val="18"/>
-        </w:rPr>
-        <w:t>. Este pagaré podrá ser libremente transferido y negociado</w:t>
-      </w:r>
-      <w:r>
-        <w:rPr>
-          <w:rFonts w:ascii="Arial" w:hAnsi="Arial"/>
-          <w:sz w:val="18"/>
-          <w:szCs w:val="18"/>
-        </w:rPr>
-        <w:t xml:space="preserve"> </w:t>
-      </w:r>
-      <w:r>
-        <w:rPr>
-          <w:rFonts w:ascii="Arial" w:hAnsi="Arial"/>
-          <w:sz w:val="18"/>
-          <w:szCs w:val="18"/>
-        </w:rPr>
-        <w:t>por el tenedor.</w:t>
-      </w:r>
-    </w:p>
-    <w:p>
-      <w:pPr>
-        <w:jc w:val="both"/>
-        <w:rPr>
-          <w:rFonts w:ascii="Arial" w:hAnsi="Arial"/>
-          <w:sz w:val="18"/>
-          <w:szCs w:val="18"/>
-        </w:rPr>
-      </w:pPr>
-    </w:p>
-    <w:p>
-      <w:pPr>
-        <w:jc w:val="both"/>
-        <w:rPr>
-          <w:rFonts w:ascii="Arial" w:hAnsi="Arial"/>
-          <w:sz w:val="18"/>
-          <w:szCs w:val="18"/>
-        </w:rPr>
-      </w:pPr>
-      <w:r>
-        <w:rPr>
-          <w:rFonts w:ascii="Arial" w:hAnsi="Arial"/>
-          <w:sz w:val="18"/>
-          <w:szCs w:val="18"/>
-        </w:rPr>
-        <w:t>Este pagaré, así como sus prórrogas, no constituirán renovación de la obligación contenida en el contrato de la referencia;</w:t>
-      </w:r>
-      <w:r>
-        <w:rPr>
-          <w:rFonts w:ascii="Arial" w:hAnsi="Arial"/>
-          <w:sz w:val="18"/>
-          <w:szCs w:val="18"/>
-        </w:rPr>
-        <w:t xml:space="preserve"> </w:t>
-      </w:r>
-      <w:r>
-        <w:rPr>
-          <w:rFonts w:ascii="Arial" w:hAnsi="Arial"/>
-          <w:sz w:val="18"/>
-          <w:szCs w:val="18"/>
-        </w:rPr>
-        <w:t xml:space="preserve">su emisión, prórroga o renovación no extinguirá en ningún caso la obligación principal o primitiva, aun cuando se perjudique por cualquier causa. </w:t>
-      </w:r>
-    </w:p>
-    <w:p>
-      <w:pPr>
-        <w:jc w:val="both"/>
-        <w:rPr>
-          <w:rFonts w:ascii="Arial" w:hAnsi="Arial"/>
-          <w:sz w:val="18"/>
-          <w:szCs w:val="18"/>
-        </w:rPr>
-      </w:pPr>
-    </w:p>
-    <w:p>
-      <w:pPr>
-        <w:jc w:val="both"/>
-        <w:rPr>
-          <w:rFonts w:ascii="Arial" w:hAnsi="Arial"/>
-          <w:sz w:val="18"/>
-          <w:szCs w:val="18"/>
-        </w:rPr>
-      </w:pPr>
-      <w:r>
-        <w:rPr>
-          <w:rFonts w:ascii="Arial" w:hAnsi="Arial"/>
-          <w:sz w:val="18"/>
-          <w:szCs w:val="18"/>
-        </w:rPr>
-        <w:t xml:space="preserve">Me (nos) someto (emos) expresamente al proceso judicial que </w:t>
-      </w:r>
-      <w:r>
-        <w:rPr>
-          <w:rFonts w:ascii="Arial" w:hAnsi="Arial"/>
-          <w:sz w:val="18"/>
-          <w:szCs w:val="18"/>
-        </w:rPr>
-        <w:t>“</w:t>
-      </w:r>
-      <w:r>
-        <w:rPr>
-          <w:rFonts w:ascii="Arial" w:hAnsi="Arial"/>
-          <w:b/>
-          <w:sz w:val="18"/>
-          <w:szCs w:val="18"/>
-        </w:rPr>
-        <w:t>{{PROYECTO_RAZON_SOCIAL}}”</w:t>
-      </w:r>
-      <w:r>
-        <w:rPr>
-          <w:rFonts w:ascii="Arial" w:hAnsi="Arial"/>
-          <w:sz w:val="18"/>
-          <w:szCs w:val="18"/>
-        </w:rPr>
-        <w:t xml:space="preserve"> u otro tenedor pueda ejercitar conforme a la Ley de Títulos Valores y/o Código Procesal Civil, así como a la competencia de los jueces y tribunales del Distrito Judicial de Lima Cercado, señalando como domicilio, para este efecto, el que aparece al final de este documento donde se efectuarán válidamente las diligencias notariales, judiciales y demás que fuesen necesarias.</w:t>
-      </w:r>
-    </w:p>
-    <w:p>
-      <w:pPr>
-        <w:jc w:val="both"/>
-        <w:rPr>
-          <w:rFonts w:ascii="Arial" w:hAnsi="Arial"/>
-          <w:sz w:val="18"/>
-          <w:szCs w:val="18"/>
-        </w:rPr>
-      </w:pPr>
-    </w:p>
-    <w:p>
-      <w:pPr>
-        <w:jc w:val="both"/>
-        <w:rPr>
-          <w:rFonts w:ascii="Arial" w:hAnsi="Arial"/>
-          <w:sz w:val="18"/>
-          <w:szCs w:val="18"/>
-        </w:rPr>
-      </w:pPr>
-      <w:r>
-        <w:rPr>
-          <w:rFonts w:ascii="Arial" w:hAnsi="Arial"/>
-          <w:sz w:val="18"/>
-          <w:szCs w:val="18"/>
-        </w:rPr>
-        <w:t>Convengo(</w:t>
-      </w:r>
-      <w:proofErr w:type="spellStart"/>
-      <w:r>
-        <w:rPr>
-          <w:rFonts w:ascii="Arial" w:hAnsi="Arial"/>
-          <w:sz w:val="18"/>
-          <w:szCs w:val="18"/>
-        </w:rPr>
-        <w:t>imos</w:t>
-      </w:r>
-      <w:proofErr w:type="spellEnd"/>
-      <w:r>
-        <w:rPr>
-          <w:rFonts w:ascii="Arial" w:hAnsi="Arial"/>
-          <w:sz w:val="18"/>
-          <w:szCs w:val="18"/>
-        </w:rPr>
-        <w:t xml:space="preserve">) por este acto, en subrogarme (nos) de inmediato y obligatoriamente en los derechos crediticios de </w:t>
-      </w:r>
-      <w:r>
-        <w:rPr>
-          <w:rFonts w:ascii="Arial" w:hAnsi="Arial"/>
-          <w:sz w:val="18"/>
-          <w:szCs w:val="18"/>
-        </w:rPr>
-        <w:t>“</w:t>
-      </w:r>
-      <w:r>
-        <w:rPr>
-          <w:rFonts w:ascii="Arial" w:hAnsi="Arial"/>
-          <w:b/>
-          <w:sz w:val="18"/>
-          <w:szCs w:val="18"/>
-        </w:rPr>
-        <w:t>{{PROYECTO_RAZON_SOCIAL}}”</w:t>
-      </w:r>
-      <w:r>
-        <w:rPr>
-          <w:rFonts w:ascii="Arial" w:hAnsi="Arial"/>
-          <w:sz w:val="18"/>
-          <w:szCs w:val="18"/>
-        </w:rPr>
-        <w:t>, aun antes del vencimiento del presente Pagaré, si solicitase o fuese(</w:t>
-      </w:r>
-      <w:proofErr w:type="spellStart"/>
-      <w:r>
-        <w:rPr>
-          <w:rFonts w:ascii="Arial" w:hAnsi="Arial"/>
-          <w:sz w:val="18"/>
-          <w:szCs w:val="18"/>
-        </w:rPr>
-        <w:t>mos</w:t>
-      </w:r>
-      <w:proofErr w:type="spellEnd"/>
-      <w:r>
-        <w:rPr>
-          <w:rFonts w:ascii="Arial" w:hAnsi="Arial"/>
-          <w:sz w:val="18"/>
-          <w:szCs w:val="18"/>
-        </w:rPr>
-        <w:t>) declarado(s) insolvente(s) por la respectiva Comisión de Procedimientos Concursales, o se sometiese por acto propio o de terceros a cualquier proceso de saneamiento, concursal, reestructuración patrimonial, o programas de refinanciación similares o análogos.</w:t>
-      </w:r>
-    </w:p>
-    <w:p>
-      <w:pPr>
-        <w:jc w:val="both"/>
-        <w:rPr>
-          <w:rFonts w:ascii="Arial" w:hAnsi="Arial"/>
-          <w:sz w:val="18"/>
-          <w:szCs w:val="18"/>
-        </w:rPr>
-      </w:pPr>
-    </w:p>
-    <w:p>
-      <w:pPr>
-        <w:jc w:val="both"/>
-        <w:rPr>
-          <w:rFonts w:ascii="Arial" w:hAnsi="Arial"/>
-          <w:sz w:val="18"/>
-          <w:szCs w:val="18"/>
-        </w:rPr>
-      </w:pPr>
-      <w:r>
-        <w:rPr>
-          <w:rFonts w:ascii="Arial" w:hAnsi="Arial"/>
-          <w:sz w:val="18"/>
-          <w:szCs w:val="18"/>
-        </w:rPr>
-        <w:t>Asimismo, obligo</w:t>
-      </w:r>
-      <w:r>
-        <w:rPr>
-          <w:rFonts w:ascii="Arial" w:hAnsi="Arial"/>
-          <w:sz w:val="18"/>
-          <w:szCs w:val="18"/>
-        </w:rPr>
-        <w:t xml:space="preserve"> </w:t>
-      </w:r>
-      <w:r>
-        <w:rPr>
-          <w:rFonts w:ascii="Arial" w:hAnsi="Arial"/>
-          <w:sz w:val="18"/>
-          <w:szCs w:val="18"/>
-        </w:rPr>
-        <w:t xml:space="preserve">(amos) todos mis (nuestros) bienes (adquiridos y por adquirir), en la mejor forma de derecho y cualquier garantía prendaria; hipotecaria, valores y/o haberes que puedan existir a favor de </w:t>
-      </w:r>
-      <w:r>
-        <w:rPr>
-          <w:rFonts w:ascii="Arial" w:hAnsi="Arial"/>
-          <w:sz w:val="18"/>
-          <w:szCs w:val="18"/>
-        </w:rPr>
-        <w:t>“</w:t>
-      </w:r>
-      <w:r>
-        <w:rPr>
-          <w:rFonts w:ascii="Arial" w:hAnsi="Arial"/>
-          <w:b/>
-          <w:sz w:val="18"/>
-          <w:szCs w:val="18"/>
-        </w:rPr>
-        <w:t>{{PROYECTO_RAZON_SOCIAL}}”</w:t>
-      </w:r>
-      <w:r>
-        <w:rPr>
-          <w:rFonts w:ascii="Arial" w:hAnsi="Arial"/>
-          <w:sz w:val="18"/>
-          <w:szCs w:val="18"/>
-        </w:rPr>
-        <w:t>.</w:t>
-      </w:r>
-      <w:r>
-        <w:rPr>
-          <w:rFonts w:ascii="Arial" w:hAnsi="Arial"/>
-          <w:sz w:val="18"/>
-          <w:szCs w:val="18"/>
-        </w:rPr>
-        <w:t xml:space="preserve"> </w:t>
-      </w:r>
-      <w:r>
-        <w:rPr>
-          <w:rFonts w:ascii="Arial" w:hAnsi="Arial"/>
-          <w:sz w:val="18"/>
-          <w:szCs w:val="18"/>
-        </w:rPr>
-        <w:t>Esté pagaré tiene naturaleza mercantil y se sujeta a las disposiciones de la Ley de Títulos Valores, Ley de Bancos</w:t>
-      </w:r>
-      <w:r>
-        <w:rPr>
-          <w:rFonts w:ascii="Arial" w:hAnsi="Arial"/>
-          <w:sz w:val="18"/>
-          <w:szCs w:val="18"/>
-        </w:rPr>
-        <w:t xml:space="preserve"> y</w:t>
-      </w:r>
-      <w:r>
-        <w:rPr>
-          <w:rFonts w:ascii="Arial" w:hAnsi="Arial"/>
-          <w:sz w:val="18"/>
-          <w:szCs w:val="18"/>
-        </w:rPr>
-        <w:t xml:space="preserve"> al proceso señalado en el Código Procesal Civil.</w:t>
-      </w:r>
-      <w:r>
-        <w:rPr>
-          <w:rFonts w:ascii="Arial" w:hAnsi="Arial"/>
-          <w:sz w:val="18"/>
-          <w:szCs w:val="18"/>
-        </w:rPr>
-        <w:t xml:space="preserve"> </w:t>
-      </w:r>
-      <w:r>
-        <w:rPr>
-          <w:rFonts w:ascii="Arial" w:hAnsi="Arial"/>
-          <w:sz w:val="18"/>
-          <w:szCs w:val="18"/>
-        </w:rPr>
-        <w:t xml:space="preserve">Declaro(amos) tener capacidad y estar plenamente facultado (s) para suscribir y emitir el presente Pagaré, asumiendo en caso contrario la responsabilidad </w:t>
-      </w:r>
-      <w:r>
-        <w:rPr>
-          <w:rFonts w:ascii="Arial" w:hAnsi="Arial"/>
-          <w:sz w:val="18"/>
-          <w:szCs w:val="18"/>
-        </w:rPr>
-        <w:t xml:space="preserve">civil y/o </w:t>
-      </w:r>
-      <w:r>
-        <w:rPr>
-          <w:rFonts w:ascii="Arial" w:hAnsi="Arial"/>
-          <w:sz w:val="18"/>
-          <w:szCs w:val="18"/>
-        </w:rPr>
-        <w:t>penal a que hubiera lugar.</w:t>
-      </w:r>
-    </w:p>
-    <w:p>
-      <w:pPr>
-        <w:jc w:val="both"/>
-        <w:rPr>
-          <w:rFonts w:ascii="Arial" w:hAnsi="Arial"/>
           <w:b/>
           <w:i/>
           <w:sz w:val="20"/>
           <w:szCs w:val="20"/>
-        </w:rPr>
-      </w:pPr>
-    </w:p>
-    <w:p>
-      <w:pPr>
-        <w:jc w:val="both"/>
+          <w:lang w:val="es-PE"/>
+        </w:rPr>
+      </w:pPr>
+      <w:r>
         <w:rPr>
           <w:rFonts w:ascii="Arial" w:hAnsi="Arial"/>
           <w:b/>
           <w:i/>
           <w:sz w:val="20"/>
           <w:szCs w:val="20"/>
-          <w:lang w:val="es-PE"/>
-        </w:rPr>
-      </w:pPr>
-      <w:r>
-        <w:rPr>
-          <w:rFonts w:ascii="Arial" w:hAnsi="Arial"/>
-          <w:b/>
-          <w:i/>
-          <w:sz w:val="20"/>
-          <w:szCs w:val="20"/>
-        </w:rPr>
-        <w:t>{{</w:t>
-      </w:r>
-      <w:r>
-        <w:rPr>
-          <w:rFonts w:ascii="Arial" w:hAnsi="Arial"/>
-          <w:b/>
-          <w:i/>
-          <w:sz w:val="20"/>
-          <w:szCs w:val="20"/>
-        </w:rPr>
-        <w:t>PROYECTO_DISTRITO</w:t>
-      </w:r>
-      <w:r>
-        <w:rPr>
-          <w:rFonts w:ascii="Arial" w:hAnsi="Arial"/>
-          <w:b/>
-          <w:i/>
-          <w:sz w:val="20"/>
-          <w:szCs w:val="20"/>
-        </w:rPr>
-        <w:t>}}</w:t>
+        </w:rPr>
+        <w:t>{{PROYECTO_DISTRITO}}</w:t>
       </w:r>
       <w:r>
         <w:rPr>
@@ -2994,45 +2879,75 @@
           <w:sz w:val="22"/>
           <w:szCs w:val="22"/>
         </w:rPr>
-        <w:t>{</w:t>
-      </w:r>
-      <w:r>
-        <w:rPr>
-          <w:rFonts w:ascii="Arial Narrow" w:hAnsi="Arial Narrow"/>
+        <w:t>{CONTRATISTA_RAZON_SOCIAL}}</w:t>
+      </w:r>
+    </w:p>
+    <w:p>
+      <w:pPr>
+        <w:rPr>
+          <w:rFonts w:ascii="Arial" w:hAnsi="Arial"/>
+          <w:b/>
+          <w:sz w:val="20"/>
+          <w:szCs w:val="20"/>
+          <w:lang w:val="es-ES_tradnl"/>
+        </w:rPr>
+      </w:pPr>
+      <w:r>
+        <w:rPr>
+          <w:rFonts w:ascii="Arial" w:hAnsi="Arial"/>
+          <w:b/>
+          <w:sz w:val="20"/>
+          <w:szCs w:val="20"/>
+        </w:rPr>
+        <w:t xml:space="preserve">RUC:                           </w:t>
+      </w:r>
+      <w:proofErr w:type="gramStart"/>
+      <w:r>
+        <w:rPr>
+          <w:rFonts w:ascii="Arial" w:hAnsi="Arial"/>
+          <w:b/>
+          <w:sz w:val="20"/>
+          <w:szCs w:val="20"/>
+        </w:rPr>
+        <w:t xml:space="preserve">   </w:t>
+      </w:r>
+      <w:r>
+        <w:rPr>
+          <w:rFonts w:ascii="Arial Narrow" w:eastAsia="Arial Narrow" w:hAnsi="Arial Narrow" w:cs="Arial Narrow"/>
           <w:b/>
           <w:sz w:val="22"/>
           <w:szCs w:val="22"/>
         </w:rPr>
-        <w:t>CONTRATISTA_RAZON_SOCIAL</w:t>
-      </w:r>
-      <w:r>
-        <w:rPr>
-          <w:rFonts w:ascii="Arial Narrow" w:hAnsi="Arial Narrow"/>
+        <w:t>{</w:t>
+      </w:r>
+      <w:proofErr w:type="gramEnd"/>
+      <w:r>
+        <w:rPr>
+          <w:rFonts w:ascii="Arial Narrow" w:eastAsia="Arial Narrow" w:hAnsi="Arial Narrow" w:cs="Arial Narrow"/>
           <w:b/>
           <w:sz w:val="22"/>
           <w:szCs w:val="22"/>
         </w:rPr>
-        <w:t>}}</w:t>
-      </w:r>
-    </w:p>
-    <w:p>
-      <w:pPr>
-        <w:rPr>
-          <w:rFonts w:ascii="Arial" w:hAnsi="Arial"/>
-          <w:b/>
-          <w:sz w:val="20"/>
-          <w:szCs w:val="20"/>
-          <w:lang w:val="es-ES_tradnl"/>
-        </w:rPr>
-      </w:pPr>
-      <w:r>
-        <w:rPr>
-          <w:rFonts w:ascii="Arial" w:hAnsi="Arial"/>
-          <w:b/>
-          <w:sz w:val="20"/>
-          <w:szCs w:val="20"/>
-        </w:rPr>
-        <w:t xml:space="preserve">RUC:                           </w:t>
+        <w:t>{CONTRATISTA_RUC}}</w:t>
+      </w:r>
+    </w:p>
+    <w:p>
+      <w:pPr>
+        <w:rPr>
+          <w:rFonts w:ascii="Arial" w:hAnsi="Arial"/>
+          <w:b/>
+          <w:sz w:val="20"/>
+          <w:szCs w:val="20"/>
+        </w:rPr>
+      </w:pPr>
+      <w:r>
+        <w:rPr>
+          <w:rFonts w:ascii="Arial" w:hAnsi="Arial"/>
+          <w:b/>
+          <w:sz w:val="20"/>
+          <w:szCs w:val="20"/>
+        </w:rPr>
+        <w:t>Representante Legal</w:t>
       </w:r>
       <w:proofErr w:type="gramStart"/>
       <w:r>
@@ -3042,11 +2957,11 @@
           <w:sz w:val="20"/>
           <w:szCs w:val="20"/>
         </w:rPr>
-        <w:t xml:space="preserve">   </w:t>
-      </w:r>
-      <w:r>
-        <w:rPr>
-          <w:rFonts w:ascii="Arial Narrow" w:eastAsia="Arial Narrow" w:hAnsi="Arial Narrow" w:cs="Arial Narrow"/>
+        <w:t xml:space="preserve">:  </w:t>
+      </w:r>
+      <w:r>
+        <w:rPr>
+          <w:rFonts w:ascii="Arial Narrow" w:hAnsi="Arial Narrow"/>
           <w:b/>
           <w:sz w:val="22"/>
           <w:szCs w:val="22"/>
@@ -3056,96 +2971,12 @@
       <w:proofErr w:type="gramEnd"/>
       <w:r>
         <w:rPr>
-          <w:rFonts w:ascii="Arial Narrow" w:eastAsia="Arial Narrow" w:hAnsi="Arial Narrow" w:cs="Arial Narrow"/>
+          <w:rFonts w:ascii="Arial Narrow" w:hAnsi="Arial Narrow"/>
           <w:b/>
           <w:sz w:val="22"/>
           <w:szCs w:val="22"/>
         </w:rPr>
-        <w:t>{</w:t>
-      </w:r>
-      <w:r>
-        <w:rPr>
-          <w:rFonts w:ascii="Arial Narrow" w:eastAsia="Arial Narrow" w:hAnsi="Arial Narrow" w:cs="Arial Narrow"/>
-          <w:b/>
-          <w:sz w:val="22"/>
-          <w:szCs w:val="22"/>
-        </w:rPr>
-        <w:t>CONTRATISTA_RUC</w:t>
-      </w:r>
-      <w:r>
-        <w:rPr>
-          <w:rFonts w:ascii="Arial Narrow" w:eastAsia="Arial Narrow" w:hAnsi="Arial Narrow" w:cs="Arial Narrow"/>
-          <w:b/>
-          <w:sz w:val="22"/>
-          <w:szCs w:val="22"/>
-        </w:rPr>
-        <w:t>}}</w:t>
-      </w:r>
-    </w:p>
-    <w:p>
-      <w:pPr>
-        <w:rPr>
-          <w:rFonts w:ascii="Arial" w:hAnsi="Arial"/>
-          <w:b/>
-          <w:sz w:val="20"/>
-          <w:szCs w:val="20"/>
-        </w:rPr>
-      </w:pPr>
-      <w:r>
-        <w:rPr>
-          <w:rFonts w:ascii="Arial" w:hAnsi="Arial"/>
-          <w:b/>
-          <w:sz w:val="20"/>
-          <w:szCs w:val="20"/>
-        </w:rPr>
-        <w:t>Representante Legal</w:t>
-      </w:r>
-      <w:proofErr w:type="gramStart"/>
-      <w:r>
-        <w:rPr>
-          <w:rFonts w:ascii="Arial" w:hAnsi="Arial"/>
-          <w:b/>
-          <w:sz w:val="20"/>
-          <w:szCs w:val="20"/>
-        </w:rPr>
-        <w:t xml:space="preserve">:  </w:t>
-      </w:r>
-      <w:r>
-        <w:rPr>
-          <w:rFonts w:ascii="Arial Narrow" w:hAnsi="Arial Narrow"/>
-          <w:b/>
-          <w:sz w:val="22"/>
-          <w:szCs w:val="22"/>
-        </w:rPr>
-        <w:t>{</w:t>
-      </w:r>
-      <w:proofErr w:type="gramEnd"/>
-      <w:r>
-        <w:rPr>
-          <w:rFonts w:ascii="Arial Narrow" w:hAnsi="Arial Narrow"/>
-          <w:b/>
-          <w:sz w:val="22"/>
-          <w:szCs w:val="22"/>
-        </w:rPr>
-        <w:t>{</w:t>
-      </w:r>
-      <w:r>
-        <w:rPr>
-          <w:rFonts w:ascii="Arial Narrow" w:hAnsi="Arial Narrow"/>
-          <w:b/>
-          <w:sz w:val="22"/>
-          <w:szCs w:val="22"/>
-        </w:rPr>
-        <w:t>CONTRATISTA_REPRESENTANTE_NOMBRE</w:t>
-      </w:r>
-      <w:r>
-        <w:rPr>
-          <w:rFonts w:ascii="Arial Narrow" w:hAnsi="Arial Narrow"/>
-          <w:b/>
-          <w:sz w:val="22"/>
-          <w:szCs w:val="22"/>
-        </w:rPr>
-        <w:t>}}</w:t>
+        <w:t>{CONTRATISTA_REPRESENTANTE_NOMBRE}}</w:t>
       </w:r>
     </w:p>
     <w:p>
@@ -3196,7 +3027,7 @@
           <w:sz w:val="22"/>
           <w:szCs w:val="22"/>
         </w:rPr>
-        <w:t>{</w:t>
+        <w:t>{CONTRATISTA_UBICACION}}</w:t>
       </w:r>
       <w:r>
         <w:rPr>
@@ -3206,7 +3037,7 @@
           <w:sz w:val="22"/>
           <w:szCs w:val="22"/>
         </w:rPr>
-        <w:t>CONTRATISTA_UBICACION</w:t>
+        <w:t xml:space="preserve">, distrito de </w:t>
       </w:r>
       <w:r>
         <w:rPr>
@@ -3216,7 +3047,7 @@
           <w:sz w:val="22"/>
           <w:szCs w:val="22"/>
         </w:rPr>
-        <w:t>}}</w:t>
+        <w:t>{{CONTRATISTA_DISTRITO}}</w:t>
       </w:r>
       <w:r>
         <w:rPr>
@@ -3226,7 +3057,7 @@
           <w:sz w:val="22"/>
           <w:szCs w:val="22"/>
         </w:rPr>
-        <w:t xml:space="preserve">, distrito de </w:t>
+        <w:t>, provincia</w:t>
       </w:r>
       <w:r>
         <w:rPr>
@@ -3236,7 +3067,7 @@
           <w:sz w:val="22"/>
           <w:szCs w:val="22"/>
         </w:rPr>
-        <w:t>{{</w:t>
+        <w:t xml:space="preserve"> de</w:t>
       </w:r>
       <w:r>
         <w:rPr>
@@ -3246,7 +3077,7 @@
           <w:sz w:val="22"/>
           <w:szCs w:val="22"/>
         </w:rPr>
-        <w:t>CONTRATISTA_DISTRITO</w:t>
+        <w:t xml:space="preserve"> </w:t>
       </w:r>
       <w:r>
         <w:rPr>
@@ -3256,7 +3087,7 @@
           <w:sz w:val="22"/>
           <w:szCs w:val="22"/>
         </w:rPr>
-        <w:t>}}</w:t>
+        <w:t>{{CONTRATISTA_PROVINCIA}}</w:t>
       </w:r>
       <w:r>
         <w:rPr>
@@ -3266,7 +3097,7 @@
           <w:sz w:val="22"/>
           <w:szCs w:val="22"/>
         </w:rPr>
-        <w:t>, provincia</w:t>
+        <w:t xml:space="preserve"> y departamento de</w:t>
       </w:r>
       <w:r>
         <w:rPr>
@@ -3276,87 +3107,7 @@
           <w:sz w:val="22"/>
           <w:szCs w:val="22"/>
         </w:rPr>
-        <w:t xml:space="preserve"> de</w:t>
-      </w:r>
-      <w:r>
-        <w:rPr>
-          <w:rFonts w:ascii="Arial Narrow" w:hAnsi="Arial Narrow" w:cs="Arial"/>
-          <w:b/>
-          <w:bCs/>
-          <w:sz w:val="22"/>
-          <w:szCs w:val="22"/>
-        </w:rPr>
-        <w:t xml:space="preserve"> </w:t>
-      </w:r>
-      <w:r>
-        <w:rPr>
-          <w:rFonts w:ascii="Arial Narrow" w:hAnsi="Arial Narrow" w:cs="Arial"/>
-          <w:b/>
-          <w:bCs/>
-          <w:sz w:val="22"/>
-          <w:szCs w:val="22"/>
-        </w:rPr>
-        <w:t>{{</w:t>
-      </w:r>
-      <w:r>
-        <w:rPr>
-          <w:rFonts w:ascii="Arial Narrow" w:hAnsi="Arial Narrow" w:cs="Arial"/>
-          <w:b/>
-          <w:bCs/>
-          <w:sz w:val="22"/>
-          <w:szCs w:val="22"/>
-        </w:rPr>
-        <w:t>CONTRATISTA_PROVINCIA</w:t>
-      </w:r>
-      <w:r>
-        <w:rPr>
-          <w:rFonts w:ascii="Arial Narrow" w:hAnsi="Arial Narrow" w:cs="Arial"/>
-          <w:b/>
-          <w:bCs/>
-          <w:sz w:val="22"/>
-          <w:szCs w:val="22"/>
-        </w:rPr>
-        <w:t>}}</w:t>
-      </w:r>
-      <w:r>
-        <w:rPr>
-          <w:rFonts w:ascii="Arial Narrow" w:hAnsi="Arial Narrow" w:cs="Arial"/>
-          <w:b/>
-          <w:bCs/>
-          <w:sz w:val="22"/>
-          <w:szCs w:val="22"/>
-        </w:rPr>
-        <w:t xml:space="preserve"> y departamento de</w:t>
-      </w:r>
-      <w:r>
-        <w:rPr>
-          <w:rFonts w:ascii="Arial Narrow" w:hAnsi="Arial Narrow" w:cs="Arial"/>
-          <w:b/>
-          <w:bCs/>
-          <w:sz w:val="22"/>
-          <w:szCs w:val="22"/>
-        </w:rPr>
-        <w:t xml:space="preserve"> {{</w:t>
-      </w:r>
-      <w:r>
-        <w:rPr>
-          <w:rFonts w:ascii="Arial Narrow" w:hAnsi="Arial Narrow" w:cs="Arial"/>
-          <w:b/>
-          <w:bCs/>
-          <w:sz w:val="22"/>
-          <w:szCs w:val="22"/>
-        </w:rPr>
-        <w:t>CONTRATISTA_DEPARTAMENTO</w:t>
-      </w:r>
-      <w:r>
-        <w:rPr>
-          <w:rFonts w:ascii="Arial Narrow" w:hAnsi="Arial Narrow" w:cs="Arial"/>
-          <w:b/>
-          <w:bCs/>
-          <w:sz w:val="22"/>
-          <w:szCs w:val="22"/>
-        </w:rPr>
-        <w:t>}}</w:t>
+        <w:t xml:space="preserve"> {{CONTRATISTA_DEPARTAMENTO}}</w:t>
       </w:r>
     </w:p>
     <w:p>
@@ -4270,6 +4021,7 @@
   <w:style w:type="character" w:default="1" w:styleId="Fuentedeprrafopredeter">
     <w:name w:val="Default Paragraph Font"/>
     <w:uiPriority w:val="1"/>
+    <w:semiHidden/>
     <w:unhideWhenUsed/>
   </w:style>
   <w:style w:type="table" w:default="1" w:styleId="Tablanormal">

</xml_diff>

<commit_message>
cambios en adjudicaciones y fix de bug al insertar persona ya registrada en contratista homologado
</commit_message>
<xml_diff>
--- a/Features/CostsModule/Features/AdjudicacionesFeature/Templates/plantilla_pagare_con_placeholders.docx
+++ b/Features/CostsModule/Features/AdjudicacionesFeature/Templates/plantilla_pagare_con_placeholders.docx
@@ -328,7 +328,14 @@
           <w:sz w:val="18"/>
           <w:szCs w:val="18"/>
         </w:rPr>
-        <w:t>MONTO_EN_PALABRAS</w:t>
+        <w:t>MON</w:t>
+      </w:r>
+      <w:r>
+        <w:rPr>
+          <w:sz w:val="18"/>
+          <w:szCs w:val="18"/>
+        </w:rPr>
+        <w:t>EDA</w:t>
       </w:r>
       <w:r>
         <w:rPr>
@@ -1698,7 +1705,16 @@
           <w:sz w:val="18"/>
           <w:szCs w:val="18"/>
         </w:rPr>
-        <w:t xml:space="preserve"> al proceso señalado en el Código Procesal Civil.</w:t>
+        <w:t xml:space="preserve"> al </w:t>
+      </w:r>
+      <w:r>
+        <w:rPr>
+          <w:rFonts w:ascii="Arial" w:hAnsi="Arial"/>
+          <w:sz w:val="18"/>
+          <w:szCs w:val="18"/>
+        </w:rPr>
+        <w:lastRenderedPageBreak/>
+        <w:t>proceso señalado en el Código Procesal Civil.</w:t>
       </w:r>
       <w:r>
         <w:rPr>
@@ -1744,310 +1760,6 @@
           <w:szCs w:val="20"/>
         </w:rPr>
       </w:pPr>
-    </w:p>
-    <w:p>
-      <w:pPr>
-        <w:jc w:val="both"/>
-        <w:rPr>
-          <w:rFonts w:ascii="Arial" w:hAnsi="Arial"/>
-          <w:b/>
-          <w:i/>
-          <w:sz w:val="20"/>
-          <w:szCs w:val="20"/>
-          <w:lang w:val="es-PE"/>
-        </w:rPr>
-      </w:pPr>
-      <w:r>
-        <w:rPr>
-          <w:rFonts w:ascii="Arial" w:hAnsi="Arial"/>
-          <w:b/>
-          <w:i/>
-          <w:sz w:val="20"/>
-          <w:szCs w:val="20"/>
-        </w:rPr>
-        <w:t>{{PROYECTO_DISTRITO}}</w:t>
-      </w:r>
-      <w:r>
-        <w:rPr>
-          <w:rFonts w:ascii="Arial" w:hAnsi="Arial"/>
-          <w:b/>
-          <w:i/>
-          <w:sz w:val="20"/>
-          <w:szCs w:val="20"/>
-        </w:rPr>
-        <w:t xml:space="preserve">, </w:t>
-      </w:r>
-      <w:r>
-        <w:rPr>
-          <w:rFonts w:ascii="Arial" w:hAnsi="Arial"/>
-          <w:b/>
-          <w:i/>
-          <w:sz w:val="20"/>
-          <w:szCs w:val="20"/>
-        </w:rPr>
-        <w:t>{{</w:t>
-      </w:r>
-      <w:r>
-        <w:rPr>
-          <w:rFonts w:ascii="Arial" w:hAnsi="Arial"/>
-          <w:b/>
-          <w:i/>
-          <w:sz w:val="20"/>
-          <w:szCs w:val="20"/>
-          <w:lang w:val="es-PE"/>
-        </w:rPr>
-        <w:t>FECHA_ACTUAL</w:t>
-      </w:r>
-      <w:r>
-        <w:rPr>
-          <w:rFonts w:ascii="Arial" w:hAnsi="Arial"/>
-          <w:b/>
-          <w:i/>
-          <w:sz w:val="20"/>
-          <w:szCs w:val="20"/>
-        </w:rPr>
-        <w:t>}}</w:t>
-      </w:r>
-    </w:p>
-    <w:p>
-      <w:pPr>
-        <w:jc w:val="both"/>
-        <w:rPr>
-          <w:rFonts w:ascii="Arial" w:hAnsi="Arial"/>
-          <w:b/>
-          <w:i/>
-          <w:sz w:val="20"/>
-          <w:szCs w:val="20"/>
-          <w:highlight w:val="yellow"/>
-        </w:rPr>
-      </w:pPr>
-    </w:p>
-    <w:p>
-      <w:pPr>
-        <w:jc w:val="both"/>
-        <w:rPr>
-          <w:rFonts w:ascii="Arial" w:hAnsi="Arial"/>
-          <w:b/>
-          <w:i/>
-          <w:sz w:val="20"/>
-          <w:szCs w:val="20"/>
-        </w:rPr>
-      </w:pPr>
-      <w:r>
-        <w:rPr>
-          <w:rFonts w:ascii="Arial" w:hAnsi="Arial"/>
-          <w:b/>
-          <w:sz w:val="20"/>
-          <w:szCs w:val="20"/>
-        </w:rPr>
-        <w:t>FIRMA DEL AVAL</w:t>
-      </w:r>
-    </w:p>
-    <w:p>
-      <w:pPr>
-        <w:jc w:val="both"/>
-        <w:rPr>
-          <w:rFonts w:ascii="Arial" w:hAnsi="Arial"/>
-          <w:sz w:val="20"/>
-          <w:szCs w:val="20"/>
-        </w:rPr>
-      </w:pPr>
-    </w:p>
-    <w:p>
-      <w:pPr>
-        <w:rPr>
-          <w:rFonts w:ascii="Arial" w:hAnsi="Arial"/>
-          <w:b/>
-          <w:sz w:val="20"/>
-          <w:szCs w:val="20"/>
-        </w:rPr>
-      </w:pPr>
-      <w:r>
-        <w:rPr>
-          <w:rFonts w:ascii="Arial" w:hAnsi="Arial"/>
-          <w:b/>
-          <w:sz w:val="20"/>
-          <w:szCs w:val="20"/>
-        </w:rPr>
-        <w:t xml:space="preserve">Razón Social:            </w:t>
-      </w:r>
-      <w:proofErr w:type="gramStart"/>
-      <w:r>
-        <w:rPr>
-          <w:rFonts w:ascii="Arial" w:hAnsi="Arial"/>
-          <w:b/>
-          <w:sz w:val="20"/>
-          <w:szCs w:val="20"/>
-        </w:rPr>
-        <w:t xml:space="preserve">   </w:t>
-      </w:r>
-      <w:r>
-        <w:rPr>
-          <w:rFonts w:ascii="Arial Narrow" w:hAnsi="Arial Narrow"/>
-          <w:b/>
-          <w:sz w:val="22"/>
-          <w:szCs w:val="22"/>
-        </w:rPr>
-        <w:t>{</w:t>
-      </w:r>
-      <w:proofErr w:type="gramEnd"/>
-      <w:r>
-        <w:rPr>
-          <w:rFonts w:ascii="Arial Narrow" w:hAnsi="Arial Narrow"/>
-          <w:b/>
-          <w:sz w:val="22"/>
-          <w:szCs w:val="22"/>
-        </w:rPr>
-        <w:t>{CONTRATISTA_RAZON_SOCIAL}}</w:t>
-      </w:r>
-    </w:p>
-    <w:p>
-      <w:pPr>
-        <w:rPr>
-          <w:rFonts w:ascii="Arial" w:hAnsi="Arial"/>
-          <w:b/>
-          <w:sz w:val="20"/>
-          <w:szCs w:val="20"/>
-          <w:lang w:val="es-ES_tradnl"/>
-        </w:rPr>
-      </w:pPr>
-      <w:r>
-        <w:rPr>
-          <w:rFonts w:ascii="Arial" w:hAnsi="Arial"/>
-          <w:b/>
-          <w:sz w:val="20"/>
-          <w:szCs w:val="20"/>
-        </w:rPr>
-        <w:t xml:space="preserve">RUC:                           </w:t>
-      </w:r>
-      <w:proofErr w:type="gramStart"/>
-      <w:r>
-        <w:rPr>
-          <w:rFonts w:ascii="Arial" w:hAnsi="Arial"/>
-          <w:b/>
-          <w:sz w:val="20"/>
-          <w:szCs w:val="20"/>
-        </w:rPr>
-        <w:t xml:space="preserve">   </w:t>
-      </w:r>
-      <w:r>
-        <w:rPr>
-          <w:rFonts w:ascii="Arial Narrow" w:eastAsia="Arial Narrow" w:hAnsi="Arial Narrow" w:cs="Arial Narrow"/>
-          <w:b/>
-          <w:sz w:val="22"/>
-          <w:szCs w:val="22"/>
-        </w:rPr>
-        <w:t>{</w:t>
-      </w:r>
-      <w:proofErr w:type="gramEnd"/>
-      <w:r>
-        <w:rPr>
-          <w:rFonts w:ascii="Arial Narrow" w:eastAsia="Arial Narrow" w:hAnsi="Arial Narrow" w:cs="Arial Narrow"/>
-          <w:b/>
-          <w:sz w:val="22"/>
-          <w:szCs w:val="22"/>
-        </w:rPr>
-        <w:t>{CONTRATISTA_RUC}}</w:t>
-      </w:r>
-    </w:p>
-    <w:p>
-      <w:pPr>
-        <w:rPr>
-          <w:rFonts w:ascii="Arial" w:hAnsi="Arial"/>
-          <w:b/>
-          <w:sz w:val="20"/>
-          <w:szCs w:val="20"/>
-        </w:rPr>
-      </w:pPr>
-      <w:r>
-        <w:rPr>
-          <w:rFonts w:ascii="Arial" w:hAnsi="Arial"/>
-          <w:b/>
-          <w:sz w:val="20"/>
-          <w:szCs w:val="20"/>
-        </w:rPr>
-        <w:t>Representante Legal</w:t>
-      </w:r>
-      <w:proofErr w:type="gramStart"/>
-      <w:r>
-        <w:rPr>
-          <w:rFonts w:ascii="Arial" w:hAnsi="Arial"/>
-          <w:b/>
-          <w:sz w:val="20"/>
-          <w:szCs w:val="20"/>
-        </w:rPr>
-        <w:t xml:space="preserve">:  </w:t>
-      </w:r>
-      <w:r>
-        <w:rPr>
-          <w:rFonts w:ascii="Arial Narrow" w:hAnsi="Arial Narrow"/>
-          <w:b/>
-          <w:sz w:val="22"/>
-          <w:szCs w:val="22"/>
-        </w:rPr>
-        <w:t>{</w:t>
-      </w:r>
-      <w:proofErr w:type="gramEnd"/>
-      <w:r>
-        <w:rPr>
-          <w:rFonts w:ascii="Arial Narrow" w:hAnsi="Arial Narrow"/>
-          <w:b/>
-          <w:sz w:val="22"/>
-          <w:szCs w:val="22"/>
-        </w:rPr>
-        <w:t>{CONTRATISTA_REPRESENTANTE_NOMBRE}}</w:t>
-      </w:r>
-    </w:p>
-    <w:p>
-      <w:pPr>
-        <w:ind w:left="2127" w:hanging="2127"/>
-        <w:rPr>
-          <w:rFonts w:ascii="Arial" w:hAnsi="Arial"/>
-          <w:b/>
-          <w:sz w:val="16"/>
-          <w:szCs w:val="20"/>
-        </w:rPr>
-      </w:pPr>
-      <w:r>
-        <w:rPr>
-          <w:rFonts w:ascii="Arial" w:hAnsi="Arial"/>
-          <w:b/>
-          <w:sz w:val="20"/>
-          <w:szCs w:val="20"/>
-        </w:rPr>
-        <w:t xml:space="preserve">Domicilio Legal:        </w:t>
-      </w:r>
-      <w:proofErr w:type="gramStart"/>
-      <w:r>
-        <w:rPr>
-          <w:rFonts w:ascii="Arial" w:hAnsi="Arial"/>
-          <w:b/>
-          <w:sz w:val="20"/>
-          <w:szCs w:val="20"/>
-        </w:rPr>
-        <w:t xml:space="preserve">   </w:t>
-      </w:r>
-      <w:r>
-        <w:rPr>
-          <w:rFonts w:ascii="Arial Narrow" w:hAnsi="Arial Narrow" w:cs="Arial"/>
-          <w:b/>
-          <w:bCs/>
-          <w:sz w:val="22"/>
-          <w:szCs w:val="22"/>
-        </w:rPr>
-        <w:t>{</w:t>
-      </w:r>
-      <w:proofErr w:type="gramEnd"/>
-      <w:r>
-        <w:rPr>
-          <w:rFonts w:ascii="Arial Narrow" w:hAnsi="Arial Narrow" w:cs="Arial"/>
-          <w:b/>
-          <w:bCs/>
-          <w:sz w:val="22"/>
-          <w:szCs w:val="22"/>
-        </w:rPr>
-        <w:t>{CONTRATISTA_UBICACION}}, distrito de {{CONTRATISTA_DISTRITO}}, provincia de {{CONTRATISTA_PROVINCIA}} y departamento de {{CONTRATISTA_DEPARTAMENTO}}</w:t>
-      </w:r>
     </w:p>
     <w:p>
       <w:pPr>
@@ -2084,1242 +1796,787 @@
           <w:lang w:eastAsia="es-PE"/>
         </w:rPr>
       </w:pPr>
-      <w:r>
-        <w:rPr>
-          <w:rFonts w:ascii="Arial" w:hAnsi="Arial" w:cs="Arial"/>
-          <w:sz w:val="18"/>
-          <w:szCs w:val="18"/>
-          <w:lang w:eastAsia="es-PE"/>
-        </w:rPr>
-        <w:t>Página 1/2</w:t>
-      </w:r>
+    </w:p>
+    <w:p>
+      <w:pPr>
+        <w:jc w:val="both"/>
+        <w:rPr>
+          <w:rFonts w:ascii="Arial" w:hAnsi="Arial" w:cs="Arial"/>
+          <w:sz w:val="18"/>
+          <w:szCs w:val="18"/>
+          <w:lang w:eastAsia="es-PE"/>
+        </w:rPr>
+      </w:pPr>
+      <w:r>
+        <w:rPr>
+          <w:rFonts w:ascii="Arial" w:hAnsi="Arial" w:cs="Arial"/>
+          <w:sz w:val="18"/>
+          <w:szCs w:val="18"/>
+          <w:lang w:eastAsia="es-PE"/>
+        </w:rPr>
+        <w:t>En los mismos términos y calidad antes expresados, que declaro haber leído en su integridad, encontrando conforme y aceptados en todos sus extremos, interviene en este Pagaré en igual calidad del prestatario</w:t>
+      </w:r>
+      <w:r>
+        <w:rPr>
+          <w:rFonts w:ascii="Arial" w:hAnsi="Arial" w:cs="Arial"/>
+          <w:sz w:val="18"/>
+          <w:szCs w:val="18"/>
+          <w:lang w:eastAsia="es-PE"/>
+        </w:rPr>
+        <w:t>(s)</w:t>
+      </w:r>
+      <w:r>
+        <w:rPr>
+          <w:rFonts w:ascii="Arial" w:hAnsi="Arial" w:cs="Arial"/>
+          <w:sz w:val="18"/>
+          <w:szCs w:val="18"/>
+          <w:lang w:eastAsia="es-PE"/>
+        </w:rPr>
+        <w:t>, el</w:t>
+      </w:r>
+      <w:r>
+        <w:rPr>
+          <w:rFonts w:ascii="Arial" w:hAnsi="Arial" w:cs="Arial"/>
+          <w:sz w:val="18"/>
+          <w:szCs w:val="18"/>
+          <w:lang w:eastAsia="es-PE"/>
+        </w:rPr>
+        <w:t xml:space="preserve"> (</w:t>
+      </w:r>
+      <w:r>
+        <w:rPr>
+          <w:rFonts w:ascii="Arial" w:hAnsi="Arial" w:cs="Arial"/>
+          <w:sz w:val="18"/>
+          <w:szCs w:val="18"/>
+          <w:lang w:eastAsia="es-PE"/>
+        </w:rPr>
+        <w:t>los</w:t>
+      </w:r>
+      <w:r>
+        <w:rPr>
+          <w:rFonts w:ascii="Arial" w:hAnsi="Arial" w:cs="Arial"/>
+          <w:sz w:val="18"/>
+          <w:szCs w:val="18"/>
+          <w:lang w:eastAsia="es-PE"/>
+        </w:rPr>
+        <w:t>)</w:t>
+      </w:r>
+      <w:r>
+        <w:rPr>
+          <w:rFonts w:ascii="Arial" w:hAnsi="Arial" w:cs="Arial"/>
+          <w:sz w:val="18"/>
+          <w:szCs w:val="18"/>
+          <w:lang w:eastAsia="es-PE"/>
+        </w:rPr>
+        <w:t xml:space="preserve"> </w:t>
+      </w:r>
+      <w:r>
+        <w:rPr>
+          <w:rFonts w:ascii="Arial" w:hAnsi="Arial" w:cs="Arial"/>
+          <w:b/>
+          <w:sz w:val="18"/>
+          <w:szCs w:val="18"/>
+          <w:lang w:eastAsia="es-PE"/>
+        </w:rPr>
+        <w:t>AVAL</w:t>
+      </w:r>
+      <w:r>
+        <w:rPr>
+          <w:rFonts w:ascii="Arial" w:hAnsi="Arial" w:cs="Arial"/>
+          <w:b/>
+          <w:sz w:val="18"/>
+          <w:szCs w:val="18"/>
+          <w:lang w:eastAsia="es-PE"/>
+        </w:rPr>
+        <w:t>(</w:t>
+      </w:r>
+      <w:r>
+        <w:rPr>
+          <w:rFonts w:ascii="Arial" w:hAnsi="Arial" w:cs="Arial"/>
+          <w:b/>
+          <w:sz w:val="18"/>
+          <w:szCs w:val="18"/>
+          <w:lang w:eastAsia="es-PE"/>
+        </w:rPr>
+        <w:t>ES</w:t>
+      </w:r>
+      <w:r>
+        <w:rPr>
+          <w:rFonts w:ascii="Arial" w:hAnsi="Arial" w:cs="Arial"/>
+          <w:b/>
+          <w:sz w:val="18"/>
+          <w:szCs w:val="18"/>
+          <w:lang w:eastAsia="es-PE"/>
+        </w:rPr>
+        <w:t>)</w:t>
+      </w:r>
+      <w:r>
+        <w:rPr>
+          <w:rFonts w:ascii="Arial" w:hAnsi="Arial" w:cs="Arial"/>
+          <w:b/>
+          <w:sz w:val="18"/>
+          <w:szCs w:val="18"/>
+          <w:lang w:eastAsia="es-PE"/>
+        </w:rPr>
+        <w:t xml:space="preserve"> </w:t>
+      </w:r>
+      <w:r>
+        <w:rPr>
+          <w:rFonts w:ascii="Arial" w:hAnsi="Arial" w:cs="Arial"/>
+          <w:sz w:val="18"/>
+          <w:szCs w:val="18"/>
+          <w:lang w:eastAsia="es-PE"/>
+        </w:rPr>
+        <w:t>garantizando el pago del presente pagaré y de todas las obligaciones que represente éste documento comprometiéndome (nos) a responder y pagar la cantidad adeudada, sus intereses compensatorios y moratorios de ser el caso y demás aplicables, seguros, gastos, gastos notariales y de cobranza prejudicial, extrajudicial o judicial, que se pudieran devengar desde la fecha de emisión hasta la cancelación total de la presente obligación.</w:t>
+      </w:r>
+    </w:p>
+    <w:p>
+      <w:pPr>
+        <w:jc w:val="both"/>
+        <w:rPr>
+          <w:rFonts w:ascii="Arial" w:hAnsi="Arial" w:cs="Arial"/>
+          <w:sz w:val="18"/>
+          <w:szCs w:val="18"/>
+          <w:lang w:eastAsia="es-PE"/>
+        </w:rPr>
+      </w:pPr>
+    </w:p>
+    <w:p>
+      <w:pPr>
+        <w:jc w:val="both"/>
+        <w:rPr>
+          <w:rFonts w:ascii="Arial" w:hAnsi="Arial" w:cs="Arial"/>
+          <w:sz w:val="18"/>
+          <w:szCs w:val="18"/>
+          <w:lang w:eastAsia="es-PE"/>
+        </w:rPr>
+      </w:pPr>
+      <w:r>
+        <w:rPr>
+          <w:rFonts w:ascii="Arial" w:hAnsi="Arial" w:cs="Arial"/>
+          <w:sz w:val="18"/>
+          <w:szCs w:val="18"/>
+          <w:lang w:eastAsia="es-PE"/>
+        </w:rPr>
+        <w:t>Expresamente acepto (amos) toda variación de las tasas de interés, comisiones y demás aplicables, seguros, gastos notariales y de cobranza que efectúe</w:t>
+      </w:r>
+      <w:r>
+        <w:rPr>
+          <w:rFonts w:ascii="Arial" w:hAnsi="Arial" w:cs="Arial"/>
+          <w:sz w:val="18"/>
+          <w:szCs w:val="18"/>
+          <w:lang w:eastAsia="es-PE"/>
+        </w:rPr>
+        <w:t xml:space="preserve"> </w:t>
+      </w:r>
+      <w:r>
+        <w:rPr>
+          <w:rFonts w:ascii="Arial" w:hAnsi="Arial"/>
+          <w:sz w:val="18"/>
+          <w:szCs w:val="18"/>
+        </w:rPr>
+        <w:t>“</w:t>
+      </w:r>
+      <w:r>
+        <w:rPr>
+          <w:rFonts w:ascii="Arial" w:hAnsi="Arial"/>
+          <w:b/>
+          <w:sz w:val="18"/>
+          <w:szCs w:val="18"/>
+        </w:rPr>
+        <w:t>{{PROYECTO_RAZON_SOCIAL}}”</w:t>
+      </w:r>
+      <w:r>
+        <w:rPr>
+          <w:rFonts w:ascii="Arial" w:hAnsi="Arial" w:cs="Arial"/>
+          <w:sz w:val="18"/>
+          <w:szCs w:val="18"/>
+          <w:lang w:eastAsia="es-PE"/>
+        </w:rPr>
+        <w:t>, las mismas que serán puestas de conocimiento en forma oportuna legalmente establecida.</w:t>
+      </w:r>
+    </w:p>
+    <w:p>
+      <w:pPr>
+        <w:jc w:val="both"/>
+        <w:rPr>
+          <w:rFonts w:ascii="Arial" w:hAnsi="Arial" w:cs="Arial"/>
+          <w:sz w:val="18"/>
+          <w:szCs w:val="18"/>
+          <w:lang w:eastAsia="es-PE"/>
+        </w:rPr>
+      </w:pPr>
+    </w:p>
+    <w:p>
+      <w:pPr>
+        <w:jc w:val="both"/>
+        <w:rPr>
+          <w:rFonts w:ascii="Arial" w:hAnsi="Arial" w:cs="Arial"/>
+          <w:sz w:val="18"/>
+          <w:szCs w:val="18"/>
+          <w:lang w:eastAsia="es-PE"/>
+        </w:rPr>
+      </w:pPr>
+      <w:r>
+        <w:rPr>
+          <w:rFonts w:ascii="Arial" w:hAnsi="Arial" w:cs="Arial"/>
+          <w:sz w:val="18"/>
+          <w:szCs w:val="18"/>
+          <w:lang w:eastAsia="es-PE"/>
+        </w:rPr>
+        <w:t xml:space="preserve">Esta </w:t>
+      </w:r>
+      <w:r>
+        <w:rPr>
+          <w:rFonts w:ascii="Arial" w:hAnsi="Arial" w:cs="Arial"/>
+          <w:sz w:val="18"/>
+          <w:szCs w:val="18"/>
+          <w:lang w:eastAsia="es-PE"/>
+        </w:rPr>
+        <w:t>garantía</w:t>
+      </w:r>
+      <w:r>
+        <w:rPr>
+          <w:rFonts w:ascii="Arial" w:hAnsi="Arial" w:cs="Arial"/>
+          <w:sz w:val="18"/>
+          <w:szCs w:val="18"/>
+          <w:lang w:eastAsia="es-PE"/>
+        </w:rPr>
+        <w:t xml:space="preserve"> es solidaria, irrevocable, incondicional, de realización automática, sin beneficio de exclusión, indeterminada e ilimitada, de plazo indefinido y estará vigente mientras no se encuentre(n) totalmente pagada(s) las obligación(es) que represente el presente pagaré, aceptando desde ahora, la(s) prórroga(s) que </w:t>
+      </w:r>
+      <w:r>
+        <w:rPr>
+          <w:rFonts w:ascii="Arial" w:hAnsi="Arial"/>
+          <w:sz w:val="18"/>
+          <w:szCs w:val="18"/>
+        </w:rPr>
+        <w:t>“</w:t>
+      </w:r>
+      <w:r>
+        <w:rPr>
+          <w:rFonts w:ascii="Arial" w:hAnsi="Arial"/>
+          <w:b/>
+          <w:sz w:val="18"/>
+          <w:szCs w:val="18"/>
+        </w:rPr>
+        <w:t>{{PROYECTO_RAZON_SOCIAL}}”</w:t>
+      </w:r>
+      <w:r>
+        <w:rPr>
+          <w:rFonts w:ascii="Arial" w:hAnsi="Arial"/>
+          <w:b/>
+          <w:sz w:val="18"/>
+          <w:szCs w:val="18"/>
+        </w:rPr>
+        <w:t xml:space="preserve"> </w:t>
+      </w:r>
+      <w:r>
+        <w:rPr>
+          <w:rFonts w:ascii="Arial" w:hAnsi="Arial"/>
+          <w:sz w:val="18"/>
+          <w:szCs w:val="18"/>
+        </w:rPr>
+        <w:t>c</w:t>
+      </w:r>
+      <w:r>
+        <w:rPr>
+          <w:rFonts w:ascii="Arial" w:hAnsi="Arial" w:cs="Arial"/>
+          <w:sz w:val="18"/>
+          <w:szCs w:val="18"/>
+          <w:lang w:eastAsia="es-PE"/>
+        </w:rPr>
+        <w:t>onceda a mi(s) (nuestros</w:t>
+      </w:r>
+      <w:r>
+        <w:rPr>
+          <w:rFonts w:ascii="Arial" w:hAnsi="Arial" w:cs="Arial"/>
+          <w:sz w:val="18"/>
+          <w:szCs w:val="18"/>
+          <w:lang w:eastAsia="es-PE"/>
+        </w:rPr>
+        <w:t>)</w:t>
+      </w:r>
+      <w:r>
+        <w:rPr>
+          <w:rFonts w:ascii="Arial" w:hAnsi="Arial" w:cs="Arial"/>
+          <w:sz w:val="18"/>
+          <w:szCs w:val="18"/>
+          <w:lang w:eastAsia="es-PE"/>
+        </w:rPr>
+        <w:t xml:space="preserve"> </w:t>
+      </w:r>
+      <w:r>
+        <w:rPr>
+          <w:rFonts w:ascii="Arial" w:hAnsi="Arial" w:cs="Arial"/>
+          <w:sz w:val="18"/>
+          <w:szCs w:val="18"/>
+          <w:lang w:eastAsia="es-PE"/>
+        </w:rPr>
+        <w:t>prestatario</w:t>
+      </w:r>
+      <w:r>
+        <w:rPr>
+          <w:rFonts w:ascii="Arial" w:hAnsi="Arial" w:cs="Arial"/>
+          <w:sz w:val="18"/>
+          <w:szCs w:val="18"/>
+          <w:lang w:eastAsia="es-PE"/>
+        </w:rPr>
+        <w:t>(</w:t>
+      </w:r>
+      <w:proofErr w:type="spellStart"/>
+      <w:r>
+        <w:rPr>
+          <w:rFonts w:ascii="Arial" w:hAnsi="Arial" w:cs="Arial"/>
+          <w:sz w:val="18"/>
+          <w:szCs w:val="18"/>
+          <w:lang w:eastAsia="es-PE"/>
+        </w:rPr>
+        <w:t>dor</w:t>
+      </w:r>
+      <w:proofErr w:type="spellEnd"/>
+      <w:r>
+        <w:rPr>
+          <w:rFonts w:ascii="Arial" w:hAnsi="Arial" w:cs="Arial"/>
+          <w:sz w:val="18"/>
+          <w:szCs w:val="18"/>
+          <w:lang w:eastAsia="es-PE"/>
+        </w:rPr>
+        <w:t>) para lo cual presto (amos) mi (nuestro) expreso consentimiento, sin que sea necesaria mi (nuestra) intervención y suscripción.</w:t>
+      </w:r>
+    </w:p>
+    <w:p>
+      <w:pPr>
+        <w:jc w:val="both"/>
+        <w:rPr>
+          <w:rFonts w:ascii="Arial" w:hAnsi="Arial" w:cs="Arial"/>
+          <w:sz w:val="18"/>
+          <w:szCs w:val="18"/>
+          <w:lang w:eastAsia="es-PE"/>
+        </w:rPr>
+      </w:pPr>
+    </w:p>
+    <w:p>
+      <w:pPr>
+        <w:jc w:val="both"/>
+        <w:rPr>
+          <w:rFonts w:ascii="Arial" w:hAnsi="Arial" w:cs="Arial"/>
+          <w:sz w:val="18"/>
+          <w:szCs w:val="18"/>
+          <w:lang w:eastAsia="es-PE"/>
+        </w:rPr>
+      </w:pPr>
+      <w:r>
+        <w:rPr>
+          <w:rFonts w:ascii="Arial" w:hAnsi="Arial" w:cs="Arial"/>
+          <w:sz w:val="18"/>
+          <w:szCs w:val="18"/>
+          <w:lang w:eastAsia="es-PE"/>
+        </w:rPr>
+        <w:t xml:space="preserve">Acepto (amos) que este pagaré no requerirá protesto para su ejecución. Sin embargo, </w:t>
+      </w:r>
+      <w:r>
+        <w:rPr>
+          <w:rFonts w:ascii="Arial" w:hAnsi="Arial"/>
+          <w:sz w:val="18"/>
+          <w:szCs w:val="18"/>
+        </w:rPr>
+        <w:t>“</w:t>
+      </w:r>
+      <w:r>
+        <w:rPr>
+          <w:rFonts w:ascii="Arial" w:hAnsi="Arial"/>
+          <w:b/>
+          <w:sz w:val="18"/>
+          <w:szCs w:val="18"/>
+        </w:rPr>
+        <w:t>{{PROYECTO_RAZON_SOCIAL}}”</w:t>
+      </w:r>
+      <w:r>
+        <w:rPr>
+          <w:rFonts w:ascii="Arial" w:hAnsi="Arial" w:cs="Arial"/>
+          <w:sz w:val="18"/>
+          <w:szCs w:val="18"/>
+          <w:lang w:eastAsia="es-PE"/>
+        </w:rPr>
+        <w:t xml:space="preserve"> podrá protestarlo, cuyo caso asumiré (</w:t>
+      </w:r>
+      <w:proofErr w:type="spellStart"/>
+      <w:r>
+        <w:rPr>
+          <w:rFonts w:ascii="Arial" w:hAnsi="Arial" w:cs="Arial"/>
+          <w:sz w:val="18"/>
+          <w:szCs w:val="18"/>
+          <w:lang w:eastAsia="es-PE"/>
+        </w:rPr>
+        <w:t>mos</w:t>
+      </w:r>
+      <w:proofErr w:type="spellEnd"/>
+      <w:r>
+        <w:rPr>
+          <w:rFonts w:ascii="Arial" w:hAnsi="Arial" w:cs="Arial"/>
+          <w:sz w:val="18"/>
+          <w:szCs w:val="18"/>
+          <w:lang w:eastAsia="es-PE"/>
+        </w:rPr>
+        <w:t>) los gastos de dicha diligencia.</w:t>
+      </w:r>
+    </w:p>
+    <w:p>
+      <w:pPr>
+        <w:jc w:val="both"/>
+        <w:rPr>
+          <w:rFonts w:ascii="Arial" w:hAnsi="Arial" w:cs="Arial"/>
+          <w:sz w:val="18"/>
+          <w:szCs w:val="18"/>
+          <w:lang w:eastAsia="es-PE"/>
+        </w:rPr>
+      </w:pPr>
+    </w:p>
+    <w:p>
+      <w:pPr>
+        <w:jc w:val="both"/>
+        <w:rPr>
+          <w:rFonts w:ascii="Arial" w:hAnsi="Arial" w:cs="Arial"/>
+          <w:sz w:val="18"/>
+          <w:szCs w:val="18"/>
+          <w:lang w:eastAsia="es-PE"/>
+        </w:rPr>
+      </w:pPr>
+      <w:r>
+        <w:rPr>
+          <w:rFonts w:ascii="Arial" w:hAnsi="Arial" w:cs="Arial"/>
+          <w:sz w:val="18"/>
+          <w:szCs w:val="18"/>
+          <w:lang w:eastAsia="es-PE"/>
+        </w:rPr>
+        <w:t xml:space="preserve">Asimismo, obligo(amos) todos mis (nuestros) bienes adquiridos y por adquirir), en la mejor forma de derecho y cualquier garantía prendaria, hipotecaria valores y/o haberes que puedan existir a favor de </w:t>
+      </w:r>
+      <w:r>
+        <w:rPr>
+          <w:rFonts w:ascii="Arial" w:hAnsi="Arial"/>
+          <w:sz w:val="18"/>
+          <w:szCs w:val="18"/>
+        </w:rPr>
+        <w:t>“</w:t>
+      </w:r>
+      <w:r>
+        <w:rPr>
+          <w:rFonts w:ascii="Arial" w:hAnsi="Arial"/>
+          <w:b/>
+          <w:sz w:val="18"/>
+          <w:szCs w:val="18"/>
+        </w:rPr>
+        <w:t>{{PROYECTO_RAZON_SOCIAL}}”</w:t>
+      </w:r>
+      <w:r>
+        <w:rPr>
+          <w:rFonts w:ascii="Arial" w:hAnsi="Arial" w:cs="Arial"/>
+          <w:sz w:val="18"/>
+          <w:szCs w:val="18"/>
+          <w:lang w:eastAsia="es-PE"/>
+        </w:rPr>
+        <w:t>.</w:t>
+      </w:r>
+    </w:p>
+    <w:p>
+      <w:pPr>
+        <w:jc w:val="both"/>
+        <w:rPr>
+          <w:rFonts w:ascii="Arial" w:hAnsi="Arial" w:cs="Arial"/>
+          <w:sz w:val="18"/>
+          <w:szCs w:val="18"/>
+          <w:lang w:eastAsia="es-PE"/>
+        </w:rPr>
+      </w:pPr>
+    </w:p>
+    <w:p>
+      <w:pPr>
+        <w:jc w:val="both"/>
+        <w:rPr>
+          <w:rFonts w:ascii="Arial" w:hAnsi="Arial" w:cs="Arial"/>
+          <w:sz w:val="18"/>
+          <w:szCs w:val="18"/>
+          <w:lang w:eastAsia="es-PE"/>
+        </w:rPr>
+      </w:pPr>
+      <w:r>
+        <w:rPr>
+          <w:rFonts w:ascii="Arial" w:hAnsi="Arial" w:cs="Arial"/>
+          <w:sz w:val="18"/>
+          <w:szCs w:val="18"/>
+          <w:lang w:eastAsia="es-PE"/>
+        </w:rPr>
+        <w:t>Me (nos) someto (emos) expresamente a la competencia de los Jueces y Tribunales de esta ciudad y señalo (amos) como domicilio aquél que aparece indicado en este Pagaré, donde se efectuarán las diligencias notariales, judiciales y demás que fuesen necesarias para los efectos del pago.</w:t>
+      </w:r>
+    </w:p>
+    <w:p>
+      <w:pPr>
+        <w:jc w:val="both"/>
+        <w:rPr>
+          <w:rFonts w:ascii="Arial" w:hAnsi="Arial" w:cs="Arial"/>
+          <w:sz w:val="18"/>
+          <w:szCs w:val="18"/>
+          <w:lang w:eastAsia="es-PE"/>
+        </w:rPr>
+      </w:pPr>
+    </w:p>
+    <w:p>
+      <w:pPr>
+        <w:jc w:val="both"/>
+        <w:rPr>
+          <w:rFonts w:ascii="Arial" w:hAnsi="Arial" w:cs="Arial"/>
+          <w:sz w:val="18"/>
+          <w:szCs w:val="18"/>
+          <w:lang w:eastAsia="es-PE"/>
+        </w:rPr>
+      </w:pPr>
+      <w:r>
+        <w:rPr>
+          <w:rFonts w:ascii="Arial" w:hAnsi="Arial" w:cs="Arial"/>
+          <w:sz w:val="18"/>
+          <w:szCs w:val="18"/>
+          <w:lang w:eastAsia="es-PE"/>
+        </w:rPr>
+        <w:t>Declaro</w:t>
+      </w:r>
+      <w:r>
+        <w:rPr>
+          <w:rFonts w:ascii="Arial" w:hAnsi="Arial" w:cs="Arial"/>
+          <w:sz w:val="18"/>
+          <w:szCs w:val="18"/>
+          <w:lang w:eastAsia="es-PE"/>
+        </w:rPr>
+        <w:t xml:space="preserve"> </w:t>
+      </w:r>
+      <w:r>
+        <w:rPr>
+          <w:rFonts w:ascii="Arial" w:hAnsi="Arial" w:cs="Arial"/>
+          <w:sz w:val="18"/>
+          <w:szCs w:val="18"/>
+          <w:lang w:eastAsia="es-PE"/>
+        </w:rPr>
+        <w:t xml:space="preserve">(amos) tener </w:t>
+      </w:r>
+      <w:r>
+        <w:rPr>
+          <w:rFonts w:ascii="Arial" w:hAnsi="Arial" w:cs="Arial"/>
+          <w:sz w:val="18"/>
+          <w:szCs w:val="18"/>
+          <w:lang w:eastAsia="es-PE"/>
+        </w:rPr>
+        <w:t>capacidad</w:t>
+      </w:r>
+      <w:r>
+        <w:rPr>
+          <w:rFonts w:ascii="Arial" w:hAnsi="Arial" w:cs="Arial"/>
+          <w:sz w:val="18"/>
+          <w:szCs w:val="18"/>
+          <w:lang w:eastAsia="es-PE"/>
+        </w:rPr>
+        <w:t xml:space="preserve"> y estar plenamente facultado(s) para suscribir y emitir el presente pagaré, asumiendo en caso contrario la responsabilidad </w:t>
+      </w:r>
+      <w:r>
+        <w:rPr>
+          <w:rFonts w:ascii="Arial" w:hAnsi="Arial" w:cs="Arial"/>
+          <w:sz w:val="18"/>
+          <w:szCs w:val="18"/>
+          <w:lang w:eastAsia="es-PE"/>
+        </w:rPr>
+        <w:t xml:space="preserve">civil y/o </w:t>
+      </w:r>
+      <w:r>
+        <w:rPr>
+          <w:rFonts w:ascii="Arial" w:hAnsi="Arial" w:cs="Arial"/>
+          <w:sz w:val="18"/>
+          <w:szCs w:val="18"/>
+          <w:lang w:eastAsia="es-PE"/>
+        </w:rPr>
+        <w:t>penal a que hubiera lugar.</w:t>
+      </w:r>
+    </w:p>
+    <w:p>
+      <w:pPr>
+        <w:jc w:val="both"/>
+        <w:rPr>
+          <w:rFonts w:ascii="Arial" w:hAnsi="Arial"/>
+          <w:b/>
+          <w:i/>
+          <w:sz w:val="20"/>
+          <w:szCs w:val="20"/>
+        </w:rPr>
+      </w:pPr>
+    </w:p>
+    <w:p>
+      <w:pPr>
+        <w:rPr>
+          <w:rFonts w:ascii="Arial" w:hAnsi="Arial"/>
+          <w:b/>
+          <w:sz w:val="16"/>
+          <w:szCs w:val="20"/>
+        </w:rPr>
+      </w:pPr>
+    </w:p>
+    <w:p>
+      <w:pPr>
+        <w:rPr>
+          <w:rFonts w:ascii="Arial" w:hAnsi="Arial"/>
+          <w:b/>
+          <w:sz w:val="16"/>
+          <w:szCs w:val="20"/>
+        </w:rPr>
+      </w:pPr>
+    </w:p>
+    <w:p>
+      <w:pPr>
+        <w:jc w:val="both"/>
+      </w:pPr>
+    </w:p>
+    <w:p>
+      <w:pPr>
+        <w:jc w:val="both"/>
+      </w:pPr>
+    </w:p>
+    <w:p>
+      <w:pPr>
+        <w:jc w:val="both"/>
+      </w:pPr>
+    </w:p>
+    <w:p>
+      <w:pPr>
+        <w:jc w:val="both"/>
+      </w:pPr>
+    </w:p>
+    <w:p>
+      <w:pPr>
+        <w:jc w:val="both"/>
+      </w:pPr>
+    </w:p>
+    <w:p>
+      <w:pPr>
+        <w:rPr>
+          <w:rFonts w:ascii="Arial" w:hAnsi="Arial"/>
+          <w:sz w:val="20"/>
+          <w:szCs w:val="20"/>
+        </w:rPr>
+      </w:pPr>
+      <w:r>
+        <w:rPr>
+          <w:rFonts w:ascii="Arial" w:hAnsi="Arial"/>
+          <w:sz w:val="20"/>
+          <w:szCs w:val="20"/>
+        </w:rPr>
+        <w:t xml:space="preserve">                                                                                                     _________________________________</w:t>
+      </w:r>
+    </w:p>
+    <w:p>
+      <w:pPr>
+        <w:tabs>
+          <w:tab w:val="left" w:pos="6570"/>
+        </w:tabs>
+        <w:rPr>
+          <w:rFonts w:ascii="Arial" w:hAnsi="Arial"/>
+          <w:sz w:val="20"/>
+          <w:szCs w:val="20"/>
+        </w:rPr>
+      </w:pPr>
+      <w:r>
+        <w:rPr>
+          <w:rFonts w:ascii="Arial" w:hAnsi="Arial"/>
+          <w:sz w:val="20"/>
+          <w:szCs w:val="20"/>
+        </w:rPr>
+        <w:tab/>
+        <w:t>Firma y sello</w:t>
+      </w:r>
+    </w:p>
+    <w:p>
+      <w:pPr>
+        <w:rPr>
+          <w:rFonts w:ascii="Arial" w:hAnsi="Arial"/>
+          <w:sz w:val="20"/>
+          <w:szCs w:val="20"/>
+        </w:rPr>
+      </w:pPr>
+    </w:p>
+    <w:p>
+      <w:pPr>
+        <w:rPr>
+          <w:rFonts w:ascii="Arial" w:hAnsi="Arial"/>
+          <w:sz w:val="20"/>
+          <w:szCs w:val="20"/>
+        </w:rPr>
+      </w:pPr>
+    </w:p>
+    <w:p>
+      <w:pPr>
+        <w:rPr>
+          <w:rFonts w:ascii="Arial" w:hAnsi="Arial"/>
+          <w:sz w:val="20"/>
+          <w:szCs w:val="20"/>
+        </w:rPr>
+      </w:pPr>
+    </w:p>
+    <w:p>
+      <w:pPr>
+        <w:rPr>
+          <w:rFonts w:ascii="Arial" w:hAnsi="Arial"/>
+          <w:sz w:val="20"/>
+          <w:szCs w:val="20"/>
+        </w:rPr>
+      </w:pPr>
+    </w:p>
+    <w:p>
+      <w:pPr>
+        <w:rPr>
+          <w:rFonts w:ascii="Arial" w:hAnsi="Arial"/>
+          <w:sz w:val="20"/>
+          <w:szCs w:val="20"/>
+        </w:rPr>
+      </w:pPr>
+    </w:p>
+    <w:p>
+      <w:pPr>
+        <w:rPr>
+          <w:rFonts w:ascii="Arial" w:hAnsi="Arial"/>
+          <w:sz w:val="20"/>
+          <w:szCs w:val="20"/>
+        </w:rPr>
+      </w:pPr>
+    </w:p>
+    <w:p>
+      <w:pPr>
+        <w:rPr>
+          <w:rFonts w:ascii="Arial" w:hAnsi="Arial"/>
+          <w:sz w:val="20"/>
+          <w:szCs w:val="20"/>
+        </w:rPr>
+      </w:pPr>
+    </w:p>
+    <w:p>
+      <w:pPr>
+        <w:rPr>
+          <w:rFonts w:ascii="Arial" w:hAnsi="Arial"/>
+          <w:sz w:val="20"/>
+          <w:szCs w:val="20"/>
+        </w:rPr>
+      </w:pPr>
     </w:p>
     <w:p>
       <w:pPr>
         <w:tabs>
           <w:tab w:val="left" w:pos="5295"/>
         </w:tabs>
-        <w:jc w:val="center"/>
-        <w:rPr>
-          <w:rFonts w:ascii="Arial" w:hAnsi="Arial" w:cs="Arial"/>
-          <w:sz w:val="18"/>
-          <w:szCs w:val="18"/>
-          <w:lang w:eastAsia="es-PE"/>
-        </w:rPr>
-      </w:pPr>
-    </w:p>
-    <w:p>
-      <w:pPr>
-        <w:jc w:val="both"/>
-        <w:rPr>
-          <w:rFonts w:ascii="Arial" w:hAnsi="Arial" w:cs="Arial"/>
-          <w:sz w:val="18"/>
-          <w:szCs w:val="18"/>
-          <w:lang w:eastAsia="es-PE"/>
-        </w:rPr>
-      </w:pPr>
-      <w:r>
-        <w:rPr>
-          <w:rFonts w:ascii="Arial" w:hAnsi="Arial" w:cs="Arial"/>
-          <w:sz w:val="18"/>
-          <w:szCs w:val="18"/>
-          <w:lang w:eastAsia="es-PE"/>
-        </w:rPr>
-        <w:t>En los mismos términos y calidad antes expresados, que declaro haber leído en su integridad, encontrando conforme y aceptados en todos sus extremos, interviene en este Pagaré en igual calidad del prestatario</w:t>
-      </w:r>
-      <w:r>
-        <w:rPr>
-          <w:rFonts w:ascii="Arial" w:hAnsi="Arial" w:cs="Arial"/>
-          <w:sz w:val="18"/>
-          <w:szCs w:val="18"/>
-          <w:lang w:eastAsia="es-PE"/>
-        </w:rPr>
-        <w:t>(s)</w:t>
-      </w:r>
-      <w:r>
-        <w:rPr>
-          <w:rFonts w:ascii="Arial" w:hAnsi="Arial" w:cs="Arial"/>
-          <w:sz w:val="18"/>
-          <w:szCs w:val="18"/>
-          <w:lang w:eastAsia="es-PE"/>
-        </w:rPr>
-        <w:t>, el</w:t>
-      </w:r>
-      <w:r>
-        <w:rPr>
-          <w:rFonts w:ascii="Arial" w:hAnsi="Arial" w:cs="Arial"/>
-          <w:sz w:val="18"/>
-          <w:szCs w:val="18"/>
-          <w:lang w:eastAsia="es-PE"/>
-        </w:rPr>
-        <w:t xml:space="preserve"> (</w:t>
-      </w:r>
-      <w:r>
-        <w:rPr>
-          <w:rFonts w:ascii="Arial" w:hAnsi="Arial" w:cs="Arial"/>
-          <w:sz w:val="18"/>
-          <w:szCs w:val="18"/>
-          <w:lang w:eastAsia="es-PE"/>
-        </w:rPr>
-        <w:t>los</w:t>
-      </w:r>
-      <w:r>
-        <w:rPr>
-          <w:rFonts w:ascii="Arial" w:hAnsi="Arial" w:cs="Arial"/>
-          <w:sz w:val="18"/>
-          <w:szCs w:val="18"/>
-          <w:lang w:eastAsia="es-PE"/>
-        </w:rPr>
-        <w:t>)</w:t>
-      </w:r>
-      <w:r>
-        <w:rPr>
-          <w:rFonts w:ascii="Arial" w:hAnsi="Arial" w:cs="Arial"/>
-          <w:sz w:val="18"/>
-          <w:szCs w:val="18"/>
-          <w:lang w:eastAsia="es-PE"/>
-        </w:rPr>
-        <w:t xml:space="preserve"> </w:t>
-      </w:r>
-      <w:r>
-        <w:rPr>
-          <w:rFonts w:ascii="Arial" w:hAnsi="Arial" w:cs="Arial"/>
-          <w:b/>
-          <w:sz w:val="18"/>
-          <w:szCs w:val="18"/>
-          <w:lang w:eastAsia="es-PE"/>
-        </w:rPr>
-        <w:t>AVAL</w:t>
-      </w:r>
-      <w:r>
-        <w:rPr>
-          <w:rFonts w:ascii="Arial" w:hAnsi="Arial" w:cs="Arial"/>
-          <w:b/>
-          <w:sz w:val="18"/>
-          <w:szCs w:val="18"/>
-          <w:lang w:eastAsia="es-PE"/>
-        </w:rPr>
-        <w:t>(</w:t>
-      </w:r>
-      <w:r>
-        <w:rPr>
-          <w:rFonts w:ascii="Arial" w:hAnsi="Arial" w:cs="Arial"/>
-          <w:b/>
-          <w:sz w:val="18"/>
-          <w:szCs w:val="18"/>
-          <w:lang w:eastAsia="es-PE"/>
-        </w:rPr>
-        <w:t>ES</w:t>
-      </w:r>
-      <w:r>
-        <w:rPr>
-          <w:rFonts w:ascii="Arial" w:hAnsi="Arial" w:cs="Arial"/>
-          <w:b/>
-          <w:sz w:val="18"/>
-          <w:szCs w:val="18"/>
-          <w:lang w:eastAsia="es-PE"/>
-        </w:rPr>
-        <w:t>)</w:t>
-      </w:r>
-      <w:r>
-        <w:rPr>
-          <w:rFonts w:ascii="Arial" w:hAnsi="Arial" w:cs="Arial"/>
-          <w:b/>
-          <w:sz w:val="18"/>
-          <w:szCs w:val="18"/>
-          <w:lang w:eastAsia="es-PE"/>
-        </w:rPr>
-        <w:t xml:space="preserve"> </w:t>
-      </w:r>
-      <w:r>
-        <w:rPr>
-          <w:rFonts w:ascii="Arial" w:hAnsi="Arial" w:cs="Arial"/>
-          <w:sz w:val="18"/>
-          <w:szCs w:val="18"/>
-          <w:lang w:eastAsia="es-PE"/>
-        </w:rPr>
-        <w:t>garantizando el pago del presente pagaré y de todas las obligaciones que represente éste documento comprometiéndome (nos) a responder y pagar la cantidad adeudada, sus intereses compensatorios y moratorios de ser el caso y demás aplicables, seguros, gastos, gastos notariales y de cobranza prejudicial, extrajudicial o judicial, que se pudieran devengar desde la fecha de emisión hasta la cancelación total de la presente obligación.</w:t>
-      </w:r>
-    </w:p>
-    <w:p>
-      <w:pPr>
-        <w:jc w:val="both"/>
-        <w:rPr>
-          <w:rFonts w:ascii="Arial" w:hAnsi="Arial" w:cs="Arial"/>
-          <w:sz w:val="18"/>
-          <w:szCs w:val="18"/>
-          <w:lang w:eastAsia="es-PE"/>
-        </w:rPr>
-      </w:pPr>
-    </w:p>
-    <w:p>
-      <w:pPr>
-        <w:jc w:val="both"/>
-        <w:rPr>
-          <w:rFonts w:ascii="Arial" w:hAnsi="Arial" w:cs="Arial"/>
-          <w:sz w:val="18"/>
-          <w:szCs w:val="18"/>
-          <w:lang w:eastAsia="es-PE"/>
-        </w:rPr>
-      </w:pPr>
-      <w:r>
-        <w:rPr>
-          <w:rFonts w:ascii="Arial" w:hAnsi="Arial" w:cs="Arial"/>
-          <w:sz w:val="18"/>
-          <w:szCs w:val="18"/>
-          <w:lang w:eastAsia="es-PE"/>
-        </w:rPr>
-        <w:t>Expresamente acepto (amos) toda variación de las tasas de interés, comisiones y demás aplicables, seguros, gastos notariales y de cobranza que efectúe</w:t>
-      </w:r>
-      <w:r>
-        <w:rPr>
-          <w:rFonts w:ascii="Arial" w:hAnsi="Arial" w:cs="Arial"/>
-          <w:sz w:val="18"/>
-          <w:szCs w:val="18"/>
-          <w:lang w:eastAsia="es-PE"/>
-        </w:rPr>
-        <w:t xml:space="preserve"> </w:t>
-      </w:r>
-      <w:r>
-        <w:rPr>
-          <w:rFonts w:ascii="Arial" w:hAnsi="Arial"/>
-          <w:sz w:val="18"/>
-          <w:szCs w:val="18"/>
-        </w:rPr>
-        <w:t>“</w:t>
-      </w:r>
-      <w:r>
-        <w:rPr>
-          <w:rFonts w:ascii="Arial" w:hAnsi="Arial"/>
-          <w:b/>
-          <w:sz w:val="18"/>
-          <w:szCs w:val="18"/>
-        </w:rPr>
-        <w:t>{{PROYECTO_RAZON_SOCIAL}}”</w:t>
-      </w:r>
-      <w:r>
-        <w:rPr>
-          <w:rFonts w:ascii="Arial" w:hAnsi="Arial" w:cs="Arial"/>
-          <w:sz w:val="18"/>
-          <w:szCs w:val="18"/>
-          <w:lang w:eastAsia="es-PE"/>
-        </w:rPr>
-        <w:t>, las mismas que serán puestas de conocimiento en forma oportuna legalmente establecida.</w:t>
-      </w:r>
-    </w:p>
-    <w:p>
-      <w:pPr>
-        <w:jc w:val="both"/>
-        <w:rPr>
-          <w:rFonts w:ascii="Arial" w:hAnsi="Arial" w:cs="Arial"/>
-          <w:sz w:val="18"/>
-          <w:szCs w:val="18"/>
-          <w:lang w:eastAsia="es-PE"/>
-        </w:rPr>
-      </w:pPr>
-    </w:p>
-    <w:p>
-      <w:pPr>
-        <w:jc w:val="both"/>
-        <w:rPr>
-          <w:rFonts w:ascii="Arial" w:hAnsi="Arial" w:cs="Arial"/>
-          <w:sz w:val="18"/>
-          <w:szCs w:val="18"/>
-          <w:lang w:eastAsia="es-PE"/>
-        </w:rPr>
-      </w:pPr>
-      <w:r>
-        <w:rPr>
-          <w:rFonts w:ascii="Arial" w:hAnsi="Arial" w:cs="Arial"/>
-          <w:sz w:val="18"/>
-          <w:szCs w:val="18"/>
-          <w:lang w:eastAsia="es-PE"/>
-        </w:rPr>
-        <w:t xml:space="preserve">Esta </w:t>
-      </w:r>
-      <w:r>
-        <w:rPr>
-          <w:rFonts w:ascii="Arial" w:hAnsi="Arial" w:cs="Arial"/>
-          <w:sz w:val="18"/>
-          <w:szCs w:val="18"/>
-          <w:lang w:eastAsia="es-PE"/>
-        </w:rPr>
-        <w:t>garantía</w:t>
-      </w:r>
-      <w:r>
-        <w:rPr>
-          <w:rFonts w:ascii="Arial" w:hAnsi="Arial" w:cs="Arial"/>
-          <w:sz w:val="18"/>
-          <w:szCs w:val="18"/>
-          <w:lang w:eastAsia="es-PE"/>
-        </w:rPr>
-        <w:t xml:space="preserve"> es solidaria, irrevocable, incondicional, de realización automática, sin beneficio de exclusión, indeterminada e ilimitada, de plazo indefinido y estará vigente mientras no se encuentre(n) totalmente pagada(s) las obligación(es) que represente el presente pagaré, aceptando desde ahora, la(s) prórroga(s) que </w:t>
-      </w:r>
-      <w:r>
-        <w:rPr>
-          <w:rFonts w:ascii="Arial" w:hAnsi="Arial"/>
-          <w:sz w:val="18"/>
-          <w:szCs w:val="18"/>
-        </w:rPr>
-        <w:t>“</w:t>
-      </w:r>
-      <w:r>
-        <w:rPr>
-          <w:rFonts w:ascii="Arial" w:hAnsi="Arial"/>
-          <w:b/>
-          <w:sz w:val="18"/>
-          <w:szCs w:val="18"/>
-        </w:rPr>
-        <w:t>{{PROYECTO_RAZON_SOCIAL}}”</w:t>
-      </w:r>
-      <w:r>
-        <w:rPr>
-          <w:rFonts w:ascii="Arial" w:hAnsi="Arial"/>
-          <w:b/>
-          <w:sz w:val="18"/>
-          <w:szCs w:val="18"/>
-        </w:rPr>
-        <w:t xml:space="preserve"> </w:t>
-      </w:r>
-      <w:r>
-        <w:rPr>
-          <w:rFonts w:ascii="Arial" w:hAnsi="Arial"/>
-          <w:sz w:val="18"/>
-          <w:szCs w:val="18"/>
-        </w:rPr>
-        <w:t>c</w:t>
-      </w:r>
-      <w:r>
-        <w:rPr>
-          <w:rFonts w:ascii="Arial" w:hAnsi="Arial" w:cs="Arial"/>
-          <w:sz w:val="18"/>
-          <w:szCs w:val="18"/>
-          <w:lang w:eastAsia="es-PE"/>
-        </w:rPr>
-        <w:t>onceda a mi(s) (nuestros</w:t>
-      </w:r>
-      <w:r>
-        <w:rPr>
-          <w:rFonts w:ascii="Arial" w:hAnsi="Arial" w:cs="Arial"/>
-          <w:sz w:val="18"/>
-          <w:szCs w:val="18"/>
-          <w:lang w:eastAsia="es-PE"/>
-        </w:rPr>
-        <w:t>)</w:t>
-      </w:r>
-      <w:r>
-        <w:rPr>
-          <w:rFonts w:ascii="Arial" w:hAnsi="Arial" w:cs="Arial"/>
-          <w:sz w:val="18"/>
-          <w:szCs w:val="18"/>
-          <w:lang w:eastAsia="es-PE"/>
-        </w:rPr>
-        <w:t xml:space="preserve"> </w:t>
-      </w:r>
-      <w:r>
-        <w:rPr>
-          <w:rFonts w:ascii="Arial" w:hAnsi="Arial" w:cs="Arial"/>
-          <w:sz w:val="18"/>
-          <w:szCs w:val="18"/>
-          <w:lang w:eastAsia="es-PE"/>
-        </w:rPr>
-        <w:t>prestatario</w:t>
-      </w:r>
-      <w:r>
-        <w:rPr>
-          <w:rFonts w:ascii="Arial" w:hAnsi="Arial" w:cs="Arial"/>
-          <w:sz w:val="18"/>
-          <w:szCs w:val="18"/>
-          <w:lang w:eastAsia="es-PE"/>
-        </w:rPr>
-        <w:t>(</w:t>
-      </w:r>
-      <w:proofErr w:type="spellStart"/>
-      <w:r>
-        <w:rPr>
-          <w:rFonts w:ascii="Arial" w:hAnsi="Arial" w:cs="Arial"/>
-          <w:sz w:val="18"/>
-          <w:szCs w:val="18"/>
-          <w:lang w:eastAsia="es-PE"/>
-        </w:rPr>
-        <w:t>dor</w:t>
-      </w:r>
-      <w:proofErr w:type="spellEnd"/>
-      <w:r>
-        <w:rPr>
-          <w:rFonts w:ascii="Arial" w:hAnsi="Arial" w:cs="Arial"/>
-          <w:sz w:val="18"/>
-          <w:szCs w:val="18"/>
-          <w:lang w:eastAsia="es-PE"/>
-        </w:rPr>
-        <w:t>) para lo cual presto (amos) mi (nuestro) expreso consentimiento, sin que sea necesaria mi (nuestra) intervención y suscripción.</w:t>
-      </w:r>
-    </w:p>
-    <w:p>
-      <w:pPr>
-        <w:jc w:val="both"/>
-        <w:rPr>
-          <w:rFonts w:ascii="Arial" w:hAnsi="Arial" w:cs="Arial"/>
-          <w:sz w:val="18"/>
-          <w:szCs w:val="18"/>
-          <w:lang w:eastAsia="es-PE"/>
-        </w:rPr>
-      </w:pPr>
-    </w:p>
-    <w:p>
-      <w:pPr>
-        <w:jc w:val="both"/>
-        <w:rPr>
-          <w:rFonts w:ascii="Arial" w:hAnsi="Arial" w:cs="Arial"/>
-          <w:sz w:val="18"/>
-          <w:szCs w:val="18"/>
-          <w:lang w:eastAsia="es-PE"/>
-        </w:rPr>
-      </w:pPr>
-      <w:r>
-        <w:rPr>
-          <w:rFonts w:ascii="Arial" w:hAnsi="Arial" w:cs="Arial"/>
-          <w:sz w:val="18"/>
-          <w:szCs w:val="18"/>
-          <w:lang w:eastAsia="es-PE"/>
-        </w:rPr>
-        <w:t xml:space="preserve">Acepto (amos) que este pagaré no requerirá protesto para su ejecución. Sin embargo, </w:t>
-      </w:r>
-      <w:r>
-        <w:rPr>
-          <w:rFonts w:ascii="Arial" w:hAnsi="Arial"/>
-          <w:sz w:val="18"/>
-          <w:szCs w:val="18"/>
-        </w:rPr>
-        <w:t>“</w:t>
-      </w:r>
-      <w:r>
-        <w:rPr>
-          <w:rFonts w:ascii="Arial" w:hAnsi="Arial"/>
-          <w:b/>
-          <w:sz w:val="18"/>
-          <w:szCs w:val="18"/>
-        </w:rPr>
-        <w:t>{{PROYECTO_RAZON_SOCIAL}}”</w:t>
-      </w:r>
-      <w:r>
-        <w:rPr>
-          <w:rFonts w:ascii="Arial" w:hAnsi="Arial" w:cs="Arial"/>
-          <w:sz w:val="18"/>
-          <w:szCs w:val="18"/>
-          <w:lang w:eastAsia="es-PE"/>
-        </w:rPr>
-        <w:t xml:space="preserve"> podrá protestarlo, cuyo caso asumiré (</w:t>
-      </w:r>
-      <w:proofErr w:type="spellStart"/>
-      <w:r>
-        <w:rPr>
-          <w:rFonts w:ascii="Arial" w:hAnsi="Arial" w:cs="Arial"/>
-          <w:sz w:val="18"/>
-          <w:szCs w:val="18"/>
-          <w:lang w:eastAsia="es-PE"/>
-        </w:rPr>
-        <w:t>mos</w:t>
-      </w:r>
-      <w:proofErr w:type="spellEnd"/>
-      <w:r>
-        <w:rPr>
-          <w:rFonts w:ascii="Arial" w:hAnsi="Arial" w:cs="Arial"/>
-          <w:sz w:val="18"/>
-          <w:szCs w:val="18"/>
-          <w:lang w:eastAsia="es-PE"/>
-        </w:rPr>
-        <w:t>) los gastos de dicha diligencia.</w:t>
-      </w:r>
-    </w:p>
-    <w:p>
-      <w:pPr>
-        <w:jc w:val="both"/>
-        <w:rPr>
-          <w:rFonts w:ascii="Arial" w:hAnsi="Arial" w:cs="Arial"/>
-          <w:sz w:val="18"/>
-          <w:szCs w:val="18"/>
-          <w:lang w:eastAsia="es-PE"/>
-        </w:rPr>
-      </w:pPr>
-    </w:p>
-    <w:p>
-      <w:pPr>
-        <w:jc w:val="both"/>
-        <w:rPr>
-          <w:rFonts w:ascii="Arial" w:hAnsi="Arial" w:cs="Arial"/>
-          <w:sz w:val="18"/>
-          <w:szCs w:val="18"/>
-          <w:lang w:eastAsia="es-PE"/>
-        </w:rPr>
-      </w:pPr>
-      <w:r>
-        <w:rPr>
-          <w:rFonts w:ascii="Arial" w:hAnsi="Arial" w:cs="Arial"/>
-          <w:sz w:val="18"/>
-          <w:szCs w:val="18"/>
-          <w:lang w:eastAsia="es-PE"/>
-        </w:rPr>
-        <w:t xml:space="preserve">Asimismo, obligo(amos) todos mis (nuestros) bienes adquiridos y por adquirir), en la mejor forma de derecho y cualquier garantía prendaria, hipotecaria valores y/o haberes que puedan existir a favor de </w:t>
-      </w:r>
-      <w:r>
-        <w:rPr>
-          <w:rFonts w:ascii="Arial" w:hAnsi="Arial"/>
-          <w:sz w:val="18"/>
-          <w:szCs w:val="18"/>
-        </w:rPr>
-        <w:t>“</w:t>
-      </w:r>
-      <w:r>
-        <w:rPr>
-          <w:rFonts w:ascii="Arial" w:hAnsi="Arial"/>
-          <w:b/>
-          <w:sz w:val="18"/>
-          <w:szCs w:val="18"/>
-        </w:rPr>
-        <w:t>{{PROYECTO_RAZON_SOCIAL}}”</w:t>
-      </w:r>
-      <w:r>
-        <w:rPr>
-          <w:rFonts w:ascii="Arial" w:hAnsi="Arial" w:cs="Arial"/>
-          <w:sz w:val="18"/>
-          <w:szCs w:val="18"/>
-          <w:lang w:eastAsia="es-PE"/>
-        </w:rPr>
-        <w:t>.</w:t>
-      </w:r>
-    </w:p>
-    <w:p>
-      <w:pPr>
-        <w:jc w:val="both"/>
-        <w:rPr>
-          <w:rFonts w:ascii="Arial" w:hAnsi="Arial" w:cs="Arial"/>
-          <w:sz w:val="18"/>
-          <w:szCs w:val="18"/>
-          <w:lang w:eastAsia="es-PE"/>
-        </w:rPr>
-      </w:pPr>
-    </w:p>
-    <w:p>
-      <w:pPr>
-        <w:jc w:val="both"/>
-        <w:rPr>
-          <w:rFonts w:ascii="Arial" w:hAnsi="Arial" w:cs="Arial"/>
-          <w:sz w:val="18"/>
-          <w:szCs w:val="18"/>
-          <w:lang w:eastAsia="es-PE"/>
-        </w:rPr>
-      </w:pPr>
-      <w:r>
-        <w:rPr>
-          <w:rFonts w:ascii="Arial" w:hAnsi="Arial" w:cs="Arial"/>
-          <w:sz w:val="18"/>
-          <w:szCs w:val="18"/>
-          <w:lang w:eastAsia="es-PE"/>
-        </w:rPr>
-        <w:t>Me (nos) someto (emos) expresamente a la competencia de los Jueces y Tribunales de esta ciudad y señalo (amos) como domicilio aquél que aparece indicado en este Pagaré, donde se efectuarán las diligencias notariales, judiciales y demás que fuesen necesarias para los efectos del pago.</w:t>
-      </w:r>
-    </w:p>
-    <w:p>
-      <w:pPr>
-        <w:jc w:val="both"/>
-        <w:rPr>
-          <w:rFonts w:ascii="Arial" w:hAnsi="Arial" w:cs="Arial"/>
-          <w:sz w:val="18"/>
-          <w:szCs w:val="18"/>
-          <w:lang w:eastAsia="es-PE"/>
-        </w:rPr>
-      </w:pPr>
-    </w:p>
-    <w:p>
-      <w:pPr>
-        <w:jc w:val="both"/>
-        <w:rPr>
-          <w:rFonts w:ascii="Arial" w:hAnsi="Arial" w:cs="Arial"/>
-          <w:sz w:val="18"/>
-          <w:szCs w:val="18"/>
-          <w:lang w:eastAsia="es-PE"/>
-        </w:rPr>
-      </w:pPr>
-      <w:r>
-        <w:rPr>
-          <w:rFonts w:ascii="Arial" w:hAnsi="Arial" w:cs="Arial"/>
-          <w:sz w:val="18"/>
-          <w:szCs w:val="18"/>
-          <w:lang w:eastAsia="es-PE"/>
-        </w:rPr>
-        <w:t>Declaro</w:t>
-      </w:r>
-      <w:r>
-        <w:rPr>
-          <w:rFonts w:ascii="Arial" w:hAnsi="Arial" w:cs="Arial"/>
-          <w:sz w:val="18"/>
-          <w:szCs w:val="18"/>
-          <w:lang w:eastAsia="es-PE"/>
-        </w:rPr>
-        <w:t xml:space="preserve"> </w:t>
-      </w:r>
-      <w:r>
-        <w:rPr>
-          <w:rFonts w:ascii="Arial" w:hAnsi="Arial" w:cs="Arial"/>
-          <w:sz w:val="18"/>
-          <w:szCs w:val="18"/>
-          <w:lang w:eastAsia="es-PE"/>
-        </w:rPr>
-        <w:t xml:space="preserve">(amos) tener </w:t>
-      </w:r>
-      <w:r>
-        <w:rPr>
-          <w:rFonts w:ascii="Arial" w:hAnsi="Arial" w:cs="Arial"/>
-          <w:sz w:val="18"/>
-          <w:szCs w:val="18"/>
-          <w:lang w:eastAsia="es-PE"/>
-        </w:rPr>
-        <w:t>capacidad</w:t>
-      </w:r>
-      <w:r>
-        <w:rPr>
-          <w:rFonts w:ascii="Arial" w:hAnsi="Arial" w:cs="Arial"/>
-          <w:sz w:val="18"/>
-          <w:szCs w:val="18"/>
-          <w:lang w:eastAsia="es-PE"/>
-        </w:rPr>
-        <w:t xml:space="preserve"> y estar plenamente facultado(s) para suscribir y emitir el presente pagaré, asumiendo en caso contrario la responsabilidad </w:t>
-      </w:r>
-      <w:r>
-        <w:rPr>
-          <w:rFonts w:ascii="Arial" w:hAnsi="Arial" w:cs="Arial"/>
-          <w:sz w:val="18"/>
-          <w:szCs w:val="18"/>
-          <w:lang w:eastAsia="es-PE"/>
-        </w:rPr>
-        <w:t xml:space="preserve">civil y/o </w:t>
-      </w:r>
-      <w:r>
-        <w:rPr>
-          <w:rFonts w:ascii="Arial" w:hAnsi="Arial" w:cs="Arial"/>
-          <w:sz w:val="18"/>
-          <w:szCs w:val="18"/>
-          <w:lang w:eastAsia="es-PE"/>
-        </w:rPr>
-        <w:t>penal a que hubiera lugar.</w:t>
-      </w:r>
-    </w:p>
-    <w:p>
-      <w:pPr>
-        <w:jc w:val="both"/>
-        <w:rPr>
-          <w:rFonts w:ascii="Arial" w:hAnsi="Arial"/>
-          <w:b/>
-          <w:i/>
-          <w:sz w:val="20"/>
-          <w:szCs w:val="20"/>
-        </w:rPr>
-      </w:pPr>
-    </w:p>
-    <w:p>
-      <w:pPr>
-        <w:jc w:val="both"/>
-        <w:rPr>
-          <w:rFonts w:ascii="Arial" w:hAnsi="Arial"/>
-          <w:b/>
-          <w:i/>
-          <w:sz w:val="20"/>
-          <w:szCs w:val="20"/>
-        </w:rPr>
-      </w:pPr>
-      <w:r>
-        <w:rPr>
-          <w:rFonts w:ascii="Arial" w:hAnsi="Arial"/>
-          <w:b/>
-          <w:i/>
-          <w:sz w:val="20"/>
-          <w:szCs w:val="20"/>
-        </w:rPr>
-        <w:t>{{PROYECTO_DISTRIT</w:t>
-      </w:r>
-      <w:r>
-        <w:rPr>
-          <w:rFonts w:ascii="Arial" w:hAnsi="Arial"/>
-          <w:b/>
-          <w:i/>
-          <w:sz w:val="20"/>
-          <w:szCs w:val="20"/>
-        </w:rPr>
-        <w:t>O}}</w:t>
-      </w:r>
-      <w:r>
-        <w:rPr>
-          <w:rFonts w:ascii="Arial" w:hAnsi="Arial"/>
-          <w:b/>
-          <w:i/>
-          <w:sz w:val="20"/>
-          <w:szCs w:val="20"/>
-        </w:rPr>
-        <w:t xml:space="preserve">, </w:t>
-      </w:r>
-      <w:r>
-        <w:rPr>
-          <w:rFonts w:ascii="Arial" w:hAnsi="Arial"/>
-          <w:b/>
-          <w:i/>
-          <w:sz w:val="20"/>
-          <w:szCs w:val="20"/>
-        </w:rPr>
-        <w:t>{{</w:t>
-      </w:r>
-      <w:r>
-        <w:rPr>
-          <w:rFonts w:ascii="Arial" w:hAnsi="Arial"/>
-          <w:b/>
-          <w:i/>
-          <w:sz w:val="20"/>
-          <w:szCs w:val="20"/>
-          <w:lang w:val="es-PE"/>
-        </w:rPr>
-        <w:t>FECHA_ACTUAL</w:t>
-      </w:r>
-      <w:r>
-        <w:rPr>
-          <w:rFonts w:ascii="Arial" w:hAnsi="Arial"/>
-          <w:b/>
-          <w:i/>
-          <w:sz w:val="20"/>
-          <w:szCs w:val="20"/>
-        </w:rPr>
-        <w:t>}}</w:t>
-      </w:r>
-    </w:p>
-    <w:p>
-      <w:pPr>
-        <w:jc w:val="both"/>
-        <w:rPr>
-          <w:rFonts w:ascii="Arial" w:hAnsi="Arial"/>
-          <w:b/>
-          <w:i/>
-          <w:sz w:val="20"/>
-          <w:szCs w:val="20"/>
-          <w:highlight w:val="yellow"/>
-        </w:rPr>
-      </w:pPr>
-    </w:p>
-    <w:p>
-      <w:pPr>
-        <w:jc w:val="both"/>
-        <w:rPr>
-          <w:rFonts w:ascii="Arial" w:hAnsi="Arial"/>
-          <w:b/>
-          <w:i/>
-          <w:sz w:val="20"/>
-          <w:szCs w:val="20"/>
-        </w:rPr>
-      </w:pPr>
-      <w:r>
-        <w:rPr>
-          <w:rFonts w:ascii="Arial" w:hAnsi="Arial"/>
-          <w:b/>
-          <w:sz w:val="20"/>
-          <w:szCs w:val="20"/>
-        </w:rPr>
-        <w:t>FIRMA DEL AVAL</w:t>
-      </w:r>
-    </w:p>
-    <w:p>
-      <w:pPr>
-        <w:jc w:val="both"/>
-        <w:rPr>
-          <w:rFonts w:ascii="Arial" w:hAnsi="Arial"/>
-          <w:sz w:val="20"/>
-          <w:szCs w:val="20"/>
-        </w:rPr>
-      </w:pPr>
-    </w:p>
-    <w:p>
-      <w:pPr>
-        <w:rPr>
-          <w:rFonts w:ascii="Arial" w:hAnsi="Arial"/>
-          <w:b/>
-          <w:sz w:val="20"/>
-          <w:szCs w:val="20"/>
-        </w:rPr>
-      </w:pPr>
-      <w:r>
-        <w:rPr>
-          <w:rFonts w:ascii="Arial" w:hAnsi="Arial"/>
-          <w:b/>
-          <w:sz w:val="20"/>
-          <w:szCs w:val="20"/>
-        </w:rPr>
-        <w:t xml:space="preserve">Razón Social:            </w:t>
-      </w:r>
-      <w:proofErr w:type="gramStart"/>
-      <w:r>
-        <w:rPr>
-          <w:rFonts w:ascii="Arial" w:hAnsi="Arial"/>
-          <w:b/>
-          <w:sz w:val="20"/>
-          <w:szCs w:val="20"/>
-        </w:rPr>
-        <w:t xml:space="preserve">   </w:t>
-      </w:r>
-      <w:r>
-        <w:rPr>
-          <w:rFonts w:ascii="Arial Narrow" w:hAnsi="Arial Narrow"/>
-          <w:b/>
-          <w:sz w:val="22"/>
-          <w:szCs w:val="22"/>
-        </w:rPr>
-        <w:t>{</w:t>
-      </w:r>
-      <w:proofErr w:type="gramEnd"/>
-      <w:r>
-        <w:rPr>
-          <w:rFonts w:ascii="Arial Narrow" w:hAnsi="Arial Narrow"/>
-          <w:b/>
-          <w:sz w:val="22"/>
-          <w:szCs w:val="22"/>
-        </w:rPr>
-        <w:t>{CONTRATISTA_RAZON_SOCIAL}}</w:t>
-      </w:r>
-    </w:p>
-    <w:p>
-      <w:pPr>
-        <w:rPr>
-          <w:rFonts w:ascii="Arial" w:hAnsi="Arial"/>
-          <w:b/>
-          <w:sz w:val="20"/>
-          <w:szCs w:val="20"/>
-          <w:lang w:val="es-ES_tradnl"/>
-        </w:rPr>
-      </w:pPr>
-      <w:r>
-        <w:rPr>
-          <w:rFonts w:ascii="Arial" w:hAnsi="Arial"/>
-          <w:b/>
-          <w:sz w:val="20"/>
-          <w:szCs w:val="20"/>
-        </w:rPr>
-        <w:t xml:space="preserve">RUC:                           </w:t>
-      </w:r>
-      <w:proofErr w:type="gramStart"/>
-      <w:r>
-        <w:rPr>
-          <w:rFonts w:ascii="Arial" w:hAnsi="Arial"/>
-          <w:b/>
-          <w:sz w:val="20"/>
-          <w:szCs w:val="20"/>
-        </w:rPr>
-        <w:t xml:space="preserve">   </w:t>
-      </w:r>
-      <w:r>
-        <w:rPr>
-          <w:rFonts w:ascii="Arial Narrow" w:eastAsia="Arial Narrow" w:hAnsi="Arial Narrow" w:cs="Arial Narrow"/>
-          <w:b/>
-          <w:sz w:val="22"/>
-          <w:szCs w:val="22"/>
-        </w:rPr>
-        <w:t>{</w:t>
-      </w:r>
-      <w:proofErr w:type="gramEnd"/>
-      <w:r>
-        <w:rPr>
-          <w:rFonts w:ascii="Arial Narrow" w:eastAsia="Arial Narrow" w:hAnsi="Arial Narrow" w:cs="Arial Narrow"/>
-          <w:b/>
-          <w:sz w:val="22"/>
-          <w:szCs w:val="22"/>
-        </w:rPr>
-        <w:t>{CONTRATISTA_RUC}}</w:t>
-      </w:r>
-    </w:p>
-    <w:p>
-      <w:pPr>
-        <w:rPr>
-          <w:rFonts w:ascii="Arial" w:hAnsi="Arial"/>
-          <w:b/>
-          <w:sz w:val="20"/>
-          <w:szCs w:val="20"/>
-        </w:rPr>
-      </w:pPr>
-      <w:r>
-        <w:rPr>
-          <w:rFonts w:ascii="Arial" w:hAnsi="Arial"/>
-          <w:b/>
-          <w:sz w:val="20"/>
-          <w:szCs w:val="20"/>
-        </w:rPr>
-        <w:t>Representante Legal</w:t>
-      </w:r>
-      <w:proofErr w:type="gramStart"/>
-      <w:r>
-        <w:rPr>
-          <w:rFonts w:ascii="Arial" w:hAnsi="Arial"/>
-          <w:b/>
-          <w:sz w:val="20"/>
-          <w:szCs w:val="20"/>
-        </w:rPr>
-        <w:t xml:space="preserve">:  </w:t>
-      </w:r>
-      <w:r>
-        <w:rPr>
-          <w:rFonts w:ascii="Arial Narrow" w:hAnsi="Arial Narrow"/>
-          <w:b/>
-          <w:sz w:val="22"/>
-          <w:szCs w:val="22"/>
-        </w:rPr>
-        <w:t>{</w:t>
-      </w:r>
-      <w:proofErr w:type="gramEnd"/>
-      <w:r>
-        <w:rPr>
-          <w:rFonts w:ascii="Arial Narrow" w:hAnsi="Arial Narrow"/>
-          <w:b/>
-          <w:sz w:val="22"/>
-          <w:szCs w:val="22"/>
-        </w:rPr>
-        <w:t>{CONTRATISTA_REPRESENTANTE_NOMBRE}}</w:t>
-      </w:r>
-    </w:p>
-    <w:p>
-      <w:pPr>
-        <w:ind w:left="2127" w:hanging="2127"/>
-        <w:rPr>
-          <w:rFonts w:ascii="Arial" w:hAnsi="Arial"/>
-          <w:b/>
-          <w:sz w:val="16"/>
-          <w:szCs w:val="20"/>
-        </w:rPr>
-      </w:pPr>
-      <w:r>
-        <w:rPr>
-          <w:rFonts w:ascii="Arial" w:hAnsi="Arial"/>
-          <w:b/>
-          <w:sz w:val="20"/>
-          <w:szCs w:val="20"/>
-        </w:rPr>
-        <w:t xml:space="preserve">Domicilio Legal:        </w:t>
-      </w:r>
-      <w:proofErr w:type="gramStart"/>
-      <w:r>
-        <w:rPr>
-          <w:rFonts w:ascii="Arial" w:hAnsi="Arial"/>
-          <w:b/>
-          <w:sz w:val="20"/>
-          <w:szCs w:val="20"/>
-        </w:rPr>
-        <w:t xml:space="preserve">   </w:t>
-      </w:r>
-      <w:r>
-        <w:rPr>
-          <w:rFonts w:ascii="Arial Narrow" w:hAnsi="Arial Narrow" w:cs="Arial"/>
-          <w:b/>
-          <w:bCs/>
-          <w:sz w:val="22"/>
-          <w:szCs w:val="22"/>
-        </w:rPr>
-        <w:t>{</w:t>
-      </w:r>
-      <w:proofErr w:type="gramEnd"/>
-      <w:r>
-        <w:rPr>
-          <w:rFonts w:ascii="Arial Narrow" w:hAnsi="Arial Narrow" w:cs="Arial"/>
-          <w:b/>
-          <w:bCs/>
-          <w:sz w:val="22"/>
-          <w:szCs w:val="22"/>
-        </w:rPr>
-        <w:t>{CONTRATISTA_UBICACION}}</w:t>
-      </w:r>
-      <w:r>
-        <w:rPr>
-          <w:rFonts w:ascii="Arial Narrow" w:hAnsi="Arial Narrow" w:cs="Arial"/>
-          <w:b/>
-          <w:bCs/>
-          <w:sz w:val="22"/>
-          <w:szCs w:val="22"/>
-        </w:rPr>
-        <w:t xml:space="preserve">, distrito de </w:t>
-      </w:r>
-      <w:r>
-        <w:rPr>
-          <w:rFonts w:ascii="Arial Narrow" w:hAnsi="Arial Narrow" w:cs="Arial"/>
-          <w:b/>
-          <w:bCs/>
-          <w:sz w:val="22"/>
-          <w:szCs w:val="22"/>
-        </w:rPr>
-        <w:t>{{CONTRATISTA_DISTRITO}}</w:t>
-      </w:r>
-      <w:r>
-        <w:rPr>
-          <w:rFonts w:ascii="Arial Narrow" w:hAnsi="Arial Narrow" w:cs="Arial"/>
-          <w:b/>
-          <w:bCs/>
-          <w:sz w:val="22"/>
-          <w:szCs w:val="22"/>
-        </w:rPr>
-        <w:t>, provincia</w:t>
-      </w:r>
-      <w:r>
-        <w:rPr>
-          <w:rFonts w:ascii="Arial Narrow" w:hAnsi="Arial Narrow" w:cs="Arial"/>
-          <w:b/>
-          <w:bCs/>
-          <w:sz w:val="22"/>
-          <w:szCs w:val="22"/>
-        </w:rPr>
-        <w:t xml:space="preserve"> de</w:t>
-      </w:r>
-      <w:r>
-        <w:rPr>
-          <w:rFonts w:ascii="Arial Narrow" w:hAnsi="Arial Narrow" w:cs="Arial"/>
-          <w:b/>
-          <w:bCs/>
-          <w:sz w:val="22"/>
-          <w:szCs w:val="22"/>
-        </w:rPr>
-        <w:t xml:space="preserve"> </w:t>
-      </w:r>
-      <w:r>
-        <w:rPr>
-          <w:rFonts w:ascii="Arial Narrow" w:hAnsi="Arial Narrow" w:cs="Arial"/>
-          <w:b/>
-          <w:bCs/>
-          <w:sz w:val="22"/>
-          <w:szCs w:val="22"/>
-        </w:rPr>
-        <w:t>{{CONTRATISTA_PROVINCIA}}</w:t>
-      </w:r>
-      <w:r>
-        <w:rPr>
-          <w:rFonts w:ascii="Arial Narrow" w:hAnsi="Arial Narrow" w:cs="Arial"/>
-          <w:b/>
-          <w:bCs/>
-          <w:sz w:val="22"/>
-          <w:szCs w:val="22"/>
-        </w:rPr>
-        <w:t xml:space="preserve"> y departamento de</w:t>
-      </w:r>
-      <w:r>
-        <w:rPr>
-          <w:rFonts w:ascii="Arial Narrow" w:hAnsi="Arial Narrow" w:cs="Arial"/>
-          <w:b/>
-          <w:bCs/>
-          <w:sz w:val="22"/>
-          <w:szCs w:val="22"/>
-        </w:rPr>
-        <w:t xml:space="preserve"> {{CONTRATISTA_DEPARTAMENTO}}</w:t>
-      </w:r>
-    </w:p>
-    <w:p>
-      <w:pPr>
-        <w:rPr>
-          <w:rFonts w:ascii="Arial" w:hAnsi="Arial"/>
-          <w:b/>
-          <w:sz w:val="16"/>
-          <w:szCs w:val="20"/>
-        </w:rPr>
-      </w:pPr>
-    </w:p>
-    <w:p>
-      <w:pPr>
-        <w:rPr>
-          <w:rFonts w:ascii="Arial" w:hAnsi="Arial"/>
-          <w:b/>
-          <w:sz w:val="16"/>
-          <w:szCs w:val="20"/>
-        </w:rPr>
-      </w:pPr>
-    </w:p>
-    <w:p>
-      <w:pPr>
-        <w:jc w:val="both"/>
-      </w:pPr>
-    </w:p>
-    <w:p>
-      <w:pPr>
-        <w:jc w:val="both"/>
-      </w:pPr>
-    </w:p>
-    <w:p>
-      <w:pPr>
-        <w:jc w:val="both"/>
-      </w:pPr>
-    </w:p>
-    <w:p>
-      <w:pPr>
-        <w:jc w:val="both"/>
-      </w:pPr>
-    </w:p>
-    <w:p>
-      <w:pPr>
-        <w:jc w:val="both"/>
-      </w:pPr>
-    </w:p>
-    <w:p>
-      <w:pPr>
-        <w:rPr>
-          <w:rFonts w:ascii="Arial" w:hAnsi="Arial"/>
-          <w:sz w:val="20"/>
-          <w:szCs w:val="20"/>
-        </w:rPr>
-      </w:pPr>
-      <w:r>
-        <w:rPr>
-          <w:rFonts w:ascii="Arial" w:hAnsi="Arial"/>
-          <w:sz w:val="20"/>
-          <w:szCs w:val="20"/>
-        </w:rPr>
-        <w:t xml:space="preserve">                                                                                                     _________________________________</w:t>
-      </w:r>
-    </w:p>
-    <w:p>
-      <w:pPr>
-        <w:tabs>
-          <w:tab w:val="left" w:pos="6570"/>
-        </w:tabs>
-        <w:rPr>
-          <w:rFonts w:ascii="Arial" w:hAnsi="Arial"/>
-          <w:sz w:val="20"/>
-          <w:szCs w:val="20"/>
-        </w:rPr>
-      </w:pPr>
-      <w:r>
-        <w:rPr>
-          <w:rFonts w:ascii="Arial" w:hAnsi="Arial"/>
-          <w:sz w:val="20"/>
-          <w:szCs w:val="20"/>
-        </w:rPr>
-        <w:tab/>
-        <w:t>Firma y sello</w:t>
-      </w:r>
-    </w:p>
-    <w:p>
-      <w:pPr>
-        <w:rPr>
-          <w:rFonts w:ascii="Arial" w:hAnsi="Arial"/>
-          <w:sz w:val="20"/>
-          <w:szCs w:val="20"/>
-        </w:rPr>
-      </w:pPr>
-    </w:p>
-    <w:p>
-      <w:pPr>
-        <w:rPr>
-          <w:rFonts w:ascii="Arial" w:hAnsi="Arial"/>
-          <w:sz w:val="20"/>
-          <w:szCs w:val="20"/>
-        </w:rPr>
-      </w:pPr>
-    </w:p>
-    <w:p>
-      <w:pPr>
-        <w:rPr>
-          <w:rFonts w:ascii="Arial" w:hAnsi="Arial"/>
-          <w:sz w:val="20"/>
-          <w:szCs w:val="20"/>
-        </w:rPr>
-      </w:pPr>
-    </w:p>
-    <w:p>
-      <w:pPr>
-        <w:rPr>
-          <w:rFonts w:ascii="Arial" w:hAnsi="Arial"/>
-          <w:sz w:val="20"/>
-          <w:szCs w:val="20"/>
-        </w:rPr>
-      </w:pPr>
-    </w:p>
-    <w:p>
-      <w:pPr>
-        <w:rPr>
-          <w:rFonts w:ascii="Arial" w:hAnsi="Arial"/>
-          <w:sz w:val="20"/>
-          <w:szCs w:val="20"/>
-        </w:rPr>
-      </w:pPr>
-    </w:p>
-    <w:p>
-      <w:pPr>
-        <w:rPr>
-          <w:rFonts w:ascii="Arial" w:hAnsi="Arial"/>
-          <w:sz w:val="20"/>
-          <w:szCs w:val="20"/>
-        </w:rPr>
-      </w:pPr>
-    </w:p>
-    <w:p>
-      <w:pPr>
-        <w:rPr>
-          <w:rFonts w:ascii="Arial" w:hAnsi="Arial"/>
-          <w:sz w:val="20"/>
-          <w:szCs w:val="20"/>
-        </w:rPr>
-      </w:pPr>
-    </w:p>
-    <w:p>
-      <w:pPr>
-        <w:rPr>
-          <w:rFonts w:ascii="Arial" w:hAnsi="Arial"/>
-          <w:sz w:val="20"/>
-          <w:szCs w:val="20"/>
-        </w:rPr>
-      </w:pPr>
-    </w:p>
-    <w:p>
-      <w:pPr>
-        <w:rPr>
-          <w:rFonts w:ascii="Arial" w:hAnsi="Arial"/>
-          <w:sz w:val="20"/>
-          <w:szCs w:val="20"/>
-        </w:rPr>
-      </w:pPr>
-    </w:p>
-    <w:p>
-      <w:pPr>
-        <w:rPr>
-          <w:rFonts w:ascii="Arial" w:hAnsi="Arial"/>
-          <w:sz w:val="20"/>
-          <w:szCs w:val="20"/>
-        </w:rPr>
-      </w:pPr>
-    </w:p>
-    <w:p/>
-    <w:p/>
-    <w:p>
-      <w:pPr>
-        <w:jc w:val="center"/>
-        <w:rPr>
-          <w:rFonts w:ascii="Arial" w:hAnsi="Arial"/>
-          <w:sz w:val="20"/>
-          <w:szCs w:val="20"/>
-        </w:rPr>
-      </w:pPr>
-    </w:p>
-    <w:p>
-      <w:pPr>
-        <w:tabs>
-          <w:tab w:val="left" w:pos="5295"/>
-        </w:tabs>
-        <w:jc w:val="center"/>
-        <w:rPr>
-          <w:rFonts w:ascii="Arial" w:hAnsi="Arial" w:cs="Arial"/>
-          <w:sz w:val="18"/>
-          <w:szCs w:val="18"/>
-          <w:lang w:eastAsia="es-PE"/>
-        </w:rPr>
-      </w:pPr>
-      <w:r>
-        <w:rPr>
-          <w:rFonts w:ascii="Arial" w:hAnsi="Arial" w:cs="Arial"/>
-          <w:sz w:val="18"/>
-          <w:szCs w:val="18"/>
-          <w:lang w:eastAsia="es-PE"/>
-        </w:rPr>
-        <w:t>Página 2/2</w:t>
-      </w:r>
+        <w:rPr>
+          <w:rFonts w:ascii="Arial" w:hAnsi="Arial" w:cs="Arial"/>
+          <w:sz w:val="18"/>
+          <w:szCs w:val="18"/>
+          <w:lang w:eastAsia="es-PE"/>
+        </w:rPr>
+      </w:pPr>
     </w:p>
     <w:sectPr>
       <w:headerReference w:type="default" r:id="rId8"/>
+      <w:footerReference w:type="default" r:id="rId9"/>
       <w:pgSz w:w="11907" w:h="16840" w:code="9"/>
       <w:pgMar w:top="1134" w:right="1134" w:bottom="425" w:left="1134" w:header="284" w:footer="403" w:gutter="0"/>
       <w:cols w:space="720"/>
@@ -3349,6 +2606,414 @@
     <w:p/>
   </w:endnote>
 </w:endnotes>
+</file>
+
+<file path=word/footer1.xml><?xml version="1.0" encoding="utf-8"?>
+<w:ftr xmlns:wpc="http://schemas.microsoft.com/office/word/2010/wordprocessingCanvas" xmlns:cx="http://schemas.microsoft.com/office/drawing/2014/chartex" xmlns:cx1="http://schemas.microsoft.com/office/drawing/2015/9/8/chartex" xmlns:cx2="http://schemas.microsoft.com/office/drawing/2015/10/21/chartex" xmlns:cx3="http://schemas.microsoft.com/office/drawing/2016/5/9/chartex" xmlns:cx4="http://schemas.microsoft.com/office/drawing/2016/5/10/chartex" xmlns:cx5="http://schemas.microsoft.com/office/drawing/2016/5/11/chartex" xmlns:cx6="http://schemas.microsoft.com/office/drawing/2016/5/12/chartex" xmlns:cx7="http://schemas.microsoft.com/office/drawing/2016/5/13/chartex" xmlns:cx8="http://schemas.microsoft.com/office/drawing/2016/5/14/chartex" xmlns:mc="http://schemas.openxmlformats.org/markup-compatibility/2006" xmlns:aink="http://schemas.microsoft.com/office/drawing/2016/ink" xmlns:am3d="http://schemas.microsoft.com/office/drawing/2017/model3d" xmlns:o="urn:schemas-microsoft-com:office:office" xmlns:oel="http://schemas.microsoft.com/office/2019/extlst" xmlns:r="http://schemas.openxmlformats.org/officeDocument/2006/relationships" xmlns:m="http://schemas.openxmlformats.org/officeDocument/2006/math" xmlns:v="urn:schemas-microsoft-com:vml" xmlns:wp14="http://schemas.microsoft.com/office/word/2010/wordprocessingDrawing" xmlns:wp="http://schemas.openxmlformats.org/drawingml/2006/wordprocessingDrawing" xmlns:w10="urn:schemas-microsoft-com:office:word" xmlns:w="http://schemas.openxmlformats.org/wordprocessingml/2006/main" xmlns:w14="http://schemas.microsoft.com/office/word/2010/wordml" xmlns:w15="http://schemas.microsoft.com/office/word/2012/wordml" xmlns:w16cex="http://schemas.microsoft.com/office/word/2018/wordml/cex" xmlns:w16cid="http://schemas.microsoft.com/office/word/2016/wordml/cid" xmlns:w16="http://schemas.microsoft.com/office/word/2018/wordml" xmlns:w16du="http://schemas.microsoft.com/office/word/2023/wordml/word16du" xmlns:w16sdtdh="http://schemas.microsoft.com/office/word/2020/wordml/sdtdatahash" xmlns:w16sdtfl="http://schemas.microsoft.com/office/word/2024/wordml/sdtformatlock" xmlns:w16se="http://schemas.microsoft.com/office/word/2015/wordml/symex" xmlns:wpg="http://schemas.microsoft.com/office/word/2010/wordprocessingGroup" xmlns:wpi="http://schemas.microsoft.com/office/word/2010/wordprocessingInk" xmlns:wne="http://schemas.microsoft.com/office/word/2006/wordml" xmlns:wps="http://schemas.microsoft.com/office/word/2010/wordprocessingShape" mc:Ignorable="w14 w15 w16se w16cid w16 w16cex w16sdtdh w16sdtfl w16du wp14">
+  <w:p>
+    <w:pPr>
+      <w:jc w:val="both"/>
+      <w:rPr>
+        <w:rFonts w:ascii="Arial" w:hAnsi="Arial"/>
+        <w:b/>
+        <w:i/>
+        <w:sz w:val="20"/>
+        <w:szCs w:val="20"/>
+        <w:lang w:val="es-PE"/>
+      </w:rPr>
+    </w:pPr>
+    <w:r>
+      <w:rPr>
+        <w:rFonts w:ascii="Arial" w:hAnsi="Arial"/>
+        <w:b/>
+        <w:i/>
+        <w:sz w:val="20"/>
+        <w:szCs w:val="20"/>
+      </w:rPr>
+      <w:t xml:space="preserve">{{PROYECTO_DISTRITO}}, </w:t>
+    </w:r>
+    <w:r>
+      <w:rPr>
+        <w:rFonts w:ascii="Arial" w:hAnsi="Arial"/>
+        <w:b/>
+        <w:i/>
+        <w:sz w:val="20"/>
+        <w:szCs w:val="20"/>
+      </w:rPr>
+      <w:t>{{</w:t>
+    </w:r>
+    <w:r>
+      <w:rPr>
+        <w:rFonts w:ascii="Arial" w:hAnsi="Arial"/>
+        <w:b/>
+        <w:i/>
+        <w:sz w:val="20"/>
+        <w:szCs w:val="20"/>
+        <w:lang w:val="es-PE"/>
+      </w:rPr>
+      <w:t>FECHA_ACTUAL</w:t>
+    </w:r>
+    <w:r>
+      <w:rPr>
+        <w:rFonts w:ascii="Arial" w:hAnsi="Arial"/>
+        <w:b/>
+        <w:i/>
+        <w:sz w:val="20"/>
+        <w:szCs w:val="20"/>
+      </w:rPr>
+      <w:t>}}</w:t>
+    </w:r>
+  </w:p>
+  <w:p>
+    <w:pPr>
+      <w:jc w:val="both"/>
+      <w:rPr>
+        <w:rFonts w:ascii="Arial" w:hAnsi="Arial"/>
+        <w:b/>
+        <w:i/>
+        <w:sz w:val="20"/>
+        <w:szCs w:val="20"/>
+        <w:highlight w:val="yellow"/>
+      </w:rPr>
+    </w:pPr>
+  </w:p>
+  <w:p>
+    <w:pPr>
+      <w:jc w:val="both"/>
+      <w:rPr>
+        <w:rFonts w:ascii="Arial" w:hAnsi="Arial"/>
+        <w:b/>
+        <w:i/>
+        <w:sz w:val="20"/>
+        <w:szCs w:val="20"/>
+      </w:rPr>
+    </w:pPr>
+    <w:r>
+      <w:rPr>
+        <w:rFonts w:ascii="Arial" w:hAnsi="Arial"/>
+        <w:b/>
+        <w:sz w:val="20"/>
+        <w:szCs w:val="20"/>
+      </w:rPr>
+      <w:t>FIRMA DEL AVAL</w:t>
+    </w:r>
+  </w:p>
+  <w:p>
+    <w:pPr>
+      <w:jc w:val="both"/>
+      <w:rPr>
+        <w:rFonts w:ascii="Arial" w:hAnsi="Arial"/>
+        <w:sz w:val="20"/>
+        <w:szCs w:val="20"/>
+      </w:rPr>
+    </w:pPr>
+  </w:p>
+  <w:p>
+    <w:pPr>
+      <w:rPr>
+        <w:rFonts w:ascii="Arial" w:hAnsi="Arial"/>
+        <w:b/>
+        <w:sz w:val="20"/>
+        <w:szCs w:val="20"/>
+      </w:rPr>
+    </w:pPr>
+    <w:r>
+      <w:rPr>
+        <w:rFonts w:ascii="Arial" w:hAnsi="Arial"/>
+        <w:b/>
+        <w:sz w:val="20"/>
+        <w:szCs w:val="20"/>
+      </w:rPr>
+      <w:t xml:space="preserve">Razón Social:            </w:t>
+    </w:r>
+    <w:proofErr w:type="gramStart"/>
+    <w:r>
+      <w:rPr>
+        <w:rFonts w:ascii="Arial" w:hAnsi="Arial"/>
+        <w:b/>
+        <w:sz w:val="20"/>
+        <w:szCs w:val="20"/>
+      </w:rPr>
+      <w:t xml:space="preserve">   </w:t>
+    </w:r>
+    <w:r>
+      <w:rPr>
+        <w:rFonts w:ascii="Arial Narrow" w:hAnsi="Arial Narrow"/>
+        <w:b/>
+        <w:sz w:val="22"/>
+        <w:szCs w:val="22"/>
+      </w:rPr>
+      <w:t>{</w:t>
+    </w:r>
+    <w:proofErr w:type="gramEnd"/>
+    <w:r>
+      <w:rPr>
+        <w:rFonts w:ascii="Arial Narrow" w:hAnsi="Arial Narrow"/>
+        <w:b/>
+        <w:sz w:val="22"/>
+        <w:szCs w:val="22"/>
+      </w:rPr>
+      <w:t>{CONTRATISTA_RAZON_SOCIAL}}</w:t>
+    </w:r>
+  </w:p>
+  <w:p>
+    <w:pPr>
+      <w:rPr>
+        <w:rFonts w:ascii="Arial" w:hAnsi="Arial"/>
+        <w:b/>
+        <w:sz w:val="20"/>
+        <w:szCs w:val="20"/>
+        <w:lang w:val="es-ES_tradnl"/>
+      </w:rPr>
+    </w:pPr>
+    <w:r>
+      <w:rPr>
+        <w:rFonts w:ascii="Arial" w:hAnsi="Arial"/>
+        <w:b/>
+        <w:sz w:val="20"/>
+        <w:szCs w:val="20"/>
+      </w:rPr>
+      <w:t xml:space="preserve">RUC:                           </w:t>
+    </w:r>
+    <w:proofErr w:type="gramStart"/>
+    <w:r>
+      <w:rPr>
+        <w:rFonts w:ascii="Arial" w:hAnsi="Arial"/>
+        <w:b/>
+        <w:sz w:val="20"/>
+        <w:szCs w:val="20"/>
+      </w:rPr>
+      <w:t xml:space="preserve">   </w:t>
+    </w:r>
+    <w:r>
+      <w:rPr>
+        <w:rFonts w:ascii="Arial Narrow" w:eastAsia="Arial Narrow" w:hAnsi="Arial Narrow" w:cs="Arial Narrow"/>
+        <w:b/>
+        <w:sz w:val="22"/>
+        <w:szCs w:val="22"/>
+      </w:rPr>
+      <w:t>{</w:t>
+    </w:r>
+    <w:proofErr w:type="gramEnd"/>
+    <w:r>
+      <w:rPr>
+        <w:rFonts w:ascii="Arial Narrow" w:eastAsia="Arial Narrow" w:hAnsi="Arial Narrow" w:cs="Arial Narrow"/>
+        <w:b/>
+        <w:sz w:val="22"/>
+        <w:szCs w:val="22"/>
+      </w:rPr>
+      <w:t>{CONTRATISTA_RUC}}</w:t>
+    </w:r>
+  </w:p>
+  <w:p>
+    <w:pPr>
+      <w:rPr>
+        <w:rFonts w:ascii="Arial" w:hAnsi="Arial"/>
+        <w:b/>
+        <w:sz w:val="20"/>
+        <w:szCs w:val="20"/>
+      </w:rPr>
+    </w:pPr>
+    <w:r>
+      <w:rPr>
+        <w:rFonts w:ascii="Arial" w:hAnsi="Arial"/>
+        <w:b/>
+        <w:sz w:val="20"/>
+        <w:szCs w:val="20"/>
+      </w:rPr>
+      <w:t>Representante Legal</w:t>
+    </w:r>
+    <w:proofErr w:type="gramStart"/>
+    <w:r>
+      <w:rPr>
+        <w:rFonts w:ascii="Arial" w:hAnsi="Arial"/>
+        <w:b/>
+        <w:sz w:val="20"/>
+        <w:szCs w:val="20"/>
+      </w:rPr>
+      <w:t xml:space="preserve">:  </w:t>
+    </w:r>
+    <w:r>
+      <w:rPr>
+        <w:rFonts w:ascii="Arial Narrow" w:hAnsi="Arial Narrow"/>
+        <w:b/>
+        <w:sz w:val="22"/>
+        <w:szCs w:val="22"/>
+      </w:rPr>
+      <w:t>{</w:t>
+    </w:r>
+    <w:proofErr w:type="gramEnd"/>
+    <w:r>
+      <w:rPr>
+        <w:rFonts w:ascii="Arial Narrow" w:hAnsi="Arial Narrow"/>
+        <w:b/>
+        <w:sz w:val="22"/>
+        <w:szCs w:val="22"/>
+      </w:rPr>
+      <w:t>{CONTRATISTA_REPRESENTANTE_NOMBRE}}</w:t>
+    </w:r>
+  </w:p>
+  <w:p>
+    <w:pPr>
+      <w:pStyle w:val="Piedepgina"/>
+      <w:rPr>
+        <w:rFonts w:ascii="Arial Narrow" w:hAnsi="Arial Narrow" w:cs="Arial"/>
+        <w:b/>
+        <w:bCs/>
+        <w:sz w:val="22"/>
+        <w:szCs w:val="22"/>
+      </w:rPr>
+    </w:pPr>
+    <w:r>
+      <w:rPr>
+        <w:rFonts w:ascii="Arial" w:hAnsi="Arial"/>
+        <w:b/>
+        <w:sz w:val="20"/>
+        <w:szCs w:val="20"/>
+      </w:rPr>
+      <w:t xml:space="preserve">Domicilio Legal:        </w:t>
+    </w:r>
+    <w:proofErr w:type="gramStart"/>
+    <w:r>
+      <w:rPr>
+        <w:rFonts w:ascii="Arial" w:hAnsi="Arial"/>
+        <w:b/>
+        <w:sz w:val="20"/>
+        <w:szCs w:val="20"/>
+      </w:rPr>
+      <w:t xml:space="preserve">   </w:t>
+    </w:r>
+    <w:r>
+      <w:rPr>
+        <w:rFonts w:ascii="Arial Narrow" w:hAnsi="Arial Narrow" w:cs="Arial"/>
+        <w:b/>
+        <w:bCs/>
+        <w:sz w:val="22"/>
+        <w:szCs w:val="22"/>
+      </w:rPr>
+      <w:t>{</w:t>
+    </w:r>
+    <w:proofErr w:type="gramEnd"/>
+    <w:r>
+      <w:rPr>
+        <w:rFonts w:ascii="Arial Narrow" w:hAnsi="Arial Narrow" w:cs="Arial"/>
+        <w:b/>
+        <w:bCs/>
+        <w:sz w:val="22"/>
+        <w:szCs w:val="22"/>
+      </w:rPr>
+      <w:t>{CONTRATISTA_UBICACION}}, distrito de {{CONTRATISTA_DISTRITO}}, provincia de {{CONTRATISTA_PROVINCIA}} y departamento de {{CONTRATISTA_DEPARTAMENTO}}</w:t>
+    </w:r>
+  </w:p>
+  <w:p>
+    <w:pPr>
+      <w:pStyle w:val="Piedepgina"/>
+      <w:rPr>
+        <w:rFonts w:ascii="Arial Narrow" w:hAnsi="Arial Narrow" w:cs="Arial"/>
+        <w:b/>
+        <w:bCs/>
+        <w:sz w:val="22"/>
+        <w:szCs w:val="22"/>
+      </w:rPr>
+    </w:pPr>
+  </w:p>
+  <w:p>
+    <w:pPr>
+      <w:pStyle w:val="Piedepgina"/>
+      <w:jc w:val="center"/>
+    </w:pPr>
+    <w:sdt>
+      <w:sdtPr>
+        <w:id w:val="1330715736"/>
+        <w:docPartObj>
+          <w:docPartGallery w:val="Page Numbers (Bottom of Page)"/>
+          <w:docPartUnique/>
+        </w:docPartObj>
+      </w:sdtPr>
+      <w:sdtContent>
+        <w:r>
+          <w:rPr>
+            <w:rFonts w:ascii="Arial" w:hAnsi="Arial" w:cs="Arial"/>
+            <w:sz w:val="18"/>
+            <w:szCs w:val="18"/>
+            <w:lang w:eastAsia="es-PE"/>
+          </w:rPr>
+          <w:t>Página</w:t>
+        </w:r>
+        <w:r>
+          <w:rPr>
+            <w:rFonts w:ascii="Arial" w:hAnsi="Arial" w:cs="Arial"/>
+            <w:sz w:val="18"/>
+            <w:szCs w:val="18"/>
+          </w:rPr>
+          <w:t xml:space="preserve"> </w:t>
+        </w:r>
+        <w:r>
+          <w:rPr>
+            <w:rFonts w:ascii="Arial" w:hAnsi="Arial" w:cs="Arial"/>
+            <w:sz w:val="18"/>
+            <w:szCs w:val="18"/>
+          </w:rPr>
+          <w:fldChar w:fldCharType="begin"/>
+        </w:r>
+        <w:r>
+          <w:rPr>
+            <w:rFonts w:ascii="Arial" w:hAnsi="Arial" w:cs="Arial"/>
+            <w:sz w:val="18"/>
+            <w:szCs w:val="18"/>
+          </w:rPr>
+          <w:instrText>PAGE   \* MERGEFORMAT</w:instrText>
+        </w:r>
+        <w:r>
+          <w:rPr>
+            <w:rFonts w:ascii="Arial" w:hAnsi="Arial" w:cs="Arial"/>
+            <w:sz w:val="18"/>
+            <w:szCs w:val="18"/>
+          </w:rPr>
+          <w:fldChar w:fldCharType="separate"/>
+        </w:r>
+        <w:r>
+          <w:rPr>
+            <w:rFonts w:ascii="Arial" w:hAnsi="Arial" w:cs="Arial"/>
+            <w:sz w:val="18"/>
+            <w:szCs w:val="18"/>
+          </w:rPr>
+          <w:t>2</w:t>
+        </w:r>
+        <w:r>
+          <w:rPr>
+            <w:rFonts w:ascii="Arial" w:hAnsi="Arial" w:cs="Arial"/>
+            <w:sz w:val="18"/>
+            <w:szCs w:val="18"/>
+          </w:rPr>
+          <w:fldChar w:fldCharType="end"/>
+        </w:r>
+        <w:r>
+          <w:rPr>
+            <w:rFonts w:ascii="Arial" w:hAnsi="Arial" w:cs="Arial"/>
+            <w:sz w:val="18"/>
+            <w:szCs w:val="18"/>
+          </w:rPr>
+          <w:t>/2</w:t>
+        </w:r>
+      </w:sdtContent>
+    </w:sdt>
+  </w:p>
+  <w:p>
+    <w:pPr>
+      <w:tabs>
+        <w:tab w:val="left" w:pos="5295"/>
+      </w:tabs>
+      <w:jc w:val="center"/>
+      <w:rPr>
+        <w:rFonts w:ascii="Arial" w:hAnsi="Arial" w:cs="Arial"/>
+        <w:sz w:val="18"/>
+        <w:szCs w:val="18"/>
+        <w:lang w:eastAsia="es-PE"/>
+      </w:rPr>
+    </w:pPr>
+  </w:p>
+</w:ftr>
 </file>
 
 <file path=word/footnotes.xml><?xml version="1.0" encoding="utf-8"?>

</xml_diff>